<commit_message>
Redizajn outputa: A4 landscape, 2 kolone, divider između pjesama
- A4 landscape s dvije jednakovrijedne kolone
- Bez naslova i sekcija labela u outputu
- Verse = normalan tekst, Chorus/Bridge = uvučen bold+italic
- Razdjelnik (___) između pjesama
- Times New Roman 10pt

https://claude.ai/code/session_017JvMZHvCbCck4PdkCA67A3
</commit_message>
<xml_diff>
--- a/output_test.docx
+++ b/output_test.docx
@@ -4,106 +4,16 @@
   <w:body>
     <w:p>
       <w:pPr>
-        <w:jc w:val="left"/>
-        <w:spacing w:before="0" w:after="60"/>
-        <w:tabs>
-          <w:tab w:val="right" w:pos="9070"/>
-        </w:tabs>
+        <w:spacing w:before="0" w:after="0"/>
+        <w:ind w:left="720"/>
       </w:pPr>
       <w:r>
         <w:rPr>
-          <w:rFonts w:ascii="Calibri" w:hAnsi="Calibri"/>
+          <w:rFonts w:ascii="Times New Roman" w:hAnsi="Times New Roman"/>
           <w:b/>
+          <w:i/>
           <w:color w:val="000000"/>
-          <w:sz w:val="52"/>
-        </w:rPr>
-        <w:t>Oče Mi Ti Se Klanjamo</w:t>
-      </w:r>
-    </w:p>
-    <w:p>
-      <w:pPr>
-        <w:spacing w:before="0" w:after="0"/>
-      </w:pPr>
-      <w:r>
-        <w:rPr>
-          <w:rFonts w:ascii="Calibri" w:hAnsi="Calibri"/>
-          <w:b w:val="0"/>
-          <w:i w:val="0"/>
-          <w:color w:val="000000"/>
-          <w:sz w:val="22"/>
-        </w:rPr>
-      </w:r>
-    </w:p>
-    <w:p>
-      <w:pPr>
-        <w:spacing w:before="0" w:after="0"/>
-      </w:pPr>
-      <w:r>
-        <w:rPr>
-          <w:rFonts w:ascii="Calibri" w:hAnsi="Calibri"/>
-          <w:b/>
-          <w:i w:val="0"/>
-          <w:color w:val="000000"/>
-          <w:sz w:val="22"/>
-        </w:rPr>
-        <w:t>Pjesmarica</w:t>
-      </w:r>
-    </w:p>
-    <w:p>
-      <w:pPr>
-        <w:spacing w:before="0" w:after="0"/>
-      </w:pPr>
-      <w:r>
-        <w:rPr>
-          <w:rFonts w:ascii="Calibri" w:hAnsi="Calibri"/>
-          <w:b w:val="0"/>
-          <w:i w:val="0"/>
-          <w:color w:val="000000"/>
-          <w:sz w:val="22"/>
-        </w:rPr>
-        <w:t>1016</w:t>
-      </w:r>
-    </w:p>
-    <w:p>
-      <w:pPr>
-        <w:spacing w:before="0" w:after="0"/>
-      </w:pPr>
-      <w:r>
-        <w:rPr>
-          <w:rFonts w:ascii="Calibri" w:hAnsi="Calibri"/>
-          <w:b w:val="0"/>
-          <w:i w:val="0"/>
-          <w:color w:val="000000"/>
-          <w:sz w:val="22"/>
-        </w:rPr>
-      </w:r>
-    </w:p>
-    <w:p>
-      <w:pPr>
-        <w:spacing w:before="120" w:after="0"/>
-      </w:pPr>
-      <w:r>
-        <w:rPr>
-          <w:rFonts w:ascii="Calibri" w:hAnsi="Calibri"/>
-          <w:b/>
-          <w:i w:val="0"/>
-          <w:color w:val="000000"/>
-          <w:sz w:val="22"/>
-        </w:rPr>
-        <w:t>Chorus</w:t>
-      </w:r>
-    </w:p>
-    <w:p>
-      <w:pPr>
-        <w:spacing w:before="0" w:after="0"/>
-      </w:pPr>
-      <w:r>
-        <w:rPr>
-          <w:rFonts w:ascii="Calibri" w:hAnsi="Calibri"/>
-          <w:b w:val="0"/>
-          <w:i w:val="0"/>
-          <w:color w:val="000000"/>
-          <w:sz w:val="22"/>
+          <w:sz w:val="20"/>
         </w:rPr>
         <w:t>OČE, MI TI SE KLANJAMO</w:t>
       </w:r>
@@ -111,14 +21,15 @@
     <w:p>
       <w:pPr>
         <w:spacing w:before="0" w:after="0"/>
+        <w:ind w:left="720"/>
       </w:pPr>
       <w:r>
         <w:rPr>
-          <w:rFonts w:ascii="Calibri" w:hAnsi="Calibri"/>
-          <w:b w:val="0"/>
-          <w:i w:val="0"/>
+          <w:rFonts w:ascii="Times New Roman" w:hAnsi="Times New Roman"/>
+          <w:b/>
+          <w:i/>
           <w:color w:val="000000"/>
-          <w:sz w:val="22"/>
+          <w:sz w:val="20"/>
         </w:rPr>
         <w:t>SVOJ TI ŽIVOT DAJEMO.</w:t>
       </w:r>
@@ -126,14 +37,15 @@
     <w:p>
       <w:pPr>
         <w:spacing w:before="0" w:after="0"/>
+        <w:ind w:left="720"/>
       </w:pPr>
       <w:r>
         <w:rPr>
-          <w:rFonts w:ascii="Calibri" w:hAnsi="Calibri"/>
-          <w:b w:val="0"/>
-          <w:i w:val="0"/>
+          <w:rFonts w:ascii="Times New Roman" w:hAnsi="Times New Roman"/>
+          <w:b/>
+          <w:i/>
           <w:color w:val="000000"/>
-          <w:sz w:val="22"/>
+          <w:sz w:val="20"/>
         </w:rPr>
         <w:t>MI TE LJUBIMO!</w:t>
       </w:r>
@@ -141,14 +53,15 @@
     <w:p>
       <w:pPr>
         <w:spacing w:before="0" w:after="0"/>
+        <w:ind w:left="720"/>
       </w:pPr>
       <w:r>
         <w:rPr>
-          <w:rFonts w:ascii="Calibri" w:hAnsi="Calibri"/>
-          <w:b w:val="0"/>
-          <w:i w:val="0"/>
+          <w:rFonts w:ascii="Times New Roman" w:hAnsi="Times New Roman"/>
+          <w:b/>
+          <w:i/>
           <w:color w:val="000000"/>
-          <w:sz w:val="22"/>
+          <w:sz w:val="20"/>
         </w:rPr>
         <w:t>SINE, MI TI SE KLANJAMO...</w:t>
       </w:r>
@@ -156,14 +69,15 @@
     <w:p>
       <w:pPr>
         <w:spacing w:before="0" w:after="0"/>
+        <w:ind w:left="720"/>
       </w:pPr>
       <w:r>
         <w:rPr>
-          <w:rFonts w:ascii="Calibri" w:hAnsi="Calibri"/>
-          <w:b w:val="0"/>
-          <w:i w:val="0"/>
+          <w:rFonts w:ascii="Times New Roman" w:hAnsi="Times New Roman"/>
+          <w:b/>
+          <w:i/>
           <w:color w:val="000000"/>
-          <w:sz w:val="22"/>
+          <w:sz w:val="20"/>
         </w:rPr>
         <w:t>DUŠE, MI TI SE KLANJAMO...</w:t>
       </w:r>
@@ -171,125 +85,46 @@
     <w:p>
       <w:pPr>
         <w:spacing w:before="0" w:after="0"/>
+        <w:ind w:left="720"/>
       </w:pPr>
       <w:r>
         <w:rPr>
-          <w:rFonts w:ascii="Calibri" w:hAnsi="Calibri"/>
-          <w:b w:val="0"/>
-          <w:i w:val="0"/>
+          <w:rFonts w:ascii="Times New Roman" w:hAnsi="Times New Roman"/>
+          <w:b/>
+          <w:i/>
           <w:color w:val="000000"/>
-          <w:sz w:val="22"/>
+          <w:sz w:val="20"/>
         </w:rPr>
         <w:t>TROJSTVO, MI TI SE KLANJAMO</w:t>
       </w:r>
     </w:p>
     <w:p>
+      <w:pPr>
+        <w:spacing w:before="60" w:after="60"/>
+      </w:pPr>
       <w:r>
-        <w:br w:type="page"/>
+        <w:rPr>
+          <w:rFonts w:ascii="Times New Roman" w:hAnsi="Times New Roman"/>
+          <w:b w:val="0"/>
+          <w:i w:val="0"/>
+          <w:color w:val="000000"/>
+          <w:sz w:val="20"/>
+        </w:rPr>
+        <w:t>____________________________________________________________</w:t>
       </w:r>
     </w:p>
     <w:p>
       <w:pPr>
-        <w:jc w:val="left"/>
-        <w:spacing w:before="0" w:after="60"/>
-        <w:tabs>
-          <w:tab w:val="right" w:pos="9070"/>
-        </w:tabs>
+        <w:spacing w:before="0" w:after="0"/>
+        <w:ind w:left="720"/>
       </w:pPr>
       <w:r>
         <w:rPr>
-          <w:rFonts w:ascii="Calibri" w:hAnsi="Calibri"/>
+          <w:rFonts w:ascii="Times New Roman" w:hAnsi="Times New Roman"/>
           <w:b/>
+          <w:i/>
           <w:color w:val="000000"/>
-          <w:sz w:val="52"/>
-        </w:rPr>
-        <w:t>Isus, Isus</w:t>
-      </w:r>
-    </w:p>
-    <w:p>
-      <w:pPr>
-        <w:spacing w:before="0" w:after="0"/>
-      </w:pPr>
-      <w:r>
-        <w:rPr>
-          <w:rFonts w:ascii="Calibri" w:hAnsi="Calibri"/>
-          <w:b w:val="0"/>
-          <w:i w:val="0"/>
-          <w:color w:val="000000"/>
-          <w:sz w:val="22"/>
-        </w:rPr>
-      </w:r>
-    </w:p>
-    <w:p>
-      <w:pPr>
-        <w:spacing w:before="0" w:after="0"/>
-      </w:pPr>
-      <w:r>
-        <w:rPr>
-          <w:rFonts w:ascii="Calibri" w:hAnsi="Calibri"/>
-          <w:b/>
-          <w:i w:val="0"/>
-          <w:color w:val="000000"/>
-          <w:sz w:val="22"/>
-        </w:rPr>
-        <w:t>Pjesmarica</w:t>
-      </w:r>
-    </w:p>
-    <w:p>
-      <w:pPr>
-        <w:spacing w:before="0" w:after="0"/>
-      </w:pPr>
-      <w:r>
-        <w:rPr>
-          <w:rFonts w:ascii="Calibri" w:hAnsi="Calibri"/>
-          <w:b w:val="0"/>
-          <w:i w:val="0"/>
-          <w:color w:val="000000"/>
-          <w:sz w:val="22"/>
-        </w:rPr>
-        <w:t>1011</w:t>
-      </w:r>
-    </w:p>
-    <w:p>
-      <w:pPr>
-        <w:spacing w:before="0" w:after="0"/>
-      </w:pPr>
-      <w:r>
-        <w:rPr>
-          <w:rFonts w:ascii="Calibri" w:hAnsi="Calibri"/>
-          <w:b w:val="0"/>
-          <w:i w:val="0"/>
-          <w:color w:val="000000"/>
-          <w:sz w:val="22"/>
-        </w:rPr>
-      </w:r>
-    </w:p>
-    <w:p>
-      <w:pPr>
-        <w:spacing w:before="120" w:after="0"/>
-      </w:pPr>
-      <w:r>
-        <w:rPr>
-          <w:rFonts w:ascii="Calibri" w:hAnsi="Calibri"/>
-          <w:b/>
-          <w:i w:val="0"/>
-          <w:color w:val="000000"/>
-          <w:sz w:val="22"/>
-        </w:rPr>
-        <w:t>C1</w:t>
-      </w:r>
-    </w:p>
-    <w:p>
-      <w:pPr>
-        <w:spacing w:before="0" w:after="0"/>
-      </w:pPr>
-      <w:r>
-        <w:rPr>
-          <w:rFonts w:ascii="Calibri" w:hAnsi="Calibri"/>
-          <w:b w:val="0"/>
-          <w:i w:val="0"/>
-          <w:color w:val="000000"/>
-          <w:sz w:val="22"/>
+          <w:sz w:val="20"/>
         </w:rPr>
         <w:t>Iiiisus, Iiisuuus</w:t>
       </w:r>
@@ -297,14 +132,15 @@
     <w:p>
       <w:pPr>
         <w:spacing w:before="0" w:after="0"/>
+        <w:ind w:left="720"/>
       </w:pPr>
       <w:r>
         <w:rPr>
-          <w:rFonts w:ascii="Calibri" w:hAnsi="Calibri"/>
-          <w:b w:val="0"/>
-          <w:i w:val="0"/>
+          <w:rFonts w:ascii="Times New Roman" w:hAnsi="Times New Roman"/>
+          <w:b/>
+          <w:i/>
           <w:color w:val="000000"/>
-          <w:sz w:val="22"/>
+          <w:sz w:val="20"/>
         </w:rPr>
         <w:t>Isus, Isus,Isus</w:t>
       </w:r>
@@ -315,40 +151,25 @@
       </w:pPr>
       <w:r>
         <w:rPr>
-          <w:rFonts w:ascii="Calibri" w:hAnsi="Calibri"/>
+          <w:rFonts w:ascii="Times New Roman" w:hAnsi="Times New Roman"/>
           <w:b w:val="0"/>
           <w:i w:val="0"/>
           <w:color w:val="000000"/>
-          <w:sz w:val="22"/>
+          <w:sz w:val="20"/>
         </w:rPr>
       </w:r>
     </w:p>
     <w:p>
       <w:pPr>
-        <w:spacing w:before="120" w:after="0"/>
+        <w:spacing w:before="0" w:after="0"/>
       </w:pPr>
       <w:r>
         <w:rPr>
-          <w:rFonts w:ascii="Calibri" w:hAnsi="Calibri"/>
-          <w:b/>
-          <w:i w:val="0"/>
-          <w:color w:val="000000"/>
-          <w:sz w:val="22"/>
-        </w:rPr>
-        <w:t>V1</w:t>
-      </w:r>
-    </w:p>
-    <w:p>
-      <w:pPr>
-        <w:spacing w:before="0" w:after="0"/>
-      </w:pPr>
-      <w:r>
-        <w:rPr>
-          <w:rFonts w:ascii="Calibri" w:hAnsi="Calibri"/>
+          <w:rFonts w:ascii="Times New Roman" w:hAnsi="Times New Roman"/>
           <w:b w:val="0"/>
           <w:i w:val="0"/>
           <w:color w:val="000000"/>
-          <w:sz w:val="22"/>
+          <w:sz w:val="20"/>
         </w:rPr>
         <w:t>za me umre</w:t>
       </w:r>
@@ -359,40 +180,25 @@
       </w:pPr>
       <w:r>
         <w:rPr>
-          <w:rFonts w:ascii="Calibri" w:hAnsi="Calibri"/>
+          <w:rFonts w:ascii="Times New Roman" w:hAnsi="Times New Roman"/>
           <w:b w:val="0"/>
           <w:i w:val="0"/>
           <w:color w:val="000000"/>
-          <w:sz w:val="22"/>
+          <w:sz w:val="20"/>
         </w:rPr>
       </w:r>
     </w:p>
     <w:p>
       <w:pPr>
-        <w:spacing w:before="120" w:after="0"/>
+        <w:spacing w:before="0" w:after="0"/>
       </w:pPr>
       <w:r>
         <w:rPr>
-          <w:rFonts w:ascii="Calibri" w:hAnsi="Calibri"/>
-          <w:b/>
-          <w:i w:val="0"/>
-          <w:color w:val="000000"/>
-          <w:sz w:val="22"/>
-        </w:rPr>
-        <w:t>V2</w:t>
-      </w:r>
-    </w:p>
-    <w:p>
-      <w:pPr>
-        <w:spacing w:before="0" w:after="0"/>
-      </w:pPr>
-      <w:r>
-        <w:rPr>
-          <w:rFonts w:ascii="Calibri" w:hAnsi="Calibri"/>
+          <w:rFonts w:ascii="Times New Roman" w:hAnsi="Times New Roman"/>
           <w:b w:val="0"/>
           <w:i w:val="0"/>
           <w:color w:val="000000"/>
-          <w:sz w:val="22"/>
+          <w:sz w:val="20"/>
         </w:rPr>
         <w:t>on traži me</w:t>
       </w:r>
@@ -403,40 +209,25 @@
       </w:pPr>
       <w:r>
         <w:rPr>
-          <w:rFonts w:ascii="Calibri" w:hAnsi="Calibri"/>
+          <w:rFonts w:ascii="Times New Roman" w:hAnsi="Times New Roman"/>
           <w:b w:val="0"/>
           <w:i w:val="0"/>
           <w:color w:val="000000"/>
-          <w:sz w:val="22"/>
+          <w:sz w:val="20"/>
         </w:rPr>
       </w:r>
     </w:p>
     <w:p>
       <w:pPr>
-        <w:spacing w:before="120" w:after="0"/>
+        <w:spacing w:before="0" w:after="0"/>
       </w:pPr>
       <w:r>
         <w:rPr>
-          <w:rFonts w:ascii="Calibri" w:hAnsi="Calibri"/>
-          <w:b/>
-          <w:i w:val="0"/>
-          <w:color w:val="000000"/>
-          <w:sz w:val="22"/>
-        </w:rPr>
-        <w:t>V3</w:t>
-      </w:r>
-    </w:p>
-    <w:p>
-      <w:pPr>
-        <w:spacing w:before="0" w:after="0"/>
-      </w:pPr>
-      <w:r>
-        <w:rPr>
-          <w:rFonts w:ascii="Calibri" w:hAnsi="Calibri"/>
+          <w:rFonts w:ascii="Times New Roman" w:hAnsi="Times New Roman"/>
           <w:b w:val="0"/>
           <w:i w:val="0"/>
           <w:color w:val="000000"/>
-          <w:sz w:val="22"/>
+          <w:sz w:val="20"/>
         </w:rPr>
         <w:t>on ljubi me</w:t>
       </w:r>
@@ -447,40 +238,25 @@
       </w:pPr>
       <w:r>
         <w:rPr>
-          <w:rFonts w:ascii="Calibri" w:hAnsi="Calibri"/>
+          <w:rFonts w:ascii="Times New Roman" w:hAnsi="Times New Roman"/>
           <w:b w:val="0"/>
           <w:i w:val="0"/>
           <w:color w:val="000000"/>
-          <w:sz w:val="22"/>
+          <w:sz w:val="20"/>
         </w:rPr>
       </w:r>
     </w:p>
     <w:p>
       <w:pPr>
-        <w:spacing w:before="120" w:after="0"/>
+        <w:spacing w:before="0" w:after="0"/>
       </w:pPr>
       <w:r>
         <w:rPr>
-          <w:rFonts w:ascii="Calibri" w:hAnsi="Calibri"/>
-          <w:b/>
-          <w:i w:val="0"/>
-          <w:color w:val="000000"/>
-          <w:sz w:val="22"/>
-        </w:rPr>
-        <w:t>V4</w:t>
-      </w:r>
-    </w:p>
-    <w:p>
-      <w:pPr>
-        <w:spacing w:before="0" w:after="0"/>
-      </w:pPr>
-      <w:r>
-        <w:rPr>
-          <w:rFonts w:ascii="Calibri" w:hAnsi="Calibri"/>
+          <w:rFonts w:ascii="Times New Roman" w:hAnsi="Times New Roman"/>
           <w:b w:val="0"/>
           <w:i w:val="0"/>
           <w:color w:val="000000"/>
-          <w:sz w:val="22"/>
+          <w:sz w:val="20"/>
         </w:rPr>
         <w:t>on voli me</w:t>
       </w:r>
@@ -491,40 +267,25 @@
       </w:pPr>
       <w:r>
         <w:rPr>
-          <w:rFonts w:ascii="Calibri" w:hAnsi="Calibri"/>
+          <w:rFonts w:ascii="Times New Roman" w:hAnsi="Times New Roman"/>
           <w:b w:val="0"/>
           <w:i w:val="0"/>
           <w:color w:val="000000"/>
-          <w:sz w:val="22"/>
+          <w:sz w:val="20"/>
         </w:rPr>
       </w:r>
     </w:p>
     <w:p>
       <w:pPr>
-        <w:spacing w:before="120" w:after="0"/>
+        <w:spacing w:before="0" w:after="0"/>
       </w:pPr>
       <w:r>
         <w:rPr>
-          <w:rFonts w:ascii="Calibri" w:hAnsi="Calibri"/>
-          <w:b/>
-          <w:i w:val="0"/>
-          <w:color w:val="000000"/>
-          <w:sz w:val="22"/>
-        </w:rPr>
-        <w:t>V5</w:t>
-      </w:r>
-    </w:p>
-    <w:p>
-      <w:pPr>
-        <w:spacing w:before="0" w:after="0"/>
-      </w:pPr>
-      <w:r>
-        <w:rPr>
-          <w:rFonts w:ascii="Calibri" w:hAnsi="Calibri"/>
+          <w:rFonts w:ascii="Times New Roman" w:hAnsi="Times New Roman"/>
           <w:b w:val="0"/>
           <w:i w:val="0"/>
           <w:color w:val="000000"/>
-          <w:sz w:val="22"/>
+          <w:sz w:val="20"/>
         </w:rPr>
         <w:t>prašta mi</w:t>
       </w:r>
@@ -535,40 +296,25 @@
       </w:pPr>
       <w:r>
         <w:rPr>
-          <w:rFonts w:ascii="Calibri" w:hAnsi="Calibri"/>
+          <w:rFonts w:ascii="Times New Roman" w:hAnsi="Times New Roman"/>
           <w:b w:val="0"/>
           <w:i w:val="0"/>
           <w:color w:val="000000"/>
-          <w:sz w:val="22"/>
+          <w:sz w:val="20"/>
         </w:rPr>
       </w:r>
     </w:p>
     <w:p>
       <w:pPr>
-        <w:spacing w:before="120" w:after="0"/>
+        <w:spacing w:before="0" w:after="0"/>
       </w:pPr>
       <w:r>
         <w:rPr>
-          <w:rFonts w:ascii="Calibri" w:hAnsi="Calibri"/>
-          <w:b/>
-          <w:i w:val="0"/>
-          <w:color w:val="000000"/>
-          <w:sz w:val="22"/>
-        </w:rPr>
-        <w:t>V6 (probat)</w:t>
-      </w:r>
-    </w:p>
-    <w:p>
-      <w:pPr>
-        <w:spacing w:before="0" w:after="0"/>
-      </w:pPr>
-      <w:r>
-        <w:rPr>
-          <w:rFonts w:ascii="Calibri" w:hAnsi="Calibri"/>
+          <w:rFonts w:ascii="Times New Roman" w:hAnsi="Times New Roman"/>
           <w:b w:val="0"/>
           <w:i w:val="0"/>
           <w:color w:val="000000"/>
-          <w:sz w:val="22"/>
+          <w:sz w:val="20"/>
         </w:rPr>
         <w:t>Emanuel, Emanuel</w:t>
       </w:r>
@@ -579,11 +325,11 @@
       </w:pPr>
       <w:r>
         <w:rPr>
-          <w:rFonts w:ascii="Calibri" w:hAnsi="Calibri"/>
+          <w:rFonts w:ascii="Times New Roman" w:hAnsi="Times New Roman"/>
           <w:b w:val="0"/>
           <w:i w:val="0"/>
           <w:color w:val="000000"/>
-          <w:sz w:val="22"/>
+          <w:sz w:val="20"/>
         </w:rPr>
         <w:t>I s u s, I s u s</w:t>
       </w:r>
@@ -594,11 +340,11 @@
       </w:pPr>
       <w:r>
         <w:rPr>
-          <w:rFonts w:ascii="Calibri" w:hAnsi="Calibri"/>
+          <w:rFonts w:ascii="Times New Roman" w:hAnsi="Times New Roman"/>
           <w:b w:val="0"/>
           <w:i w:val="0"/>
           <w:color w:val="000000"/>
-          <w:sz w:val="22"/>
+          <w:sz w:val="20"/>
         </w:rPr>
         <w:t>Emanuel</w:t>
       </w:r>
@@ -609,11 +355,11 @@
       </w:pPr>
       <w:r>
         <w:rPr>
-          <w:rFonts w:ascii="Calibri" w:hAnsi="Calibri"/>
+          <w:rFonts w:ascii="Times New Roman" w:hAnsi="Times New Roman"/>
           <w:b w:val="0"/>
           <w:i w:val="0"/>
           <w:color w:val="000000"/>
-          <w:sz w:val="22"/>
+          <w:sz w:val="20"/>
         </w:rPr>
         <w:t>On je živ...</w:t>
       </w:r>
@@ -624,11 +370,11 @@
       </w:pPr>
       <w:r>
         <w:rPr>
-          <w:rFonts w:ascii="Calibri" w:hAnsi="Calibri"/>
+          <w:rFonts w:ascii="Times New Roman" w:hAnsi="Times New Roman"/>
           <w:b w:val="0"/>
           <w:i w:val="0"/>
           <w:color w:val="000000"/>
-          <w:sz w:val="22"/>
+          <w:sz w:val="20"/>
         </w:rPr>
         <w:t>On je tu...</w:t>
       </w:r>
@@ -639,122 +385,41 @@
       </w:pPr>
       <w:r>
         <w:rPr>
-          <w:rFonts w:ascii="Calibri" w:hAnsi="Calibri"/>
+          <w:rFonts w:ascii="Times New Roman" w:hAnsi="Times New Roman"/>
           <w:b w:val="0"/>
           <w:i w:val="0"/>
           <w:color w:val="000000"/>
-          <w:sz w:val="22"/>
+          <w:sz w:val="20"/>
         </w:rPr>
         <w:t>Aleluja ...</w:t>
       </w:r>
     </w:p>
     <w:p>
+      <w:pPr>
+        <w:spacing w:before="60" w:after="60"/>
+      </w:pPr>
       <w:r>
-        <w:br w:type="page"/>
+        <w:rPr>
+          <w:rFonts w:ascii="Times New Roman" w:hAnsi="Times New Roman"/>
+          <w:b w:val="0"/>
+          <w:i w:val="0"/>
+          <w:color w:val="000000"/>
+          <w:sz w:val="20"/>
+        </w:rPr>
+        <w:t>____________________________________________________________</w:t>
       </w:r>
     </w:p>
     <w:p>
       <w:pPr>
-        <w:jc w:val="left"/>
-        <w:spacing w:before="0" w:after="60"/>
-        <w:tabs>
-          <w:tab w:val="right" w:pos="9070"/>
-        </w:tabs>
+        <w:spacing w:before="0" w:after="0"/>
       </w:pPr>
       <w:r>
         <w:rPr>
-          <w:rFonts w:ascii="Calibri" w:hAnsi="Calibri"/>
-          <w:b/>
-          <w:color w:val="000000"/>
-          <w:sz w:val="52"/>
-        </w:rPr>
-        <w:t>Ispred bijele hostije</w:t>
-      </w:r>
-    </w:p>
-    <w:p>
-      <w:pPr>
-        <w:spacing w:before="0" w:after="0"/>
-      </w:pPr>
-      <w:r>
-        <w:rPr>
-          <w:rFonts w:ascii="Calibri" w:hAnsi="Calibri"/>
+          <w:rFonts w:ascii="Times New Roman" w:hAnsi="Times New Roman"/>
           <w:b w:val="0"/>
           <w:i w:val="0"/>
           <w:color w:val="000000"/>
-          <w:sz w:val="22"/>
-        </w:rPr>
-      </w:r>
-    </w:p>
-    <w:p>
-      <w:pPr>
-        <w:spacing w:before="0" w:after="0"/>
-      </w:pPr>
-      <w:r>
-        <w:rPr>
-          <w:rFonts w:ascii="Calibri" w:hAnsi="Calibri"/>
-          <w:b/>
-          <w:i w:val="0"/>
-          <w:color w:val="000000"/>
-          <w:sz w:val="22"/>
-        </w:rPr>
-        <w:t>Pjesmarica</w:t>
-      </w:r>
-    </w:p>
-    <w:p>
-      <w:pPr>
-        <w:spacing w:before="0" w:after="0"/>
-      </w:pPr>
-      <w:r>
-        <w:rPr>
-          <w:rFonts w:ascii="Calibri" w:hAnsi="Calibri"/>
-          <w:b w:val="0"/>
-          <w:i w:val="0"/>
-          <w:color w:val="000000"/>
-          <w:sz w:val="22"/>
-        </w:rPr>
-        <w:t>1010</w:t>
-      </w:r>
-    </w:p>
-    <w:p>
-      <w:pPr>
-        <w:spacing w:before="0" w:after="0"/>
-      </w:pPr>
-      <w:r>
-        <w:rPr>
-          <w:rFonts w:ascii="Calibri" w:hAnsi="Calibri"/>
-          <w:b w:val="0"/>
-          <w:i w:val="0"/>
-          <w:color w:val="000000"/>
-          <w:sz w:val="22"/>
-        </w:rPr>
-      </w:r>
-    </w:p>
-    <w:p>
-      <w:pPr>
-        <w:spacing w:before="120" w:after="0"/>
-      </w:pPr>
-      <w:r>
-        <w:rPr>
-          <w:rFonts w:ascii="Calibri" w:hAnsi="Calibri"/>
-          <w:b/>
-          <w:i w:val="0"/>
-          <w:color w:val="000000"/>
-          <w:sz w:val="22"/>
-        </w:rPr>
-        <w:t>Verse</w:t>
-      </w:r>
-    </w:p>
-    <w:p>
-      <w:pPr>
-        <w:spacing w:before="0" w:after="0"/>
-      </w:pPr>
-      <w:r>
-        <w:rPr>
-          <w:rFonts w:ascii="Calibri" w:hAnsi="Calibri"/>
-          <w:b w:val="0"/>
-          <w:i w:val="0"/>
-          <w:color w:val="000000"/>
-          <w:sz w:val="22"/>
+          <w:sz w:val="20"/>
         </w:rPr>
         <w:t>ŠUTIM POPUT GRLICE</w:t>
       </w:r>
@@ -765,11 +430,11 @@
       </w:pPr>
       <w:r>
         <w:rPr>
-          <w:rFonts w:ascii="Calibri" w:hAnsi="Calibri"/>
+          <w:rFonts w:ascii="Times New Roman" w:hAnsi="Times New Roman"/>
           <w:b w:val="0"/>
           <w:i w:val="0"/>
           <w:color w:val="000000"/>
-          <w:sz w:val="22"/>
+          <w:sz w:val="20"/>
         </w:rPr>
         <w:t>ZAKLONJEN U LJUBAV</w:t>
       </w:r>
@@ -780,11 +445,11 @@
       </w:pPr>
       <w:r>
         <w:rPr>
-          <w:rFonts w:ascii="Calibri" w:hAnsi="Calibri"/>
+          <w:rFonts w:ascii="Times New Roman" w:hAnsi="Times New Roman"/>
           <w:b w:val="0"/>
           <w:i w:val="0"/>
           <w:color w:val="000000"/>
-          <w:sz w:val="22"/>
+          <w:sz w:val="20"/>
         </w:rPr>
         <w:t>ISPRED</w:t>
       </w:r>
@@ -795,11 +460,11 @@
       </w:pPr>
       <w:r>
         <w:rPr>
-          <w:rFonts w:ascii="Calibri" w:hAnsi="Calibri"/>
+          <w:rFonts w:ascii="Times New Roman" w:hAnsi="Times New Roman"/>
           <w:b w:val="0"/>
           <w:i w:val="0"/>
           <w:color w:val="000000"/>
-          <w:sz w:val="22"/>
+          <w:sz w:val="20"/>
         </w:rPr>
         <w:t>BIJELE HOSTIJE</w:t>
       </w:r>
@@ -810,11 +475,11 @@
       </w:pPr>
       <w:r>
         <w:rPr>
-          <w:rFonts w:ascii="Calibri" w:hAnsi="Calibri"/>
+          <w:rFonts w:ascii="Times New Roman" w:hAnsi="Times New Roman"/>
           <w:b w:val="0"/>
           <w:i w:val="0"/>
           <w:color w:val="000000"/>
-          <w:sz w:val="22"/>
+          <w:sz w:val="20"/>
         </w:rPr>
         <w:t>I SLUŠAM KAKO MI GOVORIŠ</w:t>
       </w:r>
@@ -825,40 +490,26 @@
       </w:pPr>
       <w:r>
         <w:rPr>
-          <w:rFonts w:ascii="Calibri" w:hAnsi="Calibri"/>
+          <w:rFonts w:ascii="Times New Roman" w:hAnsi="Times New Roman"/>
           <w:b w:val="0"/>
           <w:i w:val="0"/>
           <w:color w:val="000000"/>
-          <w:sz w:val="22"/>
+          <w:sz w:val="20"/>
         </w:rPr>
       </w:r>
     </w:p>
     <w:p>
       <w:pPr>
-        <w:spacing w:before="120" w:after="0"/>
+        <w:spacing w:before="0" w:after="0"/>
+        <w:ind w:left="720"/>
       </w:pPr>
       <w:r>
         <w:rPr>
-          <w:rFonts w:ascii="Calibri" w:hAnsi="Calibri"/>
+          <w:rFonts w:ascii="Times New Roman" w:hAnsi="Times New Roman"/>
           <w:b/>
-          <w:i w:val="0"/>
+          <w:i/>
           <w:color w:val="000000"/>
-          <w:sz w:val="22"/>
-        </w:rPr>
-        <w:t>Chorus</w:t>
-      </w:r>
-    </w:p>
-    <w:p>
-      <w:pPr>
-        <w:spacing w:before="0" w:after="0"/>
-      </w:pPr>
-      <w:r>
-        <w:rPr>
-          <w:rFonts w:ascii="Calibri" w:hAnsi="Calibri"/>
-          <w:b w:val="0"/>
-          <w:i w:val="0"/>
-          <w:color w:val="000000"/>
-          <w:sz w:val="22"/>
+          <w:sz w:val="20"/>
         </w:rPr>
         <w:t>KAD BI ZNAO KOLIKO TE LJUBIM</w:t>
       </w:r>
@@ -866,14 +517,15 @@
     <w:p>
       <w:pPr>
         <w:spacing w:before="0" w:after="0"/>
+        <w:ind w:left="720"/>
       </w:pPr>
       <w:r>
         <w:rPr>
-          <w:rFonts w:ascii="Calibri" w:hAnsi="Calibri"/>
-          <w:b w:val="0"/>
-          <w:i w:val="0"/>
+          <w:rFonts w:ascii="Times New Roman" w:hAnsi="Times New Roman"/>
+          <w:b/>
+          <w:i/>
           <w:color w:val="000000"/>
-          <w:sz w:val="22"/>
+          <w:sz w:val="20"/>
         </w:rPr>
         <w:t>NE BI GLEDAO SVOJE RANE I BOLI</w:t>
       </w:r>
@@ -881,14 +533,15 @@
     <w:p>
       <w:pPr>
         <w:spacing w:before="0" w:after="0"/>
+        <w:ind w:left="720"/>
       </w:pPr>
       <w:r>
         <w:rPr>
-          <w:rFonts w:ascii="Calibri" w:hAnsi="Calibri"/>
-          <w:b w:val="0"/>
-          <w:i w:val="0"/>
+          <w:rFonts w:ascii="Times New Roman" w:hAnsi="Times New Roman"/>
+          <w:b/>
+          <w:i/>
           <w:color w:val="000000"/>
-          <w:sz w:val="22"/>
+          <w:sz w:val="20"/>
         </w:rPr>
         <w:t>GLEDAO BI SAMO MOJU LJUBAV</w:t>
       </w:r>
@@ -896,97 +549,45 @@
     <w:p>
       <w:pPr>
         <w:spacing w:before="0" w:after="0"/>
+        <w:ind w:left="720"/>
       </w:pPr>
       <w:r>
         <w:rPr>
-          <w:rFonts w:ascii="Calibri" w:hAnsi="Calibri"/>
-          <w:b w:val="0"/>
-          <w:i w:val="0"/>
+          <w:rFonts w:ascii="Times New Roman" w:hAnsi="Times New Roman"/>
+          <w:b/>
+          <w:i/>
           <w:color w:val="000000"/>
-          <w:sz w:val="22"/>
+          <w:sz w:val="20"/>
         </w:rPr>
         <w:t>KOJA BI TE LIJEČILA</w:t>
       </w:r>
     </w:p>
     <w:p>
+      <w:pPr>
+        <w:spacing w:before="60" w:after="60"/>
+      </w:pPr>
       <w:r>
-        <w:br w:type="page"/>
+        <w:rPr>
+          <w:rFonts w:ascii="Times New Roman" w:hAnsi="Times New Roman"/>
+          <w:b w:val="0"/>
+          <w:i w:val="0"/>
+          <w:color w:val="000000"/>
+          <w:sz w:val="20"/>
+        </w:rPr>
+        <w:t>____________________________________________________________</w:t>
       </w:r>
     </w:p>
     <w:p>
       <w:pPr>
-        <w:jc w:val="left"/>
-        <w:spacing w:before="0" w:after="60"/>
-        <w:tabs>
-          <w:tab w:val="right" w:pos="9070"/>
-        </w:tabs>
+        <w:spacing w:before="0" w:after="0"/>
       </w:pPr>
       <w:r>
         <w:rPr>
-          <w:rFonts w:ascii="Calibri" w:hAnsi="Calibri"/>
-          <w:b/>
-          <w:color w:val="000000"/>
-          <w:sz w:val="52"/>
-        </w:rPr>
-        <w:t>Svet Si ( Klanjanje ) +</w:t>
-      </w:r>
-      <w:r>
-        <w:rPr>
-          <w:rFonts w:ascii="Calibri" w:hAnsi="Calibri"/>
-          <w:sz w:val="22"/>
-        </w:rPr>
-        <w:tab/>
-      </w:r>
-      <w:r>
-        <w:rPr>
-          <w:rFonts w:ascii="Calibri" w:hAnsi="Calibri"/>
-          <w:b w:val="0"/>
-          <w:color w:val="000000"/>
-          <w:sz w:val="22"/>
-        </w:rPr>
-        <w:t>Capo 1</w:t>
-      </w:r>
-    </w:p>
-    <w:p>
-      <w:pPr>
-        <w:spacing w:before="0" w:after="0"/>
-      </w:pPr>
-      <w:r>
-        <w:rPr>
-          <w:rFonts w:ascii="Calibri" w:hAnsi="Calibri"/>
+          <w:rFonts w:ascii="Times New Roman" w:hAnsi="Times New Roman"/>
           <w:b w:val="0"/>
           <w:i w:val="0"/>
           <w:color w:val="000000"/>
-          <w:sz w:val="22"/>
-        </w:rPr>
-      </w:r>
-    </w:p>
-    <w:p>
-      <w:pPr>
-        <w:spacing w:before="120" w:after="0"/>
-      </w:pPr>
-      <w:r>
-        <w:rPr>
-          <w:rFonts w:ascii="Calibri" w:hAnsi="Calibri"/>
-          <w:b/>
-          <w:i w:val="0"/>
-          <w:color w:val="000000"/>
-          <w:sz w:val="22"/>
-        </w:rPr>
-        <w:t>Verse</w:t>
-      </w:r>
-    </w:p>
-    <w:p>
-      <w:pPr>
-        <w:spacing w:before="0" w:after="0"/>
-      </w:pPr>
-      <w:r>
-        <w:rPr>
-          <w:rFonts w:ascii="Calibri" w:hAnsi="Calibri"/>
-          <w:b w:val="0"/>
-          <w:i w:val="0"/>
-          <w:color w:val="000000"/>
-          <w:sz w:val="22"/>
+          <w:sz w:val="20"/>
         </w:rPr>
         <w:t>Isus je sa nama</w:t>
       </w:r>
@@ -997,11 +598,11 @@
       </w:pPr>
       <w:r>
         <w:rPr>
-          <w:rFonts w:ascii="Calibri" w:hAnsi="Calibri"/>
+          <w:rFonts w:ascii="Times New Roman" w:hAnsi="Times New Roman"/>
           <w:b w:val="0"/>
           <w:i w:val="0"/>
           <w:color w:val="000000"/>
-          <w:sz w:val="22"/>
+          <w:sz w:val="20"/>
         </w:rPr>
         <w:t>Ovdje sad, ovdje sad</w:t>
       </w:r>
@@ -1012,11 +613,11 @@
       </w:pPr>
       <w:r>
         <w:rPr>
-          <w:rFonts w:ascii="Calibri" w:hAnsi="Calibri"/>
+          <w:rFonts w:ascii="Times New Roman" w:hAnsi="Times New Roman"/>
           <w:b w:val="0"/>
           <w:i w:val="0"/>
           <w:color w:val="000000"/>
-          <w:sz w:val="22"/>
+          <w:sz w:val="20"/>
         </w:rPr>
         <w:t>Tlo gdje sad stojim ja</w:t>
       </w:r>
@@ -1027,11 +628,11 @@
       </w:pPr>
       <w:r>
         <w:rPr>
-          <w:rFonts w:ascii="Calibri" w:hAnsi="Calibri"/>
+          <w:rFonts w:ascii="Times New Roman" w:hAnsi="Times New Roman"/>
           <w:b w:val="0"/>
           <w:i w:val="0"/>
           <w:color w:val="000000"/>
-          <w:sz w:val="22"/>
+          <w:sz w:val="20"/>
         </w:rPr>
         <w:t>Sveto je zbog Njega</w:t>
       </w:r>
@@ -1042,11 +643,11 @@
       </w:pPr>
       <w:r>
         <w:rPr>
-          <w:rFonts w:ascii="Calibri" w:hAnsi="Calibri"/>
+          <w:rFonts w:ascii="Times New Roman" w:hAnsi="Times New Roman"/>
           <w:b w:val="0"/>
           <w:i w:val="0"/>
           <w:color w:val="000000"/>
-          <w:sz w:val="22"/>
+          <w:sz w:val="20"/>
         </w:rPr>
         <w:t>Bozji Duh prebiva</w:t>
       </w:r>
@@ -1057,11 +658,11 @@
       </w:pPr>
       <w:r>
         <w:rPr>
-          <w:rFonts w:ascii="Calibri" w:hAnsi="Calibri"/>
+          <w:rFonts w:ascii="Times New Roman" w:hAnsi="Times New Roman"/>
           <w:b w:val="0"/>
           <w:i w:val="0"/>
           <w:color w:val="000000"/>
-          <w:sz w:val="22"/>
+          <w:sz w:val="20"/>
         </w:rPr>
         <w:t>Ovdje sad, medj’ nama</w:t>
       </w:r>
@@ -1072,11 +673,11 @@
       </w:pPr>
       <w:r>
         <w:rPr>
-          <w:rFonts w:ascii="Calibri" w:hAnsi="Calibri"/>
+          <w:rFonts w:ascii="Times New Roman" w:hAnsi="Times New Roman"/>
           <w:b w:val="0"/>
           <w:i w:val="0"/>
           <w:color w:val="000000"/>
-          <w:sz w:val="22"/>
+          <w:sz w:val="20"/>
         </w:rPr>
         <w:t>Svaki te otkucaj</w:t>
       </w:r>
@@ -1087,11 +688,11 @@
       </w:pPr>
       <w:r>
         <w:rPr>
-          <w:rFonts w:ascii="Calibri" w:hAnsi="Calibri"/>
+          <w:rFonts w:ascii="Times New Roman" w:hAnsi="Times New Roman"/>
           <w:b w:val="0"/>
           <w:i w:val="0"/>
           <w:color w:val="000000"/>
-          <w:sz w:val="22"/>
+          <w:sz w:val="20"/>
         </w:rPr>
         <w:t>Srca mog doziva</w:t>
       </w:r>
@@ -1102,11 +703,11 @@
       </w:pPr>
       <w:r>
         <w:rPr>
-          <w:rFonts w:ascii="Calibri" w:hAnsi="Calibri"/>
+          <w:rFonts w:ascii="Times New Roman" w:hAnsi="Times New Roman"/>
           <w:b w:val="0"/>
           <w:i w:val="0"/>
           <w:color w:val="000000"/>
-          <w:sz w:val="22"/>
+          <w:sz w:val="20"/>
         </w:rPr>
         <w:t>Tebe cu dovijeka slaviti ja</w:t>
       </w:r>
@@ -1117,11 +718,11 @@
       </w:pPr>
       <w:r>
         <w:rPr>
-          <w:rFonts w:ascii="Calibri" w:hAnsi="Calibri"/>
+          <w:rFonts w:ascii="Times New Roman" w:hAnsi="Times New Roman"/>
           <w:b w:val="0"/>
           <w:i w:val="0"/>
           <w:color w:val="000000"/>
-          <w:sz w:val="22"/>
+          <w:sz w:val="20"/>
         </w:rPr>
         <w:t>Sa svim andjelima i svim svecima</w:t>
       </w:r>
@@ -1132,11 +733,11 @@
       </w:pPr>
       <w:r>
         <w:rPr>
-          <w:rFonts w:ascii="Calibri" w:hAnsi="Calibri"/>
+          <w:rFonts w:ascii="Times New Roman" w:hAnsi="Times New Roman"/>
           <w:b w:val="0"/>
           <w:i w:val="0"/>
           <w:color w:val="000000"/>
-          <w:sz w:val="22"/>
+          <w:sz w:val="20"/>
         </w:rPr>
         <w:t>Cija slava i hvala Tvog imena</w:t>
       </w:r>
@@ -1147,11 +748,11 @@
       </w:pPr>
       <w:r>
         <w:rPr>
-          <w:rFonts w:ascii="Calibri" w:hAnsi="Calibri"/>
+          <w:rFonts w:ascii="Times New Roman" w:hAnsi="Times New Roman"/>
           <w:b w:val="0"/>
           <w:i w:val="0"/>
           <w:color w:val="000000"/>
-          <w:sz w:val="22"/>
+          <w:sz w:val="20"/>
         </w:rPr>
         <w:t>Odjekuje nebesima</w:t>
       </w:r>
@@ -1162,40 +763,26 @@
       </w:pPr>
       <w:r>
         <w:rPr>
-          <w:rFonts w:ascii="Calibri" w:hAnsi="Calibri"/>
+          <w:rFonts w:ascii="Times New Roman" w:hAnsi="Times New Roman"/>
           <w:b w:val="0"/>
           <w:i w:val="0"/>
           <w:color w:val="000000"/>
-          <w:sz w:val="22"/>
+          <w:sz w:val="20"/>
         </w:rPr>
       </w:r>
     </w:p>
     <w:p>
       <w:pPr>
-        <w:spacing w:before="120" w:after="0"/>
+        <w:spacing w:before="0" w:after="0"/>
+        <w:ind w:left="720"/>
       </w:pPr>
       <w:r>
         <w:rPr>
-          <w:rFonts w:ascii="Calibri" w:hAnsi="Calibri"/>
+          <w:rFonts w:ascii="Times New Roman" w:hAnsi="Times New Roman"/>
           <w:b/>
-          <w:i w:val="0"/>
+          <w:i/>
           <w:color w:val="000000"/>
-          <w:sz w:val="22"/>
-        </w:rPr>
-        <w:t>Chorus</w:t>
-      </w:r>
-    </w:p>
-    <w:p>
-      <w:pPr>
-        <w:spacing w:before="0" w:after="0"/>
-      </w:pPr>
-      <w:r>
-        <w:rPr>
-          <w:rFonts w:ascii="Calibri" w:hAnsi="Calibri"/>
-          <w:b w:val="0"/>
-          <w:i w:val="0"/>
-          <w:color w:val="000000"/>
-          <w:sz w:val="22"/>
+          <w:sz w:val="20"/>
         </w:rPr>
         <w:t>Svet si, svet si, svet si Bog</w:t>
       </w:r>
@@ -1203,14 +790,15 @@
     <w:p>
       <w:pPr>
         <w:spacing w:before="0" w:after="0"/>
+        <w:ind w:left="720"/>
       </w:pPr>
       <w:r>
         <w:rPr>
-          <w:rFonts w:ascii="Calibri" w:hAnsi="Calibri"/>
-          <w:b w:val="0"/>
-          <w:i w:val="0"/>
+          <w:rFonts w:ascii="Times New Roman" w:hAnsi="Times New Roman"/>
+          <w:b/>
+          <w:i/>
           <w:color w:val="000000"/>
-          <w:sz w:val="22"/>
+          <w:sz w:val="20"/>
         </w:rPr>
         <w:t>Vjecni kralj si srca mog.</w:t>
       </w:r>
@@ -1218,14 +806,15 @@
     <w:p>
       <w:pPr>
         <w:spacing w:before="0" w:after="0"/>
+        <w:ind w:left="720"/>
       </w:pPr>
       <w:r>
         <w:rPr>
-          <w:rFonts w:ascii="Calibri" w:hAnsi="Calibri"/>
-          <w:b w:val="0"/>
-          <w:i w:val="0"/>
+          <w:rFonts w:ascii="Times New Roman" w:hAnsi="Times New Roman"/>
+          <w:b/>
+          <w:i/>
           <w:color w:val="000000"/>
-          <w:sz w:val="22"/>
+          <w:sz w:val="20"/>
         </w:rPr>
         <w:t>Jer si bio, I jesi</w:t>
       </w:r>
@@ -1233,14 +822,15 @@
     <w:p>
       <w:pPr>
         <w:spacing w:before="0" w:after="0"/>
+        <w:ind w:left="720"/>
       </w:pPr>
       <w:r>
         <w:rPr>
-          <w:rFonts w:ascii="Calibri" w:hAnsi="Calibri"/>
-          <w:b w:val="0"/>
-          <w:i w:val="0"/>
+          <w:rFonts w:ascii="Times New Roman" w:hAnsi="Times New Roman"/>
+          <w:b/>
+          <w:i/>
           <w:color w:val="000000"/>
-          <w:sz w:val="22"/>
+          <w:sz w:val="20"/>
         </w:rPr>
         <w:t>I uvijek ces biti</w:t>
       </w:r>
@@ -1248,14 +838,15 @@
     <w:p>
       <w:pPr>
         <w:spacing w:before="0" w:after="0"/>
+        <w:ind w:left="720"/>
       </w:pPr>
       <w:r>
         <w:rPr>
-          <w:rFonts w:ascii="Calibri" w:hAnsi="Calibri"/>
-          <w:b w:val="0"/>
-          <w:i w:val="0"/>
+          <w:rFonts w:ascii="Times New Roman" w:hAnsi="Times New Roman"/>
+          <w:b/>
+          <w:i/>
           <w:color w:val="000000"/>
-          <w:sz w:val="22"/>
+          <w:sz w:val="20"/>
         </w:rPr>
         <w:t>Moj Bog sve moje, sto imam je Tvoje</w:t>
       </w:r>
@@ -1263,14 +854,15 @@
     <w:p>
       <w:pPr>
         <w:spacing w:before="0" w:after="0"/>
+        <w:ind w:left="720"/>
       </w:pPr>
       <w:r>
         <w:rPr>
-          <w:rFonts w:ascii="Calibri" w:hAnsi="Calibri"/>
-          <w:b w:val="0"/>
-          <w:i w:val="0"/>
+          <w:rFonts w:ascii="Times New Roman" w:hAnsi="Times New Roman"/>
+          <w:b/>
+          <w:i/>
           <w:color w:val="000000"/>
-          <w:sz w:val="22"/>
+          <w:sz w:val="20"/>
         </w:rPr>
         <w:t>Svet si, svet si Bog</w:t>
       </w:r>
@@ -1281,40 +873,25 @@
       </w:pPr>
       <w:r>
         <w:rPr>
-          <w:rFonts w:ascii="Calibri" w:hAnsi="Calibri"/>
+          <w:rFonts w:ascii="Times New Roman" w:hAnsi="Times New Roman"/>
           <w:b w:val="0"/>
           <w:i w:val="0"/>
           <w:color w:val="000000"/>
-          <w:sz w:val="22"/>
+          <w:sz w:val="20"/>
         </w:rPr>
       </w:r>
     </w:p>
     <w:p>
       <w:pPr>
-        <w:spacing w:before="120" w:after="0"/>
+        <w:spacing w:before="0" w:after="0"/>
       </w:pPr>
       <w:r>
         <w:rPr>
-          <w:rFonts w:ascii="Calibri" w:hAnsi="Calibri"/>
-          <w:b/>
-          <w:i w:val="0"/>
-          <w:color w:val="000000"/>
-          <w:sz w:val="22"/>
-        </w:rPr>
-        <w:t>Verse</w:t>
-      </w:r>
-    </w:p>
-    <w:p>
-      <w:pPr>
-        <w:spacing w:before="0" w:after="0"/>
-      </w:pPr>
-      <w:r>
-        <w:rPr>
-          <w:rFonts w:ascii="Calibri" w:hAnsi="Calibri"/>
+          <w:rFonts w:ascii="Times New Roman" w:hAnsi="Times New Roman"/>
           <w:b w:val="0"/>
           <w:i w:val="0"/>
           <w:color w:val="000000"/>
-          <w:sz w:val="22"/>
+          <w:sz w:val="20"/>
         </w:rPr>
         <w:t>Njezno me pozivas</w:t>
       </w:r>
@@ -1325,11 +902,11 @@
       </w:pPr>
       <w:r>
         <w:rPr>
-          <w:rFonts w:ascii="Calibri" w:hAnsi="Calibri"/>
+          <w:rFonts w:ascii="Times New Roman" w:hAnsi="Times New Roman"/>
           <w:b w:val="0"/>
           <w:i w:val="0"/>
           <w:color w:val="000000"/>
-          <w:sz w:val="22"/>
+          <w:sz w:val="20"/>
         </w:rPr>
         <w:t>Imenom dozivas</w:t>
       </w:r>
@@ -1340,11 +917,11 @@
       </w:pPr>
       <w:r>
         <w:rPr>
-          <w:rFonts w:ascii="Calibri" w:hAnsi="Calibri"/>
+          <w:rFonts w:ascii="Times New Roman" w:hAnsi="Times New Roman"/>
           <w:b w:val="0"/>
           <w:i w:val="0"/>
           <w:color w:val="000000"/>
-          <w:sz w:val="22"/>
+          <w:sz w:val="20"/>
         </w:rPr>
         <w:t>Zelim te slijediti</w:t>
       </w:r>
@@ -1355,11 +932,11 @@
       </w:pPr>
       <w:r>
         <w:rPr>
-          <w:rFonts w:ascii="Calibri" w:hAnsi="Calibri"/>
+          <w:rFonts w:ascii="Times New Roman" w:hAnsi="Times New Roman"/>
           <w:b w:val="0"/>
           <w:i w:val="0"/>
           <w:color w:val="000000"/>
-          <w:sz w:val="22"/>
+          <w:sz w:val="20"/>
         </w:rPr>
         <w:t>Tvoju rijec vrsiti</w:t>
       </w:r>
@@ -1370,40 +947,26 @@
       </w:pPr>
       <w:r>
         <w:rPr>
-          <w:rFonts w:ascii="Calibri" w:hAnsi="Calibri"/>
+          <w:rFonts w:ascii="Times New Roman" w:hAnsi="Times New Roman"/>
           <w:b w:val="0"/>
           <w:i w:val="0"/>
           <w:color w:val="000000"/>
-          <w:sz w:val="22"/>
+          <w:sz w:val="20"/>
         </w:rPr>
       </w:r>
     </w:p>
     <w:p>
       <w:pPr>
-        <w:spacing w:before="120" w:after="0"/>
+        <w:spacing w:before="0" w:after="0"/>
+        <w:ind w:left="720"/>
       </w:pPr>
       <w:r>
         <w:rPr>
-          <w:rFonts w:ascii="Calibri" w:hAnsi="Calibri"/>
+          <w:rFonts w:ascii="Times New Roman" w:hAnsi="Times New Roman"/>
           <w:b/>
-          <w:i w:val="0"/>
+          <w:i/>
           <w:color w:val="000000"/>
-          <w:sz w:val="22"/>
-        </w:rPr>
-        <w:t>BRIDGE</w:t>
-      </w:r>
-    </w:p>
-    <w:p>
-      <w:pPr>
-        <w:spacing w:before="0" w:after="0"/>
-      </w:pPr>
-      <w:r>
-        <w:rPr>
-          <w:rFonts w:ascii="Calibri" w:hAnsi="Calibri"/>
-          <w:b w:val="0"/>
-          <w:i w:val="0"/>
-          <w:color w:val="000000"/>
-          <w:sz w:val="22"/>
+          <w:sz w:val="20"/>
         </w:rPr>
         <w:t>U Kraljevstvo me pozivas</w:t>
       </w:r>
@@ -1411,14 +974,15 @@
     <w:p>
       <w:pPr>
         <w:spacing w:before="0" w:after="0"/>
+        <w:ind w:left="720"/>
       </w:pPr>
       <w:r>
         <w:rPr>
-          <w:rFonts w:ascii="Calibri" w:hAnsi="Calibri"/>
-          <w:b w:val="0"/>
-          <w:i w:val="0"/>
+          <w:rFonts w:ascii="Times New Roman" w:hAnsi="Times New Roman"/>
+          <w:b/>
+          <w:i/>
           <w:color w:val="000000"/>
-          <w:sz w:val="22"/>
+          <w:sz w:val="20"/>
         </w:rPr>
         <w:t>Da slavu Tvoju gledam ja</w:t>
       </w:r>
@@ -1426,14 +990,15 @@
     <w:p>
       <w:pPr>
         <w:spacing w:before="0" w:after="0"/>
+        <w:ind w:left="720"/>
       </w:pPr>
       <w:r>
         <w:rPr>
-          <w:rFonts w:ascii="Calibri" w:hAnsi="Calibri"/>
-          <w:b w:val="0"/>
-          <w:i w:val="0"/>
+          <w:rFonts w:ascii="Times New Roman" w:hAnsi="Times New Roman"/>
+          <w:b/>
+          <w:i/>
           <w:color w:val="000000"/>
-          <w:sz w:val="22"/>
+          <w:sz w:val="20"/>
         </w:rPr>
         <w:t>Da te vidim, da te slavim</w:t>
       </w:r>
@@ -1441,186 +1006,45 @@
     <w:p>
       <w:pPr>
         <w:spacing w:before="0" w:after="0"/>
+        <w:ind w:left="720"/>
       </w:pPr>
       <w:r>
         <w:rPr>
-          <w:rFonts w:ascii="Calibri" w:hAnsi="Calibri"/>
-          <w:b w:val="0"/>
-          <w:i w:val="0"/>
+          <w:rFonts w:ascii="Times New Roman" w:hAnsi="Times New Roman"/>
+          <w:b/>
+          <w:i/>
           <w:color w:val="000000"/>
-          <w:sz w:val="22"/>
+          <w:sz w:val="20"/>
         </w:rPr>
         <w:t>Da se klanjam</w:t>
       </w:r>
     </w:p>
     <w:p>
+      <w:pPr>
+        <w:spacing w:before="60" w:after="60"/>
+      </w:pPr>
       <w:r>
-        <w:br w:type="page"/>
+        <w:rPr>
+          <w:rFonts w:ascii="Times New Roman" w:hAnsi="Times New Roman"/>
+          <w:b w:val="0"/>
+          <w:i w:val="0"/>
+          <w:color w:val="000000"/>
+          <w:sz w:val="20"/>
+        </w:rPr>
+        <w:t>____________________________________________________________</w:t>
       </w:r>
     </w:p>
     <w:p>
       <w:pPr>
-        <w:jc w:val="left"/>
-        <w:spacing w:before="0" w:after="60"/>
-        <w:tabs>
-          <w:tab w:val="right" w:pos="9070"/>
-        </w:tabs>
+        <w:spacing w:before="0" w:after="0"/>
       </w:pPr>
       <w:r>
         <w:rPr>
-          <w:rFonts w:ascii="Calibri" w:hAnsi="Calibri"/>
-          <w:b/>
-          <w:color w:val="000000"/>
-          <w:sz w:val="52"/>
-        </w:rPr>
-        <w:t>što više tražim</w:t>
-      </w:r>
-      <w:r>
-        <w:rPr>
-          <w:rFonts w:ascii="Calibri" w:hAnsi="Calibri"/>
-          <w:sz w:val="22"/>
-        </w:rPr>
-        <w:tab/>
-      </w:r>
-      <w:r>
-        <w:rPr>
-          <w:rFonts w:ascii="Calibri" w:hAnsi="Calibri"/>
-          <w:b w:val="0"/>
-          <w:color w:val="000000"/>
-          <w:sz w:val="22"/>
-        </w:rPr>
-        <w:t>Capo 7</w:t>
-      </w:r>
-    </w:p>
-    <w:p>
-      <w:pPr>
-        <w:spacing w:before="0" w:after="0"/>
-      </w:pPr>
-      <w:r>
-        <w:rPr>
-          <w:rFonts w:ascii="Calibri" w:hAnsi="Calibri"/>
+          <w:rFonts w:ascii="Times New Roman" w:hAnsi="Times New Roman"/>
           <w:b w:val="0"/>
           <w:i w:val="0"/>
           <w:color w:val="000000"/>
-          <w:sz w:val="22"/>
-        </w:rPr>
-      </w:r>
-    </w:p>
-    <w:p>
-      <w:pPr>
-        <w:spacing w:before="0" w:after="0"/>
-      </w:pPr>
-      <w:r>
-        <w:rPr>
-          <w:rFonts w:ascii="Calibri" w:hAnsi="Calibri"/>
-          <w:b w:val="0"/>
-          <w:i w:val="0"/>
-          <w:color w:val="000000"/>
-          <w:sz w:val="22"/>
-        </w:rPr>
-        <w:t>Uvod cjeli refren,</w:t>
-      </w:r>
-    </w:p>
-    <w:p>
-      <w:pPr>
-        <w:spacing w:before="0" w:after="0"/>
-      </w:pPr>
-      <w:r>
-        <w:rPr>
-          <w:rFonts w:ascii="Calibri" w:hAnsi="Calibri"/>
-          <w:b w:val="0"/>
-          <w:i w:val="0"/>
-          <w:color w:val="000000"/>
-          <w:sz w:val="22"/>
-        </w:rPr>
-        <w:t>kitica,pa refren 2x,</w:t>
-      </w:r>
-    </w:p>
-    <w:p>
-      <w:pPr>
-        <w:spacing w:before="0" w:after="0"/>
-      </w:pPr>
-      <w:r>
-        <w:rPr>
-          <w:rFonts w:ascii="Calibri" w:hAnsi="Calibri"/>
-          <w:b w:val="0"/>
-          <w:i w:val="0"/>
-          <w:color w:val="000000"/>
-          <w:sz w:val="22"/>
-        </w:rPr>
-        <w:t>cijeli refren opet uvod,</w:t>
-      </w:r>
-    </w:p>
-    <w:p>
-      <w:pPr>
-        <w:spacing w:before="0" w:after="0"/>
-      </w:pPr>
-      <w:r>
-        <w:rPr>
-          <w:rFonts w:ascii="Calibri" w:hAnsi="Calibri"/>
-          <w:b w:val="0"/>
-          <w:i w:val="0"/>
-          <w:color w:val="000000"/>
-          <w:sz w:val="22"/>
-        </w:rPr>
-        <w:t>kitica,3x refren,pa sviramo refren,</w:t>
-      </w:r>
-    </w:p>
-    <w:p>
-      <w:pPr>
-        <w:spacing w:before="0" w:after="0"/>
-      </w:pPr>
-      <w:r>
-        <w:rPr>
-          <w:rFonts w:ascii="Calibri" w:hAnsi="Calibri"/>
-          <w:b w:val="0"/>
-          <w:i w:val="0"/>
-          <w:color w:val="000000"/>
-          <w:sz w:val="22"/>
-        </w:rPr>
-        <w:t>kitica i završavamo u C</w:t>
-      </w:r>
-    </w:p>
-    <w:p>
-      <w:pPr>
-        <w:spacing w:before="0" w:after="0"/>
-      </w:pPr>
-      <w:r>
-        <w:rPr>
-          <w:rFonts w:ascii="Calibri" w:hAnsi="Calibri"/>
-          <w:b w:val="0"/>
-          <w:i w:val="0"/>
-          <w:color w:val="000000"/>
-          <w:sz w:val="22"/>
-        </w:rPr>
-      </w:r>
-    </w:p>
-    <w:p>
-      <w:pPr>
-        <w:spacing w:before="120" w:after="0"/>
-      </w:pPr>
-      <w:r>
-        <w:rPr>
-          <w:rFonts w:ascii="Calibri" w:hAnsi="Calibri"/>
-          <w:b/>
-          <w:i w:val="0"/>
-          <w:color w:val="000000"/>
-          <w:sz w:val="22"/>
-        </w:rPr>
-        <w:t>Verse</w:t>
-      </w:r>
-    </w:p>
-    <w:p>
-      <w:pPr>
-        <w:spacing w:before="0" w:after="0"/>
-      </w:pPr>
-      <w:r>
-        <w:rPr>
-          <w:rFonts w:ascii="Calibri" w:hAnsi="Calibri"/>
-          <w:b w:val="0"/>
-          <w:i w:val="0"/>
-          <w:color w:val="000000"/>
-          <w:sz w:val="22"/>
+          <w:sz w:val="20"/>
         </w:rPr>
         <w:t>što više tražim više te nađem</w:t>
       </w:r>
@@ -1631,11 +1055,11 @@
       </w:pPr>
       <w:r>
         <w:rPr>
-          <w:rFonts w:ascii="Calibri" w:hAnsi="Calibri"/>
+          <w:rFonts w:ascii="Times New Roman" w:hAnsi="Times New Roman"/>
           <w:b w:val="0"/>
           <w:i w:val="0"/>
           <w:color w:val="000000"/>
-          <w:sz w:val="22"/>
+          <w:sz w:val="20"/>
         </w:rPr>
         <w:t>što više nađem više te volim</w:t>
       </w:r>
@@ -1646,40 +1070,26 @@
       </w:pPr>
       <w:r>
         <w:rPr>
-          <w:rFonts w:ascii="Calibri" w:hAnsi="Calibri"/>
+          <w:rFonts w:ascii="Times New Roman" w:hAnsi="Times New Roman"/>
           <w:b w:val="0"/>
           <w:i w:val="0"/>
           <w:color w:val="000000"/>
-          <w:sz w:val="22"/>
+          <w:sz w:val="20"/>
         </w:rPr>
       </w:r>
     </w:p>
     <w:p>
       <w:pPr>
-        <w:spacing w:before="120" w:after="0"/>
+        <w:spacing w:before="0" w:after="0"/>
+        <w:ind w:left="720"/>
       </w:pPr>
       <w:r>
         <w:rPr>
-          <w:rFonts w:ascii="Calibri" w:hAnsi="Calibri"/>
+          <w:rFonts w:ascii="Times New Roman" w:hAnsi="Times New Roman"/>
           <w:b/>
-          <w:i w:val="0"/>
+          <w:i/>
           <w:color w:val="000000"/>
-          <w:sz w:val="22"/>
-        </w:rPr>
-        <w:t>Chorus</w:t>
-      </w:r>
-    </w:p>
-    <w:p>
-      <w:pPr>
-        <w:spacing w:before="0" w:after="0"/>
-      </w:pPr>
-      <w:r>
-        <w:rPr>
-          <w:rFonts w:ascii="Calibri" w:hAnsi="Calibri"/>
-          <w:b w:val="0"/>
-          <w:i w:val="0"/>
-          <w:color w:val="000000"/>
-          <w:sz w:val="22"/>
+          <w:sz w:val="20"/>
         </w:rPr>
         <w:t>želim sad sjediti tu i samo slušati te</w:t>
       </w:r>
@@ -1687,14 +1097,15 @@
     <w:p>
       <w:pPr>
         <w:spacing w:before="0" w:after="0"/>
+        <w:ind w:left="720"/>
       </w:pPr>
       <w:r>
         <w:rPr>
-          <w:rFonts w:ascii="Calibri" w:hAnsi="Calibri"/>
-          <w:b w:val="0"/>
-          <w:i w:val="0"/>
+          <w:rFonts w:ascii="Times New Roman" w:hAnsi="Times New Roman"/>
+          <w:b/>
+          <w:i/>
           <w:color w:val="000000"/>
-          <w:sz w:val="22"/>
+          <w:sz w:val="20"/>
         </w:rPr>
         <w:t>bit u tvom zagrljaju i uživati</w:t>
       </w:r>
@@ -1702,14 +1113,15 @@
     <w:p>
       <w:pPr>
         <w:spacing w:before="0" w:after="0"/>
+        <w:ind w:left="720"/>
       </w:pPr>
       <w:r>
         <w:rPr>
-          <w:rFonts w:ascii="Calibri" w:hAnsi="Calibri"/>
-          <w:b w:val="0"/>
-          <w:i w:val="0"/>
+          <w:rFonts w:ascii="Times New Roman" w:hAnsi="Times New Roman"/>
+          <w:b/>
+          <w:i/>
           <w:color w:val="000000"/>
-          <w:sz w:val="22"/>
+          <w:sz w:val="20"/>
         </w:rPr>
         <w:t>jer ljubav je ta tako neodoljiva</w:t>
       </w:r>
@@ -1717,155 +1129,45 @@
     <w:p>
       <w:pPr>
         <w:spacing w:before="0" w:after="0"/>
+        <w:ind w:left="720"/>
       </w:pPr>
       <w:r>
         <w:rPr>
-          <w:rFonts w:ascii="Calibri" w:hAnsi="Calibri"/>
-          <w:b w:val="0"/>
-          <w:i w:val="0"/>
+          <w:rFonts w:ascii="Times New Roman" w:hAnsi="Times New Roman"/>
+          <w:b/>
+          <w:i/>
           <w:color w:val="000000"/>
-          <w:sz w:val="22"/>
+          <w:sz w:val="20"/>
         </w:rPr>
         <w:t>ja rastapam se u tvom miru.</w:t>
       </w:r>
     </w:p>
     <w:p>
+      <w:pPr>
+        <w:spacing w:before="60" w:after="60"/>
+      </w:pPr>
       <w:r>
-        <w:br w:type="page"/>
+        <w:rPr>
+          <w:rFonts w:ascii="Times New Roman" w:hAnsi="Times New Roman"/>
+          <w:b w:val="0"/>
+          <w:i w:val="0"/>
+          <w:color w:val="000000"/>
+          <w:sz w:val="20"/>
+        </w:rPr>
+        <w:t>____________________________________________________________</w:t>
       </w:r>
     </w:p>
     <w:p>
       <w:pPr>
-        <w:jc w:val="left"/>
-        <w:spacing w:before="0" w:after="60"/>
-        <w:tabs>
-          <w:tab w:val="right" w:pos="9070"/>
-        </w:tabs>
+        <w:spacing w:before="0" w:after="0"/>
       </w:pPr>
       <w:r>
         <w:rPr>
-          <w:rFonts w:ascii="Calibri" w:hAnsi="Calibri"/>
-          <w:b/>
-          <w:color w:val="000000"/>
-          <w:sz w:val="52"/>
-        </w:rPr>
-        <w:t>Dubine</w:t>
-      </w:r>
-    </w:p>
-    <w:p>
-      <w:pPr>
-        <w:spacing w:before="0" w:after="0"/>
-      </w:pPr>
-      <w:r>
-        <w:rPr>
-          <w:rFonts w:ascii="Calibri" w:hAnsi="Calibri"/>
+          <w:rFonts w:ascii="Times New Roman" w:hAnsi="Times New Roman"/>
           <w:b w:val="0"/>
           <w:i w:val="0"/>
           <w:color w:val="000000"/>
-          <w:sz w:val="22"/>
-        </w:rPr>
-        <w:t>Božja Pobjeda</w:t>
-      </w:r>
-    </w:p>
-    <w:p>
-      <w:pPr>
-        <w:spacing w:before="0" w:after="0"/>
-      </w:pPr>
-      <w:r>
-        <w:rPr>
-          <w:rFonts w:ascii="Calibri" w:hAnsi="Calibri"/>
-          <w:b w:val="0"/>
-          <w:i w:val="0"/>
-          <w:color w:val="000000"/>
-          <w:sz w:val="22"/>
-        </w:rPr>
-      </w:r>
-    </w:p>
-    <w:p>
-      <w:pPr>
-        <w:spacing w:before="0" w:after="0"/>
-      </w:pPr>
-      <w:r>
-        <w:rPr>
-          <w:rFonts w:ascii="Calibri" w:hAnsi="Calibri"/>
-          <w:b/>
-          <w:i w:val="0"/>
-          <w:color w:val="000000"/>
-          <w:sz w:val="22"/>
-        </w:rPr>
-        <w:t>Pjesmarica</w:t>
-      </w:r>
-    </w:p>
-    <w:p>
-      <w:pPr>
-        <w:spacing w:before="0" w:after="0"/>
-      </w:pPr>
-      <w:r>
-        <w:rPr>
-          <w:rFonts w:ascii="Calibri" w:hAnsi="Calibri"/>
-          <w:b w:val="0"/>
-          <w:i w:val="0"/>
-          <w:color w:val="000000"/>
-          <w:sz w:val="22"/>
-        </w:rPr>
-        <w:t>309</w:t>
-      </w:r>
-    </w:p>
-    <w:p>
-      <w:pPr>
-        <w:spacing w:before="0" w:after="0"/>
-      </w:pPr>
-      <w:r>
-        <w:rPr>
-          <w:rFonts w:ascii="Calibri" w:hAnsi="Calibri"/>
-          <w:b w:val="0"/>
-          <w:i w:val="0"/>
-          <w:color w:val="000000"/>
-          <w:sz w:val="22"/>
-        </w:rPr>
-        <w:t>1004</w:t>
-      </w:r>
-    </w:p>
-    <w:p>
-      <w:pPr>
-        <w:spacing w:before="0" w:after="0"/>
-      </w:pPr>
-      <w:r>
-        <w:rPr>
-          <w:rFonts w:ascii="Calibri" w:hAnsi="Calibri"/>
-          <w:b w:val="0"/>
-          <w:i w:val="0"/>
-          <w:color w:val="000000"/>
-          <w:sz w:val="22"/>
-        </w:rPr>
-      </w:r>
-    </w:p>
-    <w:p>
-      <w:pPr>
-        <w:spacing w:before="120" w:after="0"/>
-      </w:pPr>
-      <w:r>
-        <w:rPr>
-          <w:rFonts w:ascii="Calibri" w:hAnsi="Calibri"/>
-          <w:b/>
-          <w:i w:val="0"/>
-          <w:color w:val="000000"/>
-          <w:sz w:val="22"/>
-        </w:rPr>
-        <w:t>V1</w:t>
-      </w:r>
-    </w:p>
-    <w:p>
-      <w:pPr>
-        <w:spacing w:before="0" w:after="0"/>
-      </w:pPr>
-      <w:r>
-        <w:rPr>
-          <w:rFonts w:ascii="Calibri" w:hAnsi="Calibri"/>
-          <w:b w:val="0"/>
-          <w:i w:val="0"/>
-          <w:color w:val="000000"/>
-          <w:sz w:val="22"/>
+          <w:sz w:val="20"/>
         </w:rPr>
         <w:t>Znam da zoveš al se bojim hoću li potonuti</w:t>
       </w:r>
@@ -1876,11 +1178,11 @@
       </w:pPr>
       <w:r>
         <w:rPr>
-          <w:rFonts w:ascii="Calibri" w:hAnsi="Calibri"/>
+          <w:rFonts w:ascii="Times New Roman" w:hAnsi="Times New Roman"/>
           <w:b w:val="0"/>
           <w:i w:val="0"/>
           <w:color w:val="000000"/>
-          <w:sz w:val="22"/>
+          <w:sz w:val="20"/>
         </w:rPr>
         <w:t>Ti si tajna kojoj idem u vjeri ja ću hodati</w:t>
       </w:r>
@@ -1891,40 +1193,26 @@
       </w:pPr>
       <w:r>
         <w:rPr>
-          <w:rFonts w:ascii="Calibri" w:hAnsi="Calibri"/>
+          <w:rFonts w:ascii="Times New Roman" w:hAnsi="Times New Roman"/>
           <w:b w:val="0"/>
           <w:i w:val="0"/>
           <w:color w:val="000000"/>
-          <w:sz w:val="22"/>
+          <w:sz w:val="20"/>
         </w:rPr>
       </w:r>
     </w:p>
     <w:p>
       <w:pPr>
-        <w:spacing w:before="120" w:after="0"/>
+        <w:spacing w:before="0" w:after="0"/>
+        <w:ind w:left="720"/>
       </w:pPr>
       <w:r>
         <w:rPr>
-          <w:rFonts w:ascii="Calibri" w:hAnsi="Calibri"/>
+          <w:rFonts w:ascii="Times New Roman" w:hAnsi="Times New Roman"/>
           <w:b/>
-          <w:i w:val="0"/>
+          <w:i/>
           <w:color w:val="000000"/>
-          <w:sz w:val="22"/>
-        </w:rPr>
-        <w:t>Chorus</w:t>
-      </w:r>
-    </w:p>
-    <w:p>
-      <w:pPr>
-        <w:spacing w:before="0" w:after="0"/>
-      </w:pPr>
-      <w:r>
-        <w:rPr>
-          <w:rFonts w:ascii="Calibri" w:hAnsi="Calibri"/>
-          <w:b w:val="0"/>
-          <w:i w:val="0"/>
-          <w:color w:val="000000"/>
-          <w:sz w:val="22"/>
+          <w:sz w:val="20"/>
         </w:rPr>
         <w:t>ime tvoje zazvat ću i gledat gore iznad svih valova</w:t>
       </w:r>
@@ -1932,14 +1220,15 @@
     <w:p>
       <w:pPr>
         <w:spacing w:before="0" w:after="0"/>
+        <w:ind w:left="720"/>
       </w:pPr>
       <w:r>
         <w:rPr>
-          <w:rFonts w:ascii="Calibri" w:hAnsi="Calibri"/>
-          <w:b w:val="0"/>
-          <w:i w:val="0"/>
+          <w:rFonts w:ascii="Times New Roman" w:hAnsi="Times New Roman"/>
+          <w:b/>
+          <w:i/>
           <w:color w:val="000000"/>
-          <w:sz w:val="22"/>
+          <w:sz w:val="20"/>
         </w:rPr>
         <w:t>U Tebi mirna ostat ću Tvoja sam i Ti si moj</w:t>
       </w:r>
@@ -1950,40 +1239,25 @@
       </w:pPr>
       <w:r>
         <w:rPr>
-          <w:rFonts w:ascii="Calibri" w:hAnsi="Calibri"/>
+          <w:rFonts w:ascii="Times New Roman" w:hAnsi="Times New Roman"/>
           <w:b w:val="0"/>
           <w:i w:val="0"/>
           <w:color w:val="000000"/>
-          <w:sz w:val="22"/>
+          <w:sz w:val="20"/>
         </w:rPr>
       </w:r>
     </w:p>
     <w:p>
       <w:pPr>
-        <w:spacing w:before="120" w:after="0"/>
+        <w:spacing w:before="0" w:after="0"/>
       </w:pPr>
       <w:r>
         <w:rPr>
-          <w:rFonts w:ascii="Calibri" w:hAnsi="Calibri"/>
-          <w:b/>
-          <w:i w:val="0"/>
-          <w:color w:val="000000"/>
-          <w:sz w:val="22"/>
-        </w:rPr>
-        <w:t>V2</w:t>
-      </w:r>
-    </w:p>
-    <w:p>
-      <w:pPr>
-        <w:spacing w:before="0" w:after="0"/>
-      </w:pPr>
-      <w:r>
-        <w:rPr>
-          <w:rFonts w:ascii="Calibri" w:hAnsi="Calibri"/>
+          <w:rFonts w:ascii="Times New Roman" w:hAnsi="Times New Roman"/>
           <w:b w:val="0"/>
           <w:i w:val="0"/>
           <w:color w:val="000000"/>
-          <w:sz w:val="22"/>
+          <w:sz w:val="20"/>
         </w:rPr>
         <w:t>Dubine čuva Tvoja milost i moćna ti desnica</w:t>
       </w:r>
@@ -1994,11 +1268,11 @@
       </w:pPr>
       <w:r>
         <w:rPr>
-          <w:rFonts w:ascii="Calibri" w:hAnsi="Calibri"/>
+          <w:rFonts w:ascii="Times New Roman" w:hAnsi="Times New Roman"/>
           <w:b w:val="0"/>
           <w:i w:val="0"/>
           <w:color w:val="000000"/>
-          <w:sz w:val="22"/>
+          <w:sz w:val="20"/>
         </w:rPr>
         <w:t>kad krene strah i dođe slabost Ti ostat ćeš moja pobjeda</w:t>
       </w:r>
@@ -2009,40 +1283,26 @@
       </w:pPr>
       <w:r>
         <w:rPr>
-          <w:rFonts w:ascii="Calibri" w:hAnsi="Calibri"/>
+          <w:rFonts w:ascii="Times New Roman" w:hAnsi="Times New Roman"/>
           <w:b w:val="0"/>
           <w:i w:val="0"/>
           <w:color w:val="000000"/>
-          <w:sz w:val="22"/>
+          <w:sz w:val="20"/>
         </w:rPr>
       </w:r>
     </w:p>
     <w:p>
       <w:pPr>
-        <w:spacing w:before="120" w:after="0"/>
+        <w:spacing w:before="0" w:after="0"/>
+        <w:ind w:left="720"/>
       </w:pPr>
       <w:r>
         <w:rPr>
-          <w:rFonts w:ascii="Calibri" w:hAnsi="Calibri"/>
+          <w:rFonts w:ascii="Times New Roman" w:hAnsi="Times New Roman"/>
           <w:b/>
-          <w:i w:val="0"/>
+          <w:i/>
           <w:color w:val="000000"/>
-          <w:sz w:val="22"/>
-        </w:rPr>
-        <w:t>Bridge</w:t>
-      </w:r>
-    </w:p>
-    <w:p>
-      <w:pPr>
-        <w:spacing w:before="0" w:after="0"/>
-      </w:pPr>
-      <w:r>
-        <w:rPr>
-          <w:rFonts w:ascii="Calibri" w:hAnsi="Calibri"/>
-          <w:b w:val="0"/>
-          <w:i w:val="0"/>
-          <w:color w:val="000000"/>
-          <w:sz w:val="22"/>
+          <w:sz w:val="20"/>
         </w:rPr>
         <w:t>Duše sveti napoj srce povjerenjem gdje god zoveš daj</w:t>
       </w:r>
@@ -2050,140 +1310,45 @@
     <w:p>
       <w:pPr>
         <w:spacing w:before="0" w:after="0"/>
+        <w:ind w:left="720"/>
       </w:pPr>
       <w:r>
         <w:rPr>
-          <w:rFonts w:ascii="Calibri" w:hAnsi="Calibri"/>
-          <w:b w:val="0"/>
-          <w:i w:val="0"/>
+          <w:rFonts w:ascii="Times New Roman" w:hAnsi="Times New Roman"/>
+          <w:b/>
+          <w:i/>
           <w:color w:val="000000"/>
-          <w:sz w:val="22"/>
+          <w:sz w:val="20"/>
         </w:rPr>
         <w:t>Ti me vodi gdje su najveće dubine Diži vjeru u visine Znam</w:t>
       </w:r>
     </w:p>
     <w:p>
+      <w:pPr>
+        <w:spacing w:before="60" w:after="60"/>
+      </w:pPr>
       <w:r>
-        <w:br w:type="page"/>
+        <w:rPr>
+          <w:rFonts w:ascii="Times New Roman" w:hAnsi="Times New Roman"/>
+          <w:b w:val="0"/>
+          <w:i w:val="0"/>
+          <w:color w:val="000000"/>
+          <w:sz w:val="20"/>
+        </w:rPr>
+        <w:t>____________________________________________________________</w:t>
       </w:r>
     </w:p>
     <w:p>
       <w:pPr>
-        <w:jc w:val="left"/>
-        <w:spacing w:before="0" w:after="60"/>
-        <w:tabs>
-          <w:tab w:val="right" w:pos="9070"/>
-        </w:tabs>
+        <w:spacing w:before="0" w:after="0"/>
       </w:pPr>
       <w:r>
         <w:rPr>
-          <w:rFonts w:ascii="Calibri" w:hAnsi="Calibri"/>
-          <w:b/>
-          <w:color w:val="000000"/>
-          <w:sz w:val="52"/>
-        </w:rPr>
-        <w:t>Ime Ti Je Sveti Bog</w:t>
-      </w:r>
-    </w:p>
-    <w:p>
-      <w:pPr>
-        <w:spacing w:before="0" w:after="0"/>
-      </w:pPr>
-      <w:r>
-        <w:rPr>
-          <w:rFonts w:ascii="Calibri" w:hAnsi="Calibri"/>
+          <w:rFonts w:ascii="Times New Roman" w:hAnsi="Times New Roman"/>
           <w:b w:val="0"/>
           <w:i w:val="0"/>
           <w:color w:val="000000"/>
-          <w:sz w:val="22"/>
-        </w:rPr>
-        <w:t>Božja Pobjeda</w:t>
-      </w:r>
-    </w:p>
-    <w:p>
-      <w:pPr>
-        <w:spacing w:before="0" w:after="0"/>
-      </w:pPr>
-      <w:r>
-        <w:rPr>
-          <w:rFonts w:ascii="Calibri" w:hAnsi="Calibri"/>
-          <w:b w:val="0"/>
-          <w:i w:val="0"/>
-          <w:color w:val="000000"/>
-          <w:sz w:val="22"/>
-        </w:rPr>
-      </w:r>
-    </w:p>
-    <w:p>
-      <w:pPr>
-        <w:spacing w:before="0" w:after="0"/>
-      </w:pPr>
-      <w:r>
-        <w:rPr>
-          <w:rFonts w:ascii="Calibri" w:hAnsi="Calibri"/>
-          <w:b/>
-          <w:i w:val="0"/>
-          <w:color w:val="000000"/>
-          <w:sz w:val="22"/>
-        </w:rPr>
-        <w:t>Pjesmarica</w:t>
-      </w:r>
-    </w:p>
-    <w:p>
-      <w:pPr>
-        <w:spacing w:before="0" w:after="0"/>
-      </w:pPr>
-      <w:r>
-        <w:rPr>
-          <w:rFonts w:ascii="Calibri" w:hAnsi="Calibri"/>
-          <w:b w:val="0"/>
-          <w:i w:val="0"/>
-          <w:color w:val="000000"/>
-          <w:sz w:val="22"/>
-        </w:rPr>
-        <w:t>1009</w:t>
-      </w:r>
-    </w:p>
-    <w:p>
-      <w:pPr>
-        <w:spacing w:before="0" w:after="0"/>
-      </w:pPr>
-      <w:r>
-        <w:rPr>
-          <w:rFonts w:ascii="Calibri" w:hAnsi="Calibri"/>
-          <w:b w:val="0"/>
-          <w:i w:val="0"/>
-          <w:color w:val="000000"/>
-          <w:sz w:val="22"/>
-        </w:rPr>
-      </w:r>
-    </w:p>
-    <w:p>
-      <w:pPr>
-        <w:spacing w:before="120" w:after="0"/>
-      </w:pPr>
-      <w:r>
-        <w:rPr>
-          <w:rFonts w:ascii="Calibri" w:hAnsi="Calibri"/>
-          <w:b/>
-          <w:i w:val="0"/>
-          <w:color w:val="000000"/>
-          <w:sz w:val="22"/>
-        </w:rPr>
-        <w:t>Verse</w:t>
-      </w:r>
-    </w:p>
-    <w:p>
-      <w:pPr>
-        <w:spacing w:before="0" w:after="0"/>
-      </w:pPr>
-      <w:r>
-        <w:rPr>
-          <w:rFonts w:ascii="Calibri" w:hAnsi="Calibri"/>
-          <w:b w:val="0"/>
-          <w:i w:val="0"/>
-          <w:color w:val="000000"/>
-          <w:sz w:val="22"/>
+          <w:sz w:val="20"/>
         </w:rPr>
         <w:t>fis</w:t>
       </w:r>
@@ -2194,11 +1359,11 @@
       </w:pPr>
       <w:r>
         <w:rPr>
-          <w:rFonts w:ascii="Calibri" w:hAnsi="Calibri"/>
+          <w:rFonts w:ascii="Times New Roman" w:hAnsi="Times New Roman"/>
           <w:b w:val="0"/>
           <w:i w:val="0"/>
           <w:color w:val="000000"/>
-          <w:sz w:val="22"/>
+          <w:sz w:val="20"/>
         </w:rPr>
         <w:t>Ja dolazim pred Tvoje lice</w:t>
       </w:r>
@@ -2209,11 +1374,11 @@
       </w:pPr>
       <w:r>
         <w:rPr>
-          <w:rFonts w:ascii="Calibri" w:hAnsi="Calibri"/>
+          <w:rFonts w:ascii="Times New Roman" w:hAnsi="Times New Roman"/>
           <w:b w:val="0"/>
           <w:i w:val="0"/>
           <w:color w:val="000000"/>
-          <w:sz w:val="22"/>
+          <w:sz w:val="20"/>
         </w:rPr>
         <w:t>Jer žrtva čista predana je</w:t>
       </w:r>
@@ -2224,11 +1389,11 @@
       </w:pPr>
       <w:r>
         <w:rPr>
-          <w:rFonts w:ascii="Calibri" w:hAnsi="Calibri"/>
+          <w:rFonts w:ascii="Times New Roman" w:hAnsi="Times New Roman"/>
           <w:b w:val="0"/>
           <w:i w:val="0"/>
           <w:color w:val="000000"/>
-          <w:sz w:val="22"/>
+          <w:sz w:val="20"/>
         </w:rPr>
         <w:t>Ja ulazim da uvijek slavim</w:t>
       </w:r>
@@ -2239,11 +1404,11 @@
       </w:pPr>
       <w:r>
         <w:rPr>
-          <w:rFonts w:ascii="Calibri" w:hAnsi="Calibri"/>
+          <w:rFonts w:ascii="Times New Roman" w:hAnsi="Times New Roman"/>
           <w:b w:val="0"/>
           <w:i w:val="0"/>
           <w:color w:val="000000"/>
-          <w:sz w:val="22"/>
+          <w:sz w:val="20"/>
         </w:rPr>
         <w:t>To Presveto Ime Jahve</w:t>
       </w:r>
@@ -2254,40 +1419,25 @@
       </w:pPr>
       <w:r>
         <w:rPr>
-          <w:rFonts w:ascii="Calibri" w:hAnsi="Calibri"/>
+          <w:rFonts w:ascii="Times New Roman" w:hAnsi="Times New Roman"/>
           <w:b w:val="0"/>
           <w:i w:val="0"/>
           <w:color w:val="000000"/>
-          <w:sz w:val="22"/>
+          <w:sz w:val="20"/>
         </w:rPr>
       </w:r>
     </w:p>
     <w:p>
       <w:pPr>
-        <w:spacing w:before="120" w:after="0"/>
+        <w:spacing w:before="0" w:after="0"/>
       </w:pPr>
       <w:r>
         <w:rPr>
-          <w:rFonts w:ascii="Calibri" w:hAnsi="Calibri"/>
-          <w:b/>
-          <w:i w:val="0"/>
-          <w:color w:val="000000"/>
-          <w:sz w:val="22"/>
-        </w:rPr>
-        <w:t>Verse</w:t>
-      </w:r>
-    </w:p>
-    <w:p>
-      <w:pPr>
-        <w:spacing w:before="0" w:after="0"/>
-      </w:pPr>
-      <w:r>
-        <w:rPr>
-          <w:rFonts w:ascii="Calibri" w:hAnsi="Calibri"/>
+          <w:rFonts w:ascii="Times New Roman" w:hAnsi="Times New Roman"/>
           <w:b w:val="0"/>
           <w:i w:val="0"/>
           <w:color w:val="000000"/>
-          <w:sz w:val="22"/>
+          <w:sz w:val="20"/>
         </w:rPr>
         <w:t>Bože slavim Te</w:t>
       </w:r>
@@ -2298,11 +1448,11 @@
       </w:pPr>
       <w:r>
         <w:rPr>
-          <w:rFonts w:ascii="Calibri" w:hAnsi="Calibri"/>
+          <w:rFonts w:ascii="Times New Roman" w:hAnsi="Times New Roman"/>
           <w:b w:val="0"/>
           <w:i w:val="0"/>
           <w:color w:val="000000"/>
-          <w:sz w:val="22"/>
+          <w:sz w:val="20"/>
         </w:rPr>
         <w:t>Obožavam Te</w:t>
       </w:r>
@@ -2313,40 +1463,26 @@
       </w:pPr>
       <w:r>
         <w:rPr>
-          <w:rFonts w:ascii="Calibri" w:hAnsi="Calibri"/>
+          <w:rFonts w:ascii="Times New Roman" w:hAnsi="Times New Roman"/>
           <w:b w:val="0"/>
           <w:i w:val="0"/>
           <w:color w:val="000000"/>
-          <w:sz w:val="22"/>
+          <w:sz w:val="20"/>
         </w:rPr>
       </w:r>
     </w:p>
     <w:p>
       <w:pPr>
-        <w:spacing w:before="120" w:after="0"/>
+        <w:spacing w:before="0" w:after="0"/>
+        <w:ind w:left="720"/>
       </w:pPr>
       <w:r>
         <w:rPr>
-          <w:rFonts w:ascii="Calibri" w:hAnsi="Calibri"/>
+          <w:rFonts w:ascii="Times New Roman" w:hAnsi="Times New Roman"/>
           <w:b/>
-          <w:i w:val="0"/>
+          <w:i/>
           <w:color w:val="000000"/>
-          <w:sz w:val="22"/>
-        </w:rPr>
-        <w:t>Chorus</w:t>
-      </w:r>
-    </w:p>
-    <w:p>
-      <w:pPr>
-        <w:spacing w:before="0" w:after="0"/>
-      </w:pPr>
-      <w:r>
-        <w:rPr>
-          <w:rFonts w:ascii="Calibri" w:hAnsi="Calibri"/>
-          <w:b w:val="0"/>
-          <w:i w:val="0"/>
-          <w:color w:val="000000"/>
-          <w:sz w:val="22"/>
+          <w:sz w:val="20"/>
         </w:rPr>
         <w:t>Ime ti je Sveti</w:t>
       </w:r>
@@ -2354,125 +1490,45 @@
     <w:p>
       <w:pPr>
         <w:spacing w:before="0" w:after="0"/>
+        <w:ind w:left="720"/>
       </w:pPr>
       <w:r>
         <w:rPr>
-          <w:rFonts w:ascii="Calibri" w:hAnsi="Calibri"/>
-          <w:b w:val="0"/>
-          <w:i w:val="0"/>
+          <w:rFonts w:ascii="Times New Roman" w:hAnsi="Times New Roman"/>
+          <w:b/>
+          <w:i/>
           <w:color w:val="000000"/>
-          <w:sz w:val="22"/>
+          <w:sz w:val="20"/>
         </w:rPr>
         <w:t>Sveti Bog</w:t>
       </w:r>
     </w:p>
     <w:p>
+      <w:pPr>
+        <w:spacing w:before="60" w:after="60"/>
+      </w:pPr>
       <w:r>
-        <w:br w:type="page"/>
+        <w:rPr>
+          <w:rFonts w:ascii="Times New Roman" w:hAnsi="Times New Roman"/>
+          <w:b w:val="0"/>
+          <w:i w:val="0"/>
+          <w:color w:val="000000"/>
+          <w:sz w:val="20"/>
+        </w:rPr>
+        <w:t>____________________________________________________________</w:t>
       </w:r>
     </w:p>
     <w:p>
       <w:pPr>
-        <w:jc w:val="left"/>
-        <w:spacing w:before="0" w:after="60"/>
-        <w:tabs>
-          <w:tab w:val="right" w:pos="9070"/>
-        </w:tabs>
+        <w:spacing w:before="0" w:after="0"/>
       </w:pPr>
       <w:r>
         <w:rPr>
-          <w:rFonts w:ascii="Calibri" w:hAnsi="Calibri"/>
-          <w:b/>
-          <w:color w:val="000000"/>
-          <w:sz w:val="52"/>
-        </w:rPr>
-        <w:t>Kao ruža</w:t>
-      </w:r>
-    </w:p>
-    <w:p>
-      <w:pPr>
-        <w:spacing w:before="0" w:after="0"/>
-      </w:pPr>
-      <w:r>
-        <w:rPr>
-          <w:rFonts w:ascii="Calibri" w:hAnsi="Calibri"/>
+          <w:rFonts w:ascii="Times New Roman" w:hAnsi="Times New Roman"/>
           <w:b w:val="0"/>
           <w:i w:val="0"/>
           <w:color w:val="000000"/>
-          <w:sz w:val="22"/>
-        </w:rPr>
-      </w:r>
-    </w:p>
-    <w:p>
-      <w:pPr>
-        <w:spacing w:before="0" w:after="0"/>
-      </w:pPr>
-      <w:r>
-        <w:rPr>
-          <w:rFonts w:ascii="Calibri" w:hAnsi="Calibri"/>
-          <w:b/>
-          <w:i w:val="0"/>
-          <w:color w:val="000000"/>
-          <w:sz w:val="22"/>
-        </w:rPr>
-        <w:t>Pjesmarica</w:t>
-      </w:r>
-    </w:p>
-    <w:p>
-      <w:pPr>
-        <w:spacing w:before="0" w:after="0"/>
-      </w:pPr>
-      <w:r>
-        <w:rPr>
-          <w:rFonts w:ascii="Calibri" w:hAnsi="Calibri"/>
-          <w:b w:val="0"/>
-          <w:i w:val="0"/>
-          <w:color w:val="000000"/>
-          <w:sz w:val="22"/>
-        </w:rPr>
-        <w:t>111</w:t>
-      </w:r>
-    </w:p>
-    <w:p>
-      <w:pPr>
-        <w:spacing w:before="0" w:after="0"/>
-      </w:pPr>
-      <w:r>
-        <w:rPr>
-          <w:rFonts w:ascii="Calibri" w:hAnsi="Calibri"/>
-          <w:b w:val="0"/>
-          <w:i w:val="0"/>
-          <w:color w:val="000000"/>
-          <w:sz w:val="22"/>
-        </w:rPr>
-      </w:r>
-    </w:p>
-    <w:p>
-      <w:pPr>
-        <w:spacing w:before="120" w:after="0"/>
-      </w:pPr>
-      <w:r>
-        <w:rPr>
-          <w:rFonts w:ascii="Calibri" w:hAnsi="Calibri"/>
-          <w:b/>
-          <w:i w:val="0"/>
-          <w:color w:val="000000"/>
-          <w:sz w:val="22"/>
-        </w:rPr>
-        <w:t>Verse</w:t>
-      </w:r>
-    </w:p>
-    <w:p>
-      <w:pPr>
-        <w:spacing w:before="0" w:after="0"/>
-      </w:pPr>
-      <w:r>
-        <w:rPr>
-          <w:rFonts w:ascii="Calibri" w:hAnsi="Calibri"/>
-          <w:b w:val="0"/>
-          <w:i w:val="0"/>
-          <w:color w:val="000000"/>
-          <w:sz w:val="22"/>
+          <w:sz w:val="20"/>
         </w:rPr>
         <w:t>Iznad svih sila i kraljeva Iznad sve prirode i svega stvorenog</w:t>
       </w:r>
@@ -2483,11 +1539,11 @@
       </w:pPr>
       <w:r>
         <w:rPr>
-          <w:rFonts w:ascii="Calibri" w:hAnsi="Calibri"/>
+          <w:rFonts w:ascii="Times New Roman" w:hAnsi="Times New Roman"/>
           <w:b w:val="0"/>
           <w:i w:val="0"/>
           <w:color w:val="000000"/>
-          <w:sz w:val="22"/>
+          <w:sz w:val="20"/>
         </w:rPr>
         <w:t>Iznad sve mudrosti i ljudskih putova</w:t>
       </w:r>
@@ -2498,11 +1554,11 @@
       </w:pPr>
       <w:r>
         <w:rPr>
-          <w:rFonts w:ascii="Calibri" w:hAnsi="Calibri"/>
+          <w:rFonts w:ascii="Times New Roman" w:hAnsi="Times New Roman"/>
           <w:b w:val="0"/>
           <w:i w:val="0"/>
           <w:color w:val="000000"/>
-          <w:sz w:val="22"/>
+          <w:sz w:val="20"/>
         </w:rPr>
         <w:t>Ti si bio prije stvaranja</w:t>
       </w:r>
@@ -2513,11 +1569,11 @@
       </w:pPr>
       <w:r>
         <w:rPr>
-          <w:rFonts w:ascii="Calibri" w:hAnsi="Calibri"/>
+          <w:rFonts w:ascii="Times New Roman" w:hAnsi="Times New Roman"/>
           <w:b w:val="0"/>
           <w:i w:val="0"/>
           <w:color w:val="000000"/>
-          <w:sz w:val="22"/>
+          <w:sz w:val="20"/>
         </w:rPr>
         <w:t>Iznad svih kraljevstva i prijestolja</w:t>
       </w:r>
@@ -2528,11 +1584,11 @@
       </w:pPr>
       <w:r>
         <w:rPr>
-          <w:rFonts w:ascii="Calibri" w:hAnsi="Calibri"/>
+          <w:rFonts w:ascii="Times New Roman" w:hAnsi="Times New Roman"/>
           <w:b w:val="0"/>
           <w:i w:val="0"/>
           <w:color w:val="000000"/>
-          <w:sz w:val="22"/>
+          <w:sz w:val="20"/>
         </w:rPr>
         <w:t>Iznad svih čuda što svijet ih poznaje</w:t>
       </w:r>
@@ -2543,11 +1599,11 @@
       </w:pPr>
       <w:r>
         <w:rPr>
-          <w:rFonts w:ascii="Calibri" w:hAnsi="Calibri"/>
+          <w:rFonts w:ascii="Times New Roman" w:hAnsi="Times New Roman"/>
           <w:b w:val="0"/>
           <w:i w:val="0"/>
           <w:color w:val="000000"/>
-          <w:sz w:val="22"/>
+          <w:sz w:val="20"/>
         </w:rPr>
         <w:t>Iznad sveg obilja bogatstva zemaljskog</w:t>
       </w:r>
@@ -2558,11 +1614,11 @@
       </w:pPr>
       <w:r>
         <w:rPr>
-          <w:rFonts w:ascii="Calibri" w:hAnsi="Calibri"/>
+          <w:rFonts w:ascii="Times New Roman" w:hAnsi="Times New Roman"/>
           <w:b w:val="0"/>
           <w:i w:val="0"/>
           <w:color w:val="000000"/>
-          <w:sz w:val="22"/>
+          <w:sz w:val="20"/>
         </w:rPr>
         <w:t>Vrijednost tvoja neizmjerna je</w:t>
       </w:r>
@@ -2573,40 +1629,26 @@
       </w:pPr>
       <w:r>
         <w:rPr>
-          <w:rFonts w:ascii="Calibri" w:hAnsi="Calibri"/>
+          <w:rFonts w:ascii="Times New Roman" w:hAnsi="Times New Roman"/>
           <w:b w:val="0"/>
           <w:i w:val="0"/>
           <w:color w:val="000000"/>
-          <w:sz w:val="22"/>
+          <w:sz w:val="20"/>
         </w:rPr>
       </w:r>
     </w:p>
     <w:p>
       <w:pPr>
-        <w:spacing w:before="120" w:after="0"/>
+        <w:spacing w:before="0" w:after="0"/>
+        <w:ind w:left="720"/>
       </w:pPr>
       <w:r>
         <w:rPr>
-          <w:rFonts w:ascii="Calibri" w:hAnsi="Calibri"/>
+          <w:rFonts w:ascii="Times New Roman" w:hAnsi="Times New Roman"/>
           <w:b/>
-          <w:i w:val="0"/>
+          <w:i/>
           <w:color w:val="000000"/>
-          <w:sz w:val="22"/>
-        </w:rPr>
-        <w:t>Chorus</w:t>
-      </w:r>
-    </w:p>
-    <w:p>
-      <w:pPr>
-        <w:spacing w:before="0" w:after="0"/>
-      </w:pPr>
-      <w:r>
-        <w:rPr>
-          <w:rFonts w:ascii="Calibri" w:hAnsi="Calibri"/>
-          <w:b w:val="0"/>
-          <w:i w:val="0"/>
-          <w:color w:val="000000"/>
-          <w:sz w:val="22"/>
+          <w:sz w:val="20"/>
         </w:rPr>
         <w:t>Razapet u grob položen</w:t>
       </w:r>
@@ -2614,14 +1656,15 @@
     <w:p>
       <w:pPr>
         <w:spacing w:before="0" w:after="0"/>
+        <w:ind w:left="720"/>
       </w:pPr>
       <w:r>
         <w:rPr>
-          <w:rFonts w:ascii="Calibri" w:hAnsi="Calibri"/>
-          <w:b w:val="0"/>
-          <w:i w:val="0"/>
+          <w:rFonts w:ascii="Times New Roman" w:hAnsi="Times New Roman"/>
+          <w:b/>
+          <w:i/>
           <w:color w:val="000000"/>
-          <w:sz w:val="22"/>
+          <w:sz w:val="20"/>
         </w:rPr>
         <w:t>Živio da budeš odbačen Kao ruža zgažena na tlu</w:t>
       </w:r>
@@ -2629,14 +1672,15 @@
     <w:p>
       <w:pPr>
         <w:spacing w:before="0" w:after="0"/>
+        <w:ind w:left="720"/>
       </w:pPr>
       <w:r>
         <w:rPr>
-          <w:rFonts w:ascii="Calibri" w:hAnsi="Calibri"/>
-          <w:b w:val="0"/>
-          <w:i w:val="0"/>
+          <w:rFonts w:ascii="Times New Roman" w:hAnsi="Times New Roman"/>
+          <w:b/>
+          <w:i/>
           <w:color w:val="000000"/>
-          <w:sz w:val="22"/>
+          <w:sz w:val="20"/>
         </w:rPr>
         <w:t>Grijeh uzeo misleći na mene</w:t>
       </w:r>
@@ -2644,125 +1688,45 @@
     <w:p>
       <w:pPr>
         <w:spacing w:before="0" w:after="0"/>
+        <w:ind w:left="720"/>
       </w:pPr>
       <w:r>
         <w:rPr>
-          <w:rFonts w:ascii="Calibri" w:hAnsi="Calibri"/>
-          <w:b w:val="0"/>
-          <w:i w:val="0"/>
+          <w:rFonts w:ascii="Times New Roman" w:hAnsi="Times New Roman"/>
+          <w:b/>
+          <w:i/>
           <w:color w:val="000000"/>
-          <w:sz w:val="22"/>
+          <w:sz w:val="20"/>
         </w:rPr>
         <w:t>solo</w:t>
       </w:r>
     </w:p>
     <w:p>
+      <w:pPr>
+        <w:spacing w:before="60" w:after="60"/>
+      </w:pPr>
       <w:r>
-        <w:br w:type="page"/>
+        <w:rPr>
+          <w:rFonts w:ascii="Times New Roman" w:hAnsi="Times New Roman"/>
+          <w:b w:val="0"/>
+          <w:i w:val="0"/>
+          <w:color w:val="000000"/>
+          <w:sz w:val="20"/>
+        </w:rPr>
+        <w:t>____________________________________________________________</w:t>
       </w:r>
     </w:p>
     <w:p>
       <w:pPr>
-        <w:jc w:val="left"/>
-        <w:spacing w:before="0" w:after="60"/>
-        <w:tabs>
-          <w:tab w:val="right" w:pos="9070"/>
-        </w:tabs>
+        <w:spacing w:before="0" w:after="0"/>
       </w:pPr>
       <w:r>
         <w:rPr>
-          <w:rFonts w:ascii="Calibri" w:hAnsi="Calibri"/>
-          <w:b/>
-          <w:color w:val="000000"/>
-          <w:sz w:val="52"/>
-        </w:rPr>
-        <w:t>Naš Bog je velik</w:t>
-      </w:r>
-    </w:p>
-    <w:p>
-      <w:pPr>
-        <w:spacing w:before="0" w:after="0"/>
-      </w:pPr>
-      <w:r>
-        <w:rPr>
-          <w:rFonts w:ascii="Calibri" w:hAnsi="Calibri"/>
+          <w:rFonts w:ascii="Times New Roman" w:hAnsi="Times New Roman"/>
           <w:b w:val="0"/>
           <w:i w:val="0"/>
           <w:color w:val="000000"/>
-          <w:sz w:val="22"/>
-        </w:rPr>
-      </w:r>
-    </w:p>
-    <w:p>
-      <w:pPr>
-        <w:spacing w:before="0" w:after="0"/>
-      </w:pPr>
-      <w:r>
-        <w:rPr>
-          <w:rFonts w:ascii="Calibri" w:hAnsi="Calibri"/>
-          <w:b/>
-          <w:i w:val="0"/>
-          <w:color w:val="000000"/>
-          <w:sz w:val="22"/>
-        </w:rPr>
-        <w:t>Pjesmarica</w:t>
-      </w:r>
-    </w:p>
-    <w:p>
-      <w:pPr>
-        <w:spacing w:before="0" w:after="0"/>
-      </w:pPr>
-      <w:r>
-        <w:rPr>
-          <w:rFonts w:ascii="Calibri" w:hAnsi="Calibri"/>
-          <w:b w:val="0"/>
-          <w:i w:val="0"/>
-          <w:color w:val="000000"/>
-          <w:sz w:val="22"/>
-        </w:rPr>
-        <w:t>324</w:t>
-      </w:r>
-    </w:p>
-    <w:p>
-      <w:pPr>
-        <w:spacing w:before="0" w:after="0"/>
-      </w:pPr>
-      <w:r>
-        <w:rPr>
-          <w:rFonts w:ascii="Calibri" w:hAnsi="Calibri"/>
-          <w:b w:val="0"/>
-          <w:i w:val="0"/>
-          <w:color w:val="000000"/>
-          <w:sz w:val="22"/>
-        </w:rPr>
-      </w:r>
-    </w:p>
-    <w:p>
-      <w:pPr>
-        <w:spacing w:before="120" w:after="0"/>
-      </w:pPr>
-      <w:r>
-        <w:rPr>
-          <w:rFonts w:ascii="Calibri" w:hAnsi="Calibri"/>
-          <w:b/>
-          <w:i w:val="0"/>
-          <w:color w:val="000000"/>
-          <w:sz w:val="22"/>
-        </w:rPr>
-        <w:t>Verse</w:t>
-      </w:r>
-    </w:p>
-    <w:p>
-      <w:pPr>
-        <w:spacing w:before="0" w:after="0"/>
-      </w:pPr>
-      <w:r>
-        <w:rPr>
-          <w:rFonts w:ascii="Calibri" w:hAnsi="Calibri"/>
-          <w:b w:val="0"/>
-          <w:i w:val="0"/>
-          <w:color w:val="000000"/>
-          <w:sz w:val="22"/>
+          <w:sz w:val="20"/>
         </w:rPr>
         <w:t>ljepota kralja mog veličanstvenog</w:t>
       </w:r>
@@ -2773,11 +1737,11 @@
       </w:pPr>
       <w:r>
         <w:rPr>
-          <w:rFonts w:ascii="Calibri" w:hAnsi="Calibri"/>
+          <w:rFonts w:ascii="Times New Roman" w:hAnsi="Times New Roman"/>
           <w:b w:val="0"/>
           <w:i w:val="0"/>
           <w:color w:val="000000"/>
-          <w:sz w:val="22"/>
+          <w:sz w:val="20"/>
         </w:rPr>
         <w:t>zemlju raduje zemlju raduje</w:t>
       </w:r>
@@ -2788,11 +1752,11 @@
       </w:pPr>
       <w:r>
         <w:rPr>
-          <w:rFonts w:ascii="Calibri" w:hAnsi="Calibri"/>
+          <w:rFonts w:ascii="Times New Roman" w:hAnsi="Times New Roman"/>
           <w:b w:val="0"/>
           <w:i w:val="0"/>
           <w:color w:val="000000"/>
-          <w:sz w:val="22"/>
+          <w:sz w:val="20"/>
         </w:rPr>
         <w:t>u sjaj zaodjeven tama uzmiče</w:t>
       </w:r>
@@ -2803,11 +1767,11 @@
       </w:pPr>
       <w:r>
         <w:rPr>
-          <w:rFonts w:ascii="Calibri" w:hAnsi="Calibri"/>
+          <w:rFonts w:ascii="Times New Roman" w:hAnsi="Times New Roman"/>
           <w:b w:val="0"/>
           <w:i w:val="0"/>
           <w:color w:val="000000"/>
-          <w:sz w:val="22"/>
+          <w:sz w:val="20"/>
         </w:rPr>
         <w:t>od glasa njegovog drhti svako zlo</w:t>
       </w:r>
@@ -2818,40 +1782,26 @@
       </w:pPr>
       <w:r>
         <w:rPr>
-          <w:rFonts w:ascii="Calibri" w:hAnsi="Calibri"/>
+          <w:rFonts w:ascii="Times New Roman" w:hAnsi="Times New Roman"/>
           <w:b w:val="0"/>
           <w:i w:val="0"/>
           <w:color w:val="000000"/>
-          <w:sz w:val="22"/>
+          <w:sz w:val="20"/>
         </w:rPr>
       </w:r>
     </w:p>
     <w:p>
       <w:pPr>
-        <w:spacing w:before="120" w:after="0"/>
+        <w:spacing w:before="0" w:after="0"/>
+        <w:ind w:left="720"/>
       </w:pPr>
       <w:r>
         <w:rPr>
-          <w:rFonts w:ascii="Calibri" w:hAnsi="Calibri"/>
+          <w:rFonts w:ascii="Times New Roman" w:hAnsi="Times New Roman"/>
           <w:b/>
-          <w:i w:val="0"/>
+          <w:i/>
           <w:color w:val="000000"/>
-          <w:sz w:val="22"/>
-        </w:rPr>
-        <w:t>Chorus</w:t>
-      </w:r>
-    </w:p>
-    <w:p>
-      <w:pPr>
-        <w:spacing w:before="0" w:after="0"/>
-      </w:pPr>
-      <w:r>
-        <w:rPr>
-          <w:rFonts w:ascii="Calibri" w:hAnsi="Calibri"/>
-          <w:b w:val="0"/>
-          <w:i w:val="0"/>
-          <w:color w:val="000000"/>
-          <w:sz w:val="22"/>
+          <w:sz w:val="20"/>
         </w:rPr>
         <w:t>nas Bog je velik pjevaj s nama</w:t>
       </w:r>
@@ -2859,14 +1809,15 @@
     <w:p>
       <w:pPr>
         <w:spacing w:before="0" w:after="0"/>
+        <w:ind w:left="720"/>
       </w:pPr>
       <w:r>
         <w:rPr>
-          <w:rFonts w:ascii="Calibri" w:hAnsi="Calibri"/>
-          <w:b w:val="0"/>
-          <w:i w:val="0"/>
+          <w:rFonts w:ascii="Times New Roman" w:hAnsi="Times New Roman"/>
+          <w:b/>
+          <w:i/>
           <w:color w:val="000000"/>
-          <w:sz w:val="22"/>
+          <w:sz w:val="20"/>
         </w:rPr>
         <w:t>Bog je velik i svi će vidjeti</w:t>
       </w:r>
@@ -2874,14 +1825,15 @@
     <w:p>
       <w:pPr>
         <w:spacing w:before="0" w:after="0"/>
+        <w:ind w:left="720"/>
       </w:pPr>
       <w:r>
         <w:rPr>
-          <w:rFonts w:ascii="Calibri" w:hAnsi="Calibri"/>
-          <w:b w:val="0"/>
-          <w:i w:val="0"/>
+          <w:rFonts w:ascii="Times New Roman" w:hAnsi="Times New Roman"/>
+          <w:b/>
+          <w:i/>
           <w:color w:val="000000"/>
-          <w:sz w:val="22"/>
+          <w:sz w:val="20"/>
         </w:rPr>
         <w:t>naš Bog je velik</w:t>
       </w:r>
@@ -2892,40 +1844,25 @@
       </w:pPr>
       <w:r>
         <w:rPr>
-          <w:rFonts w:ascii="Calibri" w:hAnsi="Calibri"/>
+          <w:rFonts w:ascii="Times New Roman" w:hAnsi="Times New Roman"/>
           <w:b w:val="0"/>
           <w:i w:val="0"/>
           <w:color w:val="000000"/>
-          <w:sz w:val="22"/>
+          <w:sz w:val="20"/>
         </w:rPr>
       </w:r>
     </w:p>
     <w:p>
       <w:pPr>
-        <w:spacing w:before="120" w:after="0"/>
+        <w:spacing w:before="0" w:after="0"/>
       </w:pPr>
       <w:r>
         <w:rPr>
-          <w:rFonts w:ascii="Calibri" w:hAnsi="Calibri"/>
-          <w:b/>
-          <w:i w:val="0"/>
-          <w:color w:val="000000"/>
-          <w:sz w:val="22"/>
-        </w:rPr>
-        <w:t>Verse</w:t>
-      </w:r>
-    </w:p>
-    <w:p>
-      <w:pPr>
-        <w:spacing w:before="0" w:after="0"/>
-      </w:pPr>
-      <w:r>
-        <w:rPr>
-          <w:rFonts w:ascii="Calibri" w:hAnsi="Calibri"/>
+          <w:rFonts w:ascii="Times New Roman" w:hAnsi="Times New Roman"/>
           <w:b w:val="0"/>
           <w:i w:val="0"/>
           <w:color w:val="000000"/>
-          <w:sz w:val="22"/>
+          <w:sz w:val="20"/>
         </w:rPr>
         <w:t>vječno vlada on u ruci drži sve</w:t>
       </w:r>
@@ -2936,11 +1873,11 @@
       </w:pPr>
       <w:r>
         <w:rPr>
-          <w:rFonts w:ascii="Calibri" w:hAnsi="Calibri"/>
+          <w:rFonts w:ascii="Times New Roman" w:hAnsi="Times New Roman"/>
           <w:b w:val="0"/>
           <w:i w:val="0"/>
           <w:color w:val="000000"/>
-          <w:sz w:val="22"/>
+          <w:sz w:val="20"/>
         </w:rPr>
         <w:t>početak je i kraj početak je i kraj</w:t>
       </w:r>
@@ -2951,11 +1888,11 @@
       </w:pPr>
       <w:r>
         <w:rPr>
-          <w:rFonts w:ascii="Calibri" w:hAnsi="Calibri"/>
+          <w:rFonts w:ascii="Times New Roman" w:hAnsi="Times New Roman"/>
           <w:b w:val="0"/>
           <w:i w:val="0"/>
           <w:color w:val="000000"/>
-          <w:sz w:val="22"/>
+          <w:sz w:val="20"/>
         </w:rPr>
         <w:t>trojedini Bog Otac Sin i Duh</w:t>
       </w:r>
@@ -2966,11 +1903,11 @@
       </w:pPr>
       <w:r>
         <w:rPr>
-          <w:rFonts w:ascii="Calibri" w:hAnsi="Calibri"/>
+          <w:rFonts w:ascii="Times New Roman" w:hAnsi="Times New Roman"/>
           <w:b w:val="0"/>
           <w:i w:val="0"/>
           <w:color w:val="000000"/>
-          <w:sz w:val="22"/>
+          <w:sz w:val="20"/>
         </w:rPr>
         <w:t>Janje je i kralj naš otkupitelj</w:t>
       </w:r>
@@ -2981,40 +1918,26 @@
       </w:pPr>
       <w:r>
         <w:rPr>
-          <w:rFonts w:ascii="Calibri" w:hAnsi="Calibri"/>
+          <w:rFonts w:ascii="Times New Roman" w:hAnsi="Times New Roman"/>
           <w:b w:val="0"/>
           <w:i w:val="0"/>
           <w:color w:val="000000"/>
-          <w:sz w:val="22"/>
+          <w:sz w:val="20"/>
         </w:rPr>
       </w:r>
     </w:p>
     <w:p>
       <w:pPr>
-        <w:spacing w:before="120" w:after="0"/>
+        <w:spacing w:before="0" w:after="0"/>
+        <w:ind w:left="720"/>
       </w:pPr>
       <w:r>
         <w:rPr>
-          <w:rFonts w:ascii="Calibri" w:hAnsi="Calibri"/>
+          <w:rFonts w:ascii="Times New Roman" w:hAnsi="Times New Roman"/>
           <w:b/>
-          <w:i w:val="0"/>
+          <w:i/>
           <w:color w:val="000000"/>
-          <w:sz w:val="22"/>
-        </w:rPr>
-        <w:t>Bridge</w:t>
-      </w:r>
-    </w:p>
-    <w:p>
-      <w:pPr>
-        <w:spacing w:before="0" w:after="0"/>
-      </w:pPr>
-      <w:r>
-        <w:rPr>
-          <w:rFonts w:ascii="Calibri" w:hAnsi="Calibri"/>
-          <w:b w:val="0"/>
-          <w:i w:val="0"/>
-          <w:color w:val="000000"/>
-          <w:sz w:val="22"/>
+          <w:sz w:val="20"/>
         </w:rPr>
         <w:t>ime najveće vrijedno slavljenja</w:t>
       </w:r>
@@ -3022,140 +1945,45 @@
     <w:p>
       <w:pPr>
         <w:spacing w:before="0" w:after="0"/>
+        <w:ind w:left="720"/>
       </w:pPr>
       <w:r>
         <w:rPr>
-          <w:rFonts w:ascii="Calibri" w:hAnsi="Calibri"/>
-          <w:b w:val="0"/>
-          <w:i w:val="0"/>
+          <w:rFonts w:ascii="Times New Roman" w:hAnsi="Times New Roman"/>
+          <w:b/>
+          <w:i/>
           <w:color w:val="000000"/>
-          <w:sz w:val="22"/>
+          <w:sz w:val="20"/>
         </w:rPr>
         <w:t>srcem pjevam Bog je velik</w:t>
       </w:r>
     </w:p>
     <w:p>
+      <w:pPr>
+        <w:spacing w:before="60" w:after="60"/>
+      </w:pPr>
       <w:r>
-        <w:br w:type="page"/>
+        <w:rPr>
+          <w:rFonts w:ascii="Times New Roman" w:hAnsi="Times New Roman"/>
+          <w:b w:val="0"/>
+          <w:i w:val="0"/>
+          <w:color w:val="000000"/>
+          <w:sz w:val="20"/>
+        </w:rPr>
+        <w:t>____________________________________________________________</w:t>
       </w:r>
     </w:p>
     <w:p>
       <w:pPr>
-        <w:jc w:val="left"/>
-        <w:spacing w:before="0" w:after="60"/>
-        <w:tabs>
-          <w:tab w:val="right" w:pos="9070"/>
-        </w:tabs>
+        <w:spacing w:before="0" w:after="0"/>
       </w:pPr>
       <w:r>
         <w:rPr>
-          <w:rFonts w:ascii="Calibri" w:hAnsi="Calibri"/>
-          <w:b/>
-          <w:color w:val="000000"/>
-          <w:sz w:val="52"/>
-        </w:rPr>
-        <w:t>Blagoslovljen Bog</w:t>
-      </w:r>
-    </w:p>
-    <w:p>
-      <w:pPr>
-        <w:spacing w:before="0" w:after="0"/>
-      </w:pPr>
-      <w:r>
-        <w:rPr>
-          <w:rFonts w:ascii="Calibri" w:hAnsi="Calibri"/>
+          <w:rFonts w:ascii="Times New Roman" w:hAnsi="Times New Roman"/>
           <w:b w:val="0"/>
           <w:i w:val="0"/>
           <w:color w:val="000000"/>
-          <w:sz w:val="22"/>
-        </w:rPr>
-        <w:t>No</w:t>
-      </w:r>
-    </w:p>
-    <w:p>
-      <w:pPr>
-        <w:spacing w:before="0" w:after="0"/>
-      </w:pPr>
-      <w:r>
-        <w:rPr>
-          <w:rFonts w:ascii="Calibri" w:hAnsi="Calibri"/>
-          <w:b w:val="0"/>
-          <w:i w:val="0"/>
-          <w:color w:val="000000"/>
-          <w:sz w:val="22"/>
-        </w:rPr>
-      </w:r>
-    </w:p>
-    <w:p>
-      <w:pPr>
-        <w:spacing w:before="0" w:after="0"/>
-      </w:pPr>
-      <w:r>
-        <w:rPr>
-          <w:rFonts w:ascii="Calibri" w:hAnsi="Calibri"/>
-          <w:b/>
-          <w:i w:val="0"/>
-          <w:color w:val="000000"/>
-          <w:sz w:val="22"/>
-        </w:rPr>
-        <w:t>Pjesmarica</w:t>
-      </w:r>
-    </w:p>
-    <w:p>
-      <w:pPr>
-        <w:spacing w:before="0" w:after="0"/>
-      </w:pPr>
-      <w:r>
-        <w:rPr>
-          <w:rFonts w:ascii="Calibri" w:hAnsi="Calibri"/>
-          <w:b w:val="0"/>
-          <w:i w:val="0"/>
-          <w:color w:val="000000"/>
-          <w:sz w:val="22"/>
-        </w:rPr>
-        <w:t>602</w:t>
-      </w:r>
-    </w:p>
-    <w:p>
-      <w:pPr>
-        <w:spacing w:before="0" w:after="0"/>
-      </w:pPr>
-      <w:r>
-        <w:rPr>
-          <w:rFonts w:ascii="Calibri" w:hAnsi="Calibri"/>
-          <w:b w:val="0"/>
-          <w:i w:val="0"/>
-          <w:color w:val="000000"/>
-          <w:sz w:val="22"/>
-        </w:rPr>
-        <w:t>1002</w:t>
-      </w:r>
-    </w:p>
-    <w:p>
-      <w:pPr>
-        <w:spacing w:before="0" w:after="0"/>
-      </w:pPr>
-      <w:r>
-        <w:rPr>
-          <w:rFonts w:ascii="Calibri" w:hAnsi="Calibri"/>
-          <w:b w:val="0"/>
-          <w:i w:val="0"/>
-          <w:color w:val="000000"/>
-          <w:sz w:val="22"/>
-        </w:rPr>
-      </w:r>
-    </w:p>
-    <w:p>
-      <w:pPr>
-        <w:spacing w:before="0" w:after="0"/>
-      </w:pPr>
-      <w:r>
-        <w:rPr>
-          <w:rFonts w:ascii="Calibri" w:hAnsi="Calibri"/>
-          <w:b w:val="0"/>
-          <w:i w:val="0"/>
-          <w:color w:val="000000"/>
-          <w:sz w:val="22"/>
+          <w:sz w:val="20"/>
         </w:rPr>
         <w:t>Blagoslovljen Bog i presveto mu ime</w:t>
       </w:r>
@@ -3166,137 +1994,41 @@
       </w:pPr>
       <w:r>
         <w:rPr>
-          <w:rFonts w:ascii="Calibri" w:hAnsi="Calibri"/>
+          <w:rFonts w:ascii="Times New Roman" w:hAnsi="Times New Roman"/>
           <w:b w:val="0"/>
           <w:i w:val="0"/>
           <w:color w:val="000000"/>
-          <w:sz w:val="22"/>
+          <w:sz w:val="20"/>
         </w:rPr>
         <w:t>Blagoslovljen Bog on život daruje</w:t>
       </w:r>
     </w:p>
     <w:p>
+      <w:pPr>
+        <w:spacing w:before="60" w:after="60"/>
+      </w:pPr>
       <w:r>
-        <w:br w:type="page"/>
+        <w:rPr>
+          <w:rFonts w:ascii="Times New Roman" w:hAnsi="Times New Roman"/>
+          <w:b w:val="0"/>
+          <w:i w:val="0"/>
+          <w:color w:val="000000"/>
+          <w:sz w:val="20"/>
+        </w:rPr>
+        <w:t>____________________________________________________________</w:t>
       </w:r>
     </w:p>
     <w:p>
       <w:pPr>
-        <w:jc w:val="left"/>
-        <w:spacing w:before="0" w:after="60"/>
-        <w:tabs>
-          <w:tab w:val="right" w:pos="9070"/>
-        </w:tabs>
+        <w:spacing w:before="0" w:after="0"/>
       </w:pPr>
       <w:r>
         <w:rPr>
-          <w:rFonts w:ascii="Calibri" w:hAnsi="Calibri"/>
-          <w:b/>
-          <w:color w:val="000000"/>
-          <w:sz w:val="52"/>
-        </w:rPr>
-        <w:t>Ohrabri se</w:t>
-      </w:r>
-    </w:p>
-    <w:p>
-      <w:pPr>
-        <w:spacing w:before="0" w:after="0"/>
-      </w:pPr>
-      <w:r>
-        <w:rPr>
-          <w:rFonts w:ascii="Calibri" w:hAnsi="Calibri"/>
+          <w:rFonts w:ascii="Times New Roman" w:hAnsi="Times New Roman"/>
           <w:b w:val="0"/>
           <w:i w:val="0"/>
           <w:color w:val="000000"/>
-          <w:sz w:val="22"/>
-        </w:rPr>
-        <w:t>Papa Band</w:t>
-      </w:r>
-    </w:p>
-    <w:p>
-      <w:pPr>
-        <w:spacing w:before="0" w:after="0"/>
-      </w:pPr>
-      <w:r>
-        <w:rPr>
-          <w:rFonts w:ascii="Calibri" w:hAnsi="Calibri"/>
-          <w:b w:val="0"/>
-          <w:i w:val="0"/>
-          <w:color w:val="000000"/>
-          <w:sz w:val="22"/>
-        </w:rPr>
-      </w:r>
-    </w:p>
-    <w:p>
-      <w:pPr>
-        <w:spacing w:before="0" w:after="0"/>
-      </w:pPr>
-      <w:r>
-        <w:rPr>
-          <w:rFonts w:ascii="Calibri" w:hAnsi="Calibri"/>
-          <w:b/>
-          <w:i w:val="0"/>
-          <w:color w:val="000000"/>
-          <w:sz w:val="22"/>
-        </w:rPr>
-        <w:t>Pjesmarica</w:t>
-      </w:r>
-    </w:p>
-    <w:p>
-      <w:pPr>
-        <w:spacing w:before="0" w:after="0"/>
-      </w:pPr>
-      <w:r>
-        <w:rPr>
-          <w:rFonts w:ascii="Calibri" w:hAnsi="Calibri"/>
-          <w:b w:val="0"/>
-          <w:i w:val="0"/>
-          <w:color w:val="000000"/>
-          <w:sz w:val="22"/>
-        </w:rPr>
-        <w:t>126</w:t>
-      </w:r>
-    </w:p>
-    <w:p>
-      <w:pPr>
-        <w:spacing w:before="0" w:after="0"/>
-      </w:pPr>
-      <w:r>
-        <w:rPr>
-          <w:rFonts w:ascii="Calibri" w:hAnsi="Calibri"/>
-          <w:b w:val="0"/>
-          <w:i w:val="0"/>
-          <w:color w:val="000000"/>
-          <w:sz w:val="22"/>
-        </w:rPr>
-      </w:r>
-    </w:p>
-    <w:p>
-      <w:pPr>
-        <w:spacing w:before="120" w:after="0"/>
-      </w:pPr>
-      <w:r>
-        <w:rPr>
-          <w:rFonts w:ascii="Calibri" w:hAnsi="Calibri"/>
-          <w:b/>
-          <w:i w:val="0"/>
-          <w:color w:val="000000"/>
-          <w:sz w:val="22"/>
-        </w:rPr>
-        <w:t>Verse 1</w:t>
-      </w:r>
-    </w:p>
-    <w:p>
-      <w:pPr>
-        <w:spacing w:before="0" w:after="0"/>
-      </w:pPr>
-      <w:r>
-        <w:rPr>
-          <w:rFonts w:ascii="Calibri" w:hAnsi="Calibri"/>
-          <w:b w:val="0"/>
-          <w:i w:val="0"/>
-          <w:color w:val="000000"/>
-          <w:sz w:val="22"/>
+          <w:sz w:val="20"/>
         </w:rPr>
         <w:t>Ohrabri se, brigu ti svu</w:t>
       </w:r>
@@ -3307,11 +2039,11 @@
       </w:pPr>
       <w:r>
         <w:rPr>
-          <w:rFonts w:ascii="Calibri" w:hAnsi="Calibri"/>
+          <w:rFonts w:ascii="Times New Roman" w:hAnsi="Times New Roman"/>
           <w:b w:val="0"/>
           <w:i w:val="0"/>
           <w:color w:val="000000"/>
-          <w:sz w:val="22"/>
+          <w:sz w:val="20"/>
         </w:rPr>
         <w:t>On može ponijeti</w:t>
       </w:r>
@@ -3322,11 +2054,11 @@
       </w:pPr>
       <w:r>
         <w:rPr>
-          <w:rFonts w:ascii="Calibri" w:hAnsi="Calibri"/>
+          <w:rFonts w:ascii="Times New Roman" w:hAnsi="Times New Roman"/>
           <w:b w:val="0"/>
           <w:i w:val="0"/>
           <w:color w:val="000000"/>
-          <w:sz w:val="22"/>
+          <w:sz w:val="20"/>
         </w:rPr>
         <w:t>goru će svaku sa puta</w:t>
       </w:r>
@@ -3337,11 +2069,11 @@
       </w:pPr>
       <w:r>
         <w:rPr>
-          <w:rFonts w:ascii="Calibri" w:hAnsi="Calibri"/>
+          <w:rFonts w:ascii="Times New Roman" w:hAnsi="Times New Roman"/>
           <w:b w:val="0"/>
           <w:i w:val="0"/>
           <w:color w:val="000000"/>
-          <w:sz w:val="22"/>
+          <w:sz w:val="20"/>
         </w:rPr>
         <w:t>tvoga premjestiti.</w:t>
       </w:r>
@@ -3352,40 +2084,25 @@
       </w:pPr>
       <w:r>
         <w:rPr>
-          <w:rFonts w:ascii="Calibri" w:hAnsi="Calibri"/>
+          <w:rFonts w:ascii="Times New Roman" w:hAnsi="Times New Roman"/>
           <w:b w:val="0"/>
           <w:i w:val="0"/>
           <w:color w:val="000000"/>
-          <w:sz w:val="22"/>
+          <w:sz w:val="20"/>
         </w:rPr>
       </w:r>
     </w:p>
     <w:p>
       <w:pPr>
-        <w:spacing w:before="120" w:after="0"/>
+        <w:spacing w:before="0" w:after="0"/>
       </w:pPr>
       <w:r>
         <w:rPr>
-          <w:rFonts w:ascii="Calibri" w:hAnsi="Calibri"/>
-          <w:b/>
-          <w:i w:val="0"/>
-          <w:color w:val="000000"/>
-          <w:sz w:val="22"/>
-        </w:rPr>
-        <w:t>Verse 2</w:t>
-      </w:r>
-    </w:p>
-    <w:p>
-      <w:pPr>
-        <w:spacing w:before="0" w:after="0"/>
-      </w:pPr>
-      <w:r>
-        <w:rPr>
-          <w:rFonts w:ascii="Calibri" w:hAnsi="Calibri"/>
+          <w:rFonts w:ascii="Times New Roman" w:hAnsi="Times New Roman"/>
           <w:b w:val="0"/>
           <w:i w:val="0"/>
           <w:color w:val="000000"/>
-          <w:sz w:val="22"/>
+          <w:sz w:val="20"/>
         </w:rPr>
         <w:t>Ne boj se valova tih</w:t>
       </w:r>
@@ -3396,11 +2113,11 @@
       </w:pPr>
       <w:r>
         <w:rPr>
-          <w:rFonts w:ascii="Calibri" w:hAnsi="Calibri"/>
+          <w:rFonts w:ascii="Times New Roman" w:hAnsi="Times New Roman"/>
           <w:b w:val="0"/>
           <w:i w:val="0"/>
           <w:color w:val="000000"/>
-          <w:sz w:val="22"/>
+          <w:sz w:val="20"/>
         </w:rPr>
         <w:t>neće te prekriti</w:t>
       </w:r>
@@ -3411,11 +2128,11 @@
       </w:pPr>
       <w:r>
         <w:rPr>
-          <w:rFonts w:ascii="Calibri" w:hAnsi="Calibri"/>
+          <w:rFonts w:ascii="Times New Roman" w:hAnsi="Times New Roman"/>
           <w:b w:val="0"/>
           <w:i w:val="0"/>
           <w:color w:val="000000"/>
-          <w:sz w:val="22"/>
+          <w:sz w:val="20"/>
         </w:rPr>
         <w:t>suzu će svaku tvoj Bog</w:t>
       </w:r>
@@ -3426,11 +2143,11 @@
       </w:pPr>
       <w:r>
         <w:rPr>
-          <w:rFonts w:ascii="Calibri" w:hAnsi="Calibri"/>
+          <w:rFonts w:ascii="Times New Roman" w:hAnsi="Times New Roman"/>
           <w:b w:val="0"/>
           <w:i w:val="0"/>
           <w:color w:val="000000"/>
-          <w:sz w:val="22"/>
+          <w:sz w:val="20"/>
         </w:rPr>
         <w:t>s lica obrisati.</w:t>
       </w:r>
@@ -3441,40 +2158,26 @@
       </w:pPr>
       <w:r>
         <w:rPr>
-          <w:rFonts w:ascii="Calibri" w:hAnsi="Calibri"/>
+          <w:rFonts w:ascii="Times New Roman" w:hAnsi="Times New Roman"/>
           <w:b w:val="0"/>
           <w:i w:val="0"/>
           <w:color w:val="000000"/>
-          <w:sz w:val="22"/>
+          <w:sz w:val="20"/>
         </w:rPr>
       </w:r>
     </w:p>
     <w:p>
       <w:pPr>
-        <w:spacing w:before="120" w:after="0"/>
+        <w:spacing w:before="0" w:after="0"/>
+        <w:ind w:left="720"/>
       </w:pPr>
       <w:r>
         <w:rPr>
-          <w:rFonts w:ascii="Calibri" w:hAnsi="Calibri"/>
+          <w:rFonts w:ascii="Times New Roman" w:hAnsi="Times New Roman"/>
           <w:b/>
-          <w:i w:val="0"/>
+          <w:i/>
           <w:color w:val="000000"/>
-          <w:sz w:val="22"/>
-        </w:rPr>
-        <w:t>Chorus</w:t>
-      </w:r>
-    </w:p>
-    <w:p>
-      <w:pPr>
-        <w:spacing w:before="0" w:after="0"/>
-      </w:pPr>
-      <w:r>
-        <w:rPr>
-          <w:rFonts w:ascii="Calibri" w:hAnsi="Calibri"/>
-          <w:b w:val="0"/>
-          <w:i w:val="0"/>
-          <w:color w:val="000000"/>
-          <w:sz w:val="22"/>
+          <w:sz w:val="20"/>
         </w:rPr>
         <w:t>Ako nosi On cijeli taj svijet</w:t>
       </w:r>
@@ -3482,14 +2185,15 @@
     <w:p>
       <w:pPr>
         <w:spacing w:before="0" w:after="0"/>
+        <w:ind w:left="720"/>
       </w:pPr>
       <w:r>
         <w:rPr>
-          <w:rFonts w:ascii="Calibri" w:hAnsi="Calibri"/>
-          <w:b w:val="0"/>
-          <w:i w:val="0"/>
+          <w:rFonts w:ascii="Times New Roman" w:hAnsi="Times New Roman"/>
+          <w:b/>
+          <w:i/>
           <w:color w:val="000000"/>
-          <w:sz w:val="22"/>
+          <w:sz w:val="20"/>
         </w:rPr>
         <w:t>na svome dlanu</w:t>
       </w:r>
@@ -3497,14 +2201,15 @@
     <w:p>
       <w:pPr>
         <w:spacing w:before="0" w:after="0"/>
+        <w:ind w:left="720"/>
       </w:pPr>
       <w:r>
         <w:rPr>
-          <w:rFonts w:ascii="Calibri" w:hAnsi="Calibri"/>
-          <w:b w:val="0"/>
-          <w:i w:val="0"/>
+          <w:rFonts w:ascii="Times New Roman" w:hAnsi="Times New Roman"/>
+          <w:b/>
+          <w:i/>
           <w:color w:val="000000"/>
-          <w:sz w:val="22"/>
+          <w:sz w:val="20"/>
         </w:rPr>
         <w:t>daj Mu svoj život</w:t>
       </w:r>
@@ -3512,23 +2217,25 @@
     <w:p>
       <w:pPr>
         <w:spacing w:before="0" w:after="0"/>
+        <w:ind w:left="720"/>
       </w:pPr>
       <w:r>
         <w:rPr>
-          <w:rFonts w:ascii="Calibri" w:hAnsi="Calibri"/>
-          <w:b w:val="0"/>
-          <w:i w:val="0"/>
+          <w:rFonts w:ascii="Times New Roman" w:hAnsi="Times New Roman"/>
+          <w:b/>
+          <w:i/>
           <w:color w:val="000000"/>
-          <w:sz w:val="22"/>
+          <w:sz w:val="20"/>
         </w:rPr>
         <w:t>i tebe nosit će On</w:t>
       </w:r>
     </w:p>
     <w:sectPr>
-      <w:pgSz w:w="12240" w:h="15840"/>
-      <w:pgMar w:top="1417" w:right="1417" w:bottom="1417" w:left="1417" w:header="720" w:footer="720" w:gutter="0"/>
+      <w:pgSz w:w="16838" w:h="11906"/>
+      <w:pgMar w:top="850" w:right="850" w:bottom="850" w:left="850" w:header="720" w:footer="720" w:gutter="0"/>
       <w:cols w:space="720"/>
       <w:docGrid w:linePitch="360"/>
+      <w:cols w:num="2" w:space="720" w:equalWidth="1"/>
     </w:sectPr>
   </w:body>
 </w:document>
@@ -3901,8 +2608,8 @@
       <w:spacing w:before="0" w:after="0"/>
     </w:pPr>
     <w:rPr>
-      <w:rFonts w:ascii="Calibri" w:hAnsi="Calibri"/>
-      <w:sz w:val="22"/>
+      <w:rFonts w:ascii="Times New Roman" w:hAnsi="Times New Roman"/>
+      <w:sz w:val="20"/>
     </w:rPr>
   </w:style>
   <w:style w:type="paragraph" w:styleId="Header">

</xml_diff>

<commit_message>
Ukloni prazne retke između kitica unutar pjesme
https://claude.ai/code/session_017JvMZHvCbCck4PdkCA67A3
</commit_message>
<xml_diff>
--- a/output_test.docx
+++ b/output_test.docx
@@ -157,35 +157,7 @@
           <w:color w:val="000000"/>
           <w:sz w:val="20"/>
         </w:rPr>
-      </w:r>
-    </w:p>
-    <w:p>
-      <w:pPr>
-        <w:spacing w:before="0" w:after="0"/>
-      </w:pPr>
-      <w:r>
-        <w:rPr>
-          <w:rFonts w:ascii="Times New Roman" w:hAnsi="Times New Roman"/>
-          <w:b w:val="0"/>
-          <w:i w:val="0"/>
-          <w:color w:val="000000"/>
-          <w:sz w:val="20"/>
-        </w:rPr>
         <w:t>za me umre</w:t>
-      </w:r>
-    </w:p>
-    <w:p>
-      <w:pPr>
-        <w:spacing w:before="0" w:after="0"/>
-      </w:pPr>
-      <w:r>
-        <w:rPr>
-          <w:rFonts w:ascii="Times New Roman" w:hAnsi="Times New Roman"/>
-          <w:b w:val="0"/>
-          <w:i w:val="0"/>
-          <w:color w:val="000000"/>
-          <w:sz w:val="20"/>
-        </w:rPr>
       </w:r>
     </w:p>
     <w:p>
@@ -215,35 +187,7 @@
           <w:color w:val="000000"/>
           <w:sz w:val="20"/>
         </w:rPr>
-      </w:r>
-    </w:p>
-    <w:p>
-      <w:pPr>
-        <w:spacing w:before="0" w:after="0"/>
-      </w:pPr>
-      <w:r>
-        <w:rPr>
-          <w:rFonts w:ascii="Times New Roman" w:hAnsi="Times New Roman"/>
-          <w:b w:val="0"/>
-          <w:i w:val="0"/>
-          <w:color w:val="000000"/>
-          <w:sz w:val="20"/>
-        </w:rPr>
         <w:t>on ljubi me</w:t>
-      </w:r>
-    </w:p>
-    <w:p>
-      <w:pPr>
-        <w:spacing w:before="0" w:after="0"/>
-      </w:pPr>
-      <w:r>
-        <w:rPr>
-          <w:rFonts w:ascii="Times New Roman" w:hAnsi="Times New Roman"/>
-          <w:b w:val="0"/>
-          <w:i w:val="0"/>
-          <w:color w:val="000000"/>
-          <w:sz w:val="20"/>
-        </w:rPr>
       </w:r>
     </w:p>
     <w:p>
@@ -273,35 +217,7 @@
           <w:color w:val="000000"/>
           <w:sz w:val="20"/>
         </w:rPr>
-      </w:r>
-    </w:p>
-    <w:p>
-      <w:pPr>
-        <w:spacing w:before="0" w:after="0"/>
-      </w:pPr>
-      <w:r>
-        <w:rPr>
-          <w:rFonts w:ascii="Times New Roman" w:hAnsi="Times New Roman"/>
-          <w:b w:val="0"/>
-          <w:i w:val="0"/>
-          <w:color w:val="000000"/>
-          <w:sz w:val="20"/>
-        </w:rPr>
         <w:t>prašta mi</w:t>
-      </w:r>
-    </w:p>
-    <w:p>
-      <w:pPr>
-        <w:spacing w:before="0" w:after="0"/>
-      </w:pPr>
-      <w:r>
-        <w:rPr>
-          <w:rFonts w:ascii="Times New Roman" w:hAnsi="Times New Roman"/>
-          <w:b w:val="0"/>
-          <w:i w:val="0"/>
-          <w:color w:val="000000"/>
-          <w:sz w:val="20"/>
-        </w:rPr>
       </w:r>
     </w:p>
     <w:p>
@@ -487,20 +403,6 @@
     <w:p>
       <w:pPr>
         <w:spacing w:before="0" w:after="0"/>
-      </w:pPr>
-      <w:r>
-        <w:rPr>
-          <w:rFonts w:ascii="Times New Roman" w:hAnsi="Times New Roman"/>
-          <w:b w:val="0"/>
-          <w:i w:val="0"/>
-          <w:color w:val="000000"/>
-          <w:sz w:val="20"/>
-        </w:rPr>
-      </w:r>
-    </w:p>
-    <w:p>
-      <w:pPr>
-        <w:spacing w:before="0" w:after="0"/>
         <w:ind w:left="720"/>
       </w:pPr>
       <w:r>
@@ -760,20 +662,6 @@
     <w:p>
       <w:pPr>
         <w:spacing w:before="0" w:after="0"/>
-      </w:pPr>
-      <w:r>
-        <w:rPr>
-          <w:rFonts w:ascii="Times New Roman" w:hAnsi="Times New Roman"/>
-          <w:b w:val="0"/>
-          <w:i w:val="0"/>
-          <w:color w:val="000000"/>
-          <w:sz w:val="20"/>
-        </w:rPr>
-      </w:r>
-    </w:p>
-    <w:p>
-      <w:pPr>
-        <w:spacing w:before="0" w:after="0"/>
         <w:ind w:left="720"/>
       </w:pPr>
       <w:r>
@@ -879,20 +767,6 @@
           <w:color w:val="000000"/>
           <w:sz w:val="20"/>
         </w:rPr>
-      </w:r>
-    </w:p>
-    <w:p>
-      <w:pPr>
-        <w:spacing w:before="0" w:after="0"/>
-      </w:pPr>
-      <w:r>
-        <w:rPr>
-          <w:rFonts w:ascii="Times New Roman" w:hAnsi="Times New Roman"/>
-          <w:b w:val="0"/>
-          <w:i w:val="0"/>
-          <w:color w:val="000000"/>
-          <w:sz w:val="20"/>
-        </w:rPr>
         <w:t>Njezno me pozivas</w:t>
       </w:r>
     </w:p>
@@ -944,20 +818,6 @@
     <w:p>
       <w:pPr>
         <w:spacing w:before="0" w:after="0"/>
-      </w:pPr>
-      <w:r>
-        <w:rPr>
-          <w:rFonts w:ascii="Times New Roman" w:hAnsi="Times New Roman"/>
-          <w:b w:val="0"/>
-          <w:i w:val="0"/>
-          <w:color w:val="000000"/>
-          <w:sz w:val="20"/>
-        </w:rPr>
-      </w:r>
-    </w:p>
-    <w:p>
-      <w:pPr>
-        <w:spacing w:before="0" w:after="0"/>
         <w:ind w:left="720"/>
       </w:pPr>
       <w:r>
@@ -1067,20 +927,6 @@
     <w:p>
       <w:pPr>
         <w:spacing w:before="0" w:after="0"/>
-      </w:pPr>
-      <w:r>
-        <w:rPr>
-          <w:rFonts w:ascii="Times New Roman" w:hAnsi="Times New Roman"/>
-          <w:b w:val="0"/>
-          <w:i w:val="0"/>
-          <w:color w:val="000000"/>
-          <w:sz w:val="20"/>
-        </w:rPr>
-      </w:r>
-    </w:p>
-    <w:p>
-      <w:pPr>
-        <w:spacing w:before="0" w:after="0"/>
         <w:ind w:left="720"/>
       </w:pPr>
       <w:r>
@@ -1190,20 +1036,6 @@
     <w:p>
       <w:pPr>
         <w:spacing w:before="0" w:after="0"/>
-      </w:pPr>
-      <w:r>
-        <w:rPr>
-          <w:rFonts w:ascii="Times New Roman" w:hAnsi="Times New Roman"/>
-          <w:b w:val="0"/>
-          <w:i w:val="0"/>
-          <w:color w:val="000000"/>
-          <w:sz w:val="20"/>
-        </w:rPr>
-      </w:r>
-    </w:p>
-    <w:p>
-      <w:pPr>
-        <w:spacing w:before="0" w:after="0"/>
         <w:ind w:left="720"/>
       </w:pPr>
       <w:r>
@@ -1245,20 +1077,6 @@
           <w:color w:val="000000"/>
           <w:sz w:val="20"/>
         </w:rPr>
-      </w:r>
-    </w:p>
-    <w:p>
-      <w:pPr>
-        <w:spacing w:before="0" w:after="0"/>
-      </w:pPr>
-      <w:r>
-        <w:rPr>
-          <w:rFonts w:ascii="Times New Roman" w:hAnsi="Times New Roman"/>
-          <w:b w:val="0"/>
-          <w:i w:val="0"/>
-          <w:color w:val="000000"/>
-          <w:sz w:val="20"/>
-        </w:rPr>
         <w:t>Dubine čuva Tvoja milost i moćna ti desnica</w:t>
       </w:r>
     </w:p>
@@ -1280,20 +1098,6 @@
     <w:p>
       <w:pPr>
         <w:spacing w:before="0" w:after="0"/>
-      </w:pPr>
-      <w:r>
-        <w:rPr>
-          <w:rFonts w:ascii="Times New Roman" w:hAnsi="Times New Roman"/>
-          <w:b w:val="0"/>
-          <w:i w:val="0"/>
-          <w:color w:val="000000"/>
-          <w:sz w:val="20"/>
-        </w:rPr>
-      </w:r>
-    </w:p>
-    <w:p>
-      <w:pPr>
-        <w:spacing w:before="0" w:after="0"/>
         <w:ind w:left="720"/>
       </w:pPr>
       <w:r>
@@ -1425,20 +1229,6 @@
           <w:color w:val="000000"/>
           <w:sz w:val="20"/>
         </w:rPr>
-      </w:r>
-    </w:p>
-    <w:p>
-      <w:pPr>
-        <w:spacing w:before="0" w:after="0"/>
-      </w:pPr>
-      <w:r>
-        <w:rPr>
-          <w:rFonts w:ascii="Times New Roman" w:hAnsi="Times New Roman"/>
-          <w:b w:val="0"/>
-          <w:i w:val="0"/>
-          <w:color w:val="000000"/>
-          <w:sz w:val="20"/>
-        </w:rPr>
         <w:t>Bože slavim Te</w:t>
       </w:r>
     </w:p>
@@ -1460,20 +1250,6 @@
     <w:p>
       <w:pPr>
         <w:spacing w:before="0" w:after="0"/>
-      </w:pPr>
-      <w:r>
-        <w:rPr>
-          <w:rFonts w:ascii="Times New Roman" w:hAnsi="Times New Roman"/>
-          <w:b w:val="0"/>
-          <w:i w:val="0"/>
-          <w:color w:val="000000"/>
-          <w:sz w:val="20"/>
-        </w:rPr>
-      </w:r>
-    </w:p>
-    <w:p>
-      <w:pPr>
-        <w:spacing w:before="0" w:after="0"/>
         <w:ind w:left="720"/>
       </w:pPr>
       <w:r>
@@ -1626,20 +1402,6 @@
     <w:p>
       <w:pPr>
         <w:spacing w:before="0" w:after="0"/>
-      </w:pPr>
-      <w:r>
-        <w:rPr>
-          <w:rFonts w:ascii="Times New Roman" w:hAnsi="Times New Roman"/>
-          <w:b w:val="0"/>
-          <w:i w:val="0"/>
-          <w:color w:val="000000"/>
-          <w:sz w:val="20"/>
-        </w:rPr>
-      </w:r>
-    </w:p>
-    <w:p>
-      <w:pPr>
-        <w:spacing w:before="0" w:after="0"/>
         <w:ind w:left="720"/>
       </w:pPr>
       <w:r>
@@ -1779,20 +1541,6 @@
     <w:p>
       <w:pPr>
         <w:spacing w:before="0" w:after="0"/>
-      </w:pPr>
-      <w:r>
-        <w:rPr>
-          <w:rFonts w:ascii="Times New Roman" w:hAnsi="Times New Roman"/>
-          <w:b w:val="0"/>
-          <w:i w:val="0"/>
-          <w:color w:val="000000"/>
-          <w:sz w:val="20"/>
-        </w:rPr>
-      </w:r>
-    </w:p>
-    <w:p>
-      <w:pPr>
-        <w:spacing w:before="0" w:after="0"/>
         <w:ind w:left="720"/>
       </w:pPr>
       <w:r>
@@ -1850,20 +1598,6 @@
           <w:color w:val="000000"/>
           <w:sz w:val="20"/>
         </w:rPr>
-      </w:r>
-    </w:p>
-    <w:p>
-      <w:pPr>
-        <w:spacing w:before="0" w:after="0"/>
-      </w:pPr>
-      <w:r>
-        <w:rPr>
-          <w:rFonts w:ascii="Times New Roman" w:hAnsi="Times New Roman"/>
-          <w:b w:val="0"/>
-          <w:i w:val="0"/>
-          <w:color w:val="000000"/>
-          <w:sz w:val="20"/>
-        </w:rPr>
         <w:t>vječno vlada on u ruci drži sve</w:t>
       </w:r>
     </w:p>
@@ -1915,20 +1649,6 @@
     <w:p>
       <w:pPr>
         <w:spacing w:before="0" w:after="0"/>
-      </w:pPr>
-      <w:r>
-        <w:rPr>
-          <w:rFonts w:ascii="Times New Roman" w:hAnsi="Times New Roman"/>
-          <w:b w:val="0"/>
-          <w:i w:val="0"/>
-          <w:color w:val="000000"/>
-          <w:sz w:val="20"/>
-        </w:rPr>
-      </w:r>
-    </w:p>
-    <w:p>
-      <w:pPr>
-        <w:spacing w:before="0" w:after="0"/>
         <w:ind w:left="720"/>
       </w:pPr>
       <w:r>
@@ -2090,20 +1810,6 @@
           <w:color w:val="000000"/>
           <w:sz w:val="20"/>
         </w:rPr>
-      </w:r>
-    </w:p>
-    <w:p>
-      <w:pPr>
-        <w:spacing w:before="0" w:after="0"/>
-      </w:pPr>
-      <w:r>
-        <w:rPr>
-          <w:rFonts w:ascii="Times New Roman" w:hAnsi="Times New Roman"/>
-          <w:b w:val="0"/>
-          <w:i w:val="0"/>
-          <w:color w:val="000000"/>
-          <w:sz w:val="20"/>
-        </w:rPr>
         <w:t>Ne boj se valova tih</w:t>
       </w:r>
     </w:p>
@@ -2150,20 +1856,6 @@
           <w:sz w:val="20"/>
         </w:rPr>
         <w:t>s lica obrisati.</w:t>
-      </w:r>
-    </w:p>
-    <w:p>
-      <w:pPr>
-        <w:spacing w:before="0" w:after="0"/>
-      </w:pPr>
-      <w:r>
-        <w:rPr>
-          <w:rFonts w:ascii="Times New Roman" w:hAnsi="Times New Roman"/>
-          <w:b w:val="0"/>
-          <w:i w:val="0"/>
-          <w:color w:val="000000"/>
-          <w:sz w:val="20"/>
-        </w:rPr>
       </w:r>
     </w:p>
     <w:p>

</xml_diff>

<commit_message>
Smanji font na 8pt
https://claude.ai/code/session_017JvMZHvCbCck4PdkCA67A3
</commit_message>
<xml_diff>
--- a/output_test.docx
+++ b/output_test.docx
@@ -13,7 +13,7 @@
           <w:b/>
           <w:i/>
           <w:color w:val="000000"/>
-          <w:sz w:val="20"/>
+          <w:sz w:val="16"/>
         </w:rPr>
         <w:t>OČE, MI TI SE KLANJAMO</w:t>
       </w:r>
@@ -29,7 +29,7 @@
           <w:b/>
           <w:i/>
           <w:color w:val="000000"/>
-          <w:sz w:val="20"/>
+          <w:sz w:val="16"/>
         </w:rPr>
         <w:t>SVOJ TI ŽIVOT DAJEMO.</w:t>
       </w:r>
@@ -45,7 +45,7 @@
           <w:b/>
           <w:i/>
           <w:color w:val="000000"/>
-          <w:sz w:val="20"/>
+          <w:sz w:val="16"/>
         </w:rPr>
         <w:t>MI TE LJUBIMO!</w:t>
       </w:r>
@@ -61,7 +61,7 @@
           <w:b/>
           <w:i/>
           <w:color w:val="000000"/>
-          <w:sz w:val="20"/>
+          <w:sz w:val="16"/>
         </w:rPr>
         <w:t>SINE, MI TI SE KLANJAMO...</w:t>
       </w:r>
@@ -77,7 +77,7 @@
           <w:b/>
           <w:i/>
           <w:color w:val="000000"/>
-          <w:sz w:val="20"/>
+          <w:sz w:val="16"/>
         </w:rPr>
         <w:t>DUŠE, MI TI SE KLANJAMO...</w:t>
       </w:r>
@@ -93,7 +93,7 @@
           <w:b/>
           <w:i/>
           <w:color w:val="000000"/>
-          <w:sz w:val="20"/>
+          <w:sz w:val="16"/>
         </w:rPr>
         <w:t>TROJSTVO, MI TI SE KLANJAMO</w:t>
       </w:r>
@@ -108,7 +108,7 @@
           <w:b w:val="0"/>
           <w:i w:val="0"/>
           <w:color w:val="000000"/>
-          <w:sz w:val="20"/>
+          <w:sz w:val="16"/>
         </w:rPr>
         <w:t>____________________________________________________________</w:t>
       </w:r>
@@ -124,7 +124,7 @@
           <w:b/>
           <w:i/>
           <w:color w:val="000000"/>
-          <w:sz w:val="20"/>
+          <w:sz w:val="16"/>
         </w:rPr>
         <w:t>Iiiisus, Iiisuuus</w:t>
       </w:r>
@@ -140,7 +140,7 @@
           <w:b/>
           <w:i/>
           <w:color w:val="000000"/>
-          <w:sz w:val="20"/>
+          <w:sz w:val="16"/>
         </w:rPr>
         <w:t>Isus, Isus,Isus</w:t>
       </w:r>
@@ -155,7 +155,7 @@
           <w:b w:val="0"/>
           <w:i w:val="0"/>
           <w:color w:val="000000"/>
-          <w:sz w:val="20"/>
+          <w:sz w:val="16"/>
         </w:rPr>
         <w:t>za me umre</w:t>
       </w:r>
@@ -170,7 +170,7 @@
           <w:b w:val="0"/>
           <w:i w:val="0"/>
           <w:color w:val="000000"/>
-          <w:sz w:val="20"/>
+          <w:sz w:val="16"/>
         </w:rPr>
         <w:t>on traži me</w:t>
       </w:r>
@@ -185,7 +185,7 @@
           <w:b w:val="0"/>
           <w:i w:val="0"/>
           <w:color w:val="000000"/>
-          <w:sz w:val="20"/>
+          <w:sz w:val="16"/>
         </w:rPr>
         <w:t>on ljubi me</w:t>
       </w:r>
@@ -200,7 +200,7 @@
           <w:b w:val="0"/>
           <w:i w:val="0"/>
           <w:color w:val="000000"/>
-          <w:sz w:val="20"/>
+          <w:sz w:val="16"/>
         </w:rPr>
         <w:t>on voli me</w:t>
       </w:r>
@@ -215,7 +215,7 @@
           <w:b w:val="0"/>
           <w:i w:val="0"/>
           <w:color w:val="000000"/>
-          <w:sz w:val="20"/>
+          <w:sz w:val="16"/>
         </w:rPr>
         <w:t>prašta mi</w:t>
       </w:r>
@@ -230,7 +230,7 @@
           <w:b w:val="0"/>
           <w:i w:val="0"/>
           <w:color w:val="000000"/>
-          <w:sz w:val="20"/>
+          <w:sz w:val="16"/>
         </w:rPr>
         <w:t>Emanuel, Emanuel</w:t>
       </w:r>
@@ -245,7 +245,7 @@
           <w:b w:val="0"/>
           <w:i w:val="0"/>
           <w:color w:val="000000"/>
-          <w:sz w:val="20"/>
+          <w:sz w:val="16"/>
         </w:rPr>
         <w:t>I s u s, I s u s</w:t>
       </w:r>
@@ -260,7 +260,7 @@
           <w:b w:val="0"/>
           <w:i w:val="0"/>
           <w:color w:val="000000"/>
-          <w:sz w:val="20"/>
+          <w:sz w:val="16"/>
         </w:rPr>
         <w:t>Emanuel</w:t>
       </w:r>
@@ -275,7 +275,7 @@
           <w:b w:val="0"/>
           <w:i w:val="0"/>
           <w:color w:val="000000"/>
-          <w:sz w:val="20"/>
+          <w:sz w:val="16"/>
         </w:rPr>
         <w:t>On je živ...</w:t>
       </w:r>
@@ -290,7 +290,7 @@
           <w:b w:val="0"/>
           <w:i w:val="0"/>
           <w:color w:val="000000"/>
-          <w:sz w:val="20"/>
+          <w:sz w:val="16"/>
         </w:rPr>
         <w:t>On je tu...</w:t>
       </w:r>
@@ -305,7 +305,7 @@
           <w:b w:val="0"/>
           <w:i w:val="0"/>
           <w:color w:val="000000"/>
-          <w:sz w:val="20"/>
+          <w:sz w:val="16"/>
         </w:rPr>
         <w:t>Aleluja ...</w:t>
       </w:r>
@@ -320,7 +320,7 @@
           <w:b w:val="0"/>
           <w:i w:val="0"/>
           <w:color w:val="000000"/>
-          <w:sz w:val="20"/>
+          <w:sz w:val="16"/>
         </w:rPr>
         <w:t>____________________________________________________________</w:t>
       </w:r>
@@ -335,7 +335,7 @@
           <w:b w:val="0"/>
           <w:i w:val="0"/>
           <w:color w:val="000000"/>
-          <w:sz w:val="20"/>
+          <w:sz w:val="16"/>
         </w:rPr>
         <w:t>ŠUTIM POPUT GRLICE</w:t>
       </w:r>
@@ -350,7 +350,7 @@
           <w:b w:val="0"/>
           <w:i w:val="0"/>
           <w:color w:val="000000"/>
-          <w:sz w:val="20"/>
+          <w:sz w:val="16"/>
         </w:rPr>
         <w:t>ZAKLONJEN U LJUBAV</w:t>
       </w:r>
@@ -365,7 +365,7 @@
           <w:b w:val="0"/>
           <w:i w:val="0"/>
           <w:color w:val="000000"/>
-          <w:sz w:val="20"/>
+          <w:sz w:val="16"/>
         </w:rPr>
         <w:t>ISPRED</w:t>
       </w:r>
@@ -380,7 +380,7 @@
           <w:b w:val="0"/>
           <w:i w:val="0"/>
           <w:color w:val="000000"/>
-          <w:sz w:val="20"/>
+          <w:sz w:val="16"/>
         </w:rPr>
         <w:t>BIJELE HOSTIJE</w:t>
       </w:r>
@@ -395,7 +395,7 @@
           <w:b w:val="0"/>
           <w:i w:val="0"/>
           <w:color w:val="000000"/>
-          <w:sz w:val="20"/>
+          <w:sz w:val="16"/>
         </w:rPr>
         <w:t>I SLUŠAM KAKO MI GOVORIŠ</w:t>
       </w:r>
@@ -411,7 +411,7 @@
           <w:b/>
           <w:i/>
           <w:color w:val="000000"/>
-          <w:sz w:val="20"/>
+          <w:sz w:val="16"/>
         </w:rPr>
         <w:t>KAD BI ZNAO KOLIKO TE LJUBIM</w:t>
       </w:r>
@@ -427,7 +427,7 @@
           <w:b/>
           <w:i/>
           <w:color w:val="000000"/>
-          <w:sz w:val="20"/>
+          <w:sz w:val="16"/>
         </w:rPr>
         <w:t>NE BI GLEDAO SVOJE RANE I BOLI</w:t>
       </w:r>
@@ -443,7 +443,7 @@
           <w:b/>
           <w:i/>
           <w:color w:val="000000"/>
-          <w:sz w:val="20"/>
+          <w:sz w:val="16"/>
         </w:rPr>
         <w:t>GLEDAO BI SAMO MOJU LJUBAV</w:t>
       </w:r>
@@ -459,7 +459,7 @@
           <w:b/>
           <w:i/>
           <w:color w:val="000000"/>
-          <w:sz w:val="20"/>
+          <w:sz w:val="16"/>
         </w:rPr>
         <w:t>KOJA BI TE LIJEČILA</w:t>
       </w:r>
@@ -474,7 +474,7 @@
           <w:b w:val="0"/>
           <w:i w:val="0"/>
           <w:color w:val="000000"/>
-          <w:sz w:val="20"/>
+          <w:sz w:val="16"/>
         </w:rPr>
         <w:t>____________________________________________________________</w:t>
       </w:r>
@@ -489,7 +489,7 @@
           <w:b w:val="0"/>
           <w:i w:val="0"/>
           <w:color w:val="000000"/>
-          <w:sz w:val="20"/>
+          <w:sz w:val="16"/>
         </w:rPr>
         <w:t>Isus je sa nama</w:t>
       </w:r>
@@ -504,7 +504,7 @@
           <w:b w:val="0"/>
           <w:i w:val="0"/>
           <w:color w:val="000000"/>
-          <w:sz w:val="20"/>
+          <w:sz w:val="16"/>
         </w:rPr>
         <w:t>Ovdje sad, ovdje sad</w:t>
       </w:r>
@@ -519,7 +519,7 @@
           <w:b w:val="0"/>
           <w:i w:val="0"/>
           <w:color w:val="000000"/>
-          <w:sz w:val="20"/>
+          <w:sz w:val="16"/>
         </w:rPr>
         <w:t>Tlo gdje sad stojim ja</w:t>
       </w:r>
@@ -534,7 +534,7 @@
           <w:b w:val="0"/>
           <w:i w:val="0"/>
           <w:color w:val="000000"/>
-          <w:sz w:val="20"/>
+          <w:sz w:val="16"/>
         </w:rPr>
         <w:t>Sveto je zbog Njega</w:t>
       </w:r>
@@ -549,7 +549,7 @@
           <w:b w:val="0"/>
           <w:i w:val="0"/>
           <w:color w:val="000000"/>
-          <w:sz w:val="20"/>
+          <w:sz w:val="16"/>
         </w:rPr>
         <w:t>Bozji Duh prebiva</w:t>
       </w:r>
@@ -564,7 +564,7 @@
           <w:b w:val="0"/>
           <w:i w:val="0"/>
           <w:color w:val="000000"/>
-          <w:sz w:val="20"/>
+          <w:sz w:val="16"/>
         </w:rPr>
         <w:t>Ovdje sad, medj’ nama</w:t>
       </w:r>
@@ -579,7 +579,7 @@
           <w:b w:val="0"/>
           <w:i w:val="0"/>
           <w:color w:val="000000"/>
-          <w:sz w:val="20"/>
+          <w:sz w:val="16"/>
         </w:rPr>
         <w:t>Svaki te otkucaj</w:t>
       </w:r>
@@ -594,7 +594,7 @@
           <w:b w:val="0"/>
           <w:i w:val="0"/>
           <w:color w:val="000000"/>
-          <w:sz w:val="20"/>
+          <w:sz w:val="16"/>
         </w:rPr>
         <w:t>Srca mog doziva</w:t>
       </w:r>
@@ -609,7 +609,7 @@
           <w:b w:val="0"/>
           <w:i w:val="0"/>
           <w:color w:val="000000"/>
-          <w:sz w:val="20"/>
+          <w:sz w:val="16"/>
         </w:rPr>
         <w:t>Tebe cu dovijeka slaviti ja</w:t>
       </w:r>
@@ -624,7 +624,7 @@
           <w:b w:val="0"/>
           <w:i w:val="0"/>
           <w:color w:val="000000"/>
-          <w:sz w:val="20"/>
+          <w:sz w:val="16"/>
         </w:rPr>
         <w:t>Sa svim andjelima i svim svecima</w:t>
       </w:r>
@@ -639,7 +639,7 @@
           <w:b w:val="0"/>
           <w:i w:val="0"/>
           <w:color w:val="000000"/>
-          <w:sz w:val="20"/>
+          <w:sz w:val="16"/>
         </w:rPr>
         <w:t>Cija slava i hvala Tvog imena</w:t>
       </w:r>
@@ -654,7 +654,7 @@
           <w:b w:val="0"/>
           <w:i w:val="0"/>
           <w:color w:val="000000"/>
-          <w:sz w:val="20"/>
+          <w:sz w:val="16"/>
         </w:rPr>
         <w:t>Odjekuje nebesima</w:t>
       </w:r>
@@ -670,7 +670,7 @@
           <w:b/>
           <w:i/>
           <w:color w:val="000000"/>
-          <w:sz w:val="20"/>
+          <w:sz w:val="16"/>
         </w:rPr>
         <w:t>Svet si, svet si, svet si Bog</w:t>
       </w:r>
@@ -686,7 +686,7 @@
           <w:b/>
           <w:i/>
           <w:color w:val="000000"/>
-          <w:sz w:val="20"/>
+          <w:sz w:val="16"/>
         </w:rPr>
         <w:t>Vjecni kralj si srca mog.</w:t>
       </w:r>
@@ -702,7 +702,7 @@
           <w:b/>
           <w:i/>
           <w:color w:val="000000"/>
-          <w:sz w:val="20"/>
+          <w:sz w:val="16"/>
         </w:rPr>
         <w:t>Jer si bio, I jesi</w:t>
       </w:r>
@@ -718,7 +718,7 @@
           <w:b/>
           <w:i/>
           <w:color w:val="000000"/>
-          <w:sz w:val="20"/>
+          <w:sz w:val="16"/>
         </w:rPr>
         <w:t>I uvijek ces biti</w:t>
       </w:r>
@@ -734,7 +734,7 @@
           <w:b/>
           <w:i/>
           <w:color w:val="000000"/>
-          <w:sz w:val="20"/>
+          <w:sz w:val="16"/>
         </w:rPr>
         <w:t>Moj Bog sve moje, sto imam je Tvoje</w:t>
       </w:r>
@@ -750,7 +750,7 @@
           <w:b/>
           <w:i/>
           <w:color w:val="000000"/>
-          <w:sz w:val="20"/>
+          <w:sz w:val="16"/>
         </w:rPr>
         <w:t>Svet si, svet si Bog</w:t>
       </w:r>
@@ -765,7 +765,7 @@
           <w:b w:val="0"/>
           <w:i w:val="0"/>
           <w:color w:val="000000"/>
-          <w:sz w:val="20"/>
+          <w:sz w:val="16"/>
         </w:rPr>
         <w:t>Njezno me pozivas</w:t>
       </w:r>
@@ -780,7 +780,7 @@
           <w:b w:val="0"/>
           <w:i w:val="0"/>
           <w:color w:val="000000"/>
-          <w:sz w:val="20"/>
+          <w:sz w:val="16"/>
         </w:rPr>
         <w:t>Imenom dozivas</w:t>
       </w:r>
@@ -795,7 +795,7 @@
           <w:b w:val="0"/>
           <w:i w:val="0"/>
           <w:color w:val="000000"/>
-          <w:sz w:val="20"/>
+          <w:sz w:val="16"/>
         </w:rPr>
         <w:t>Zelim te slijediti</w:t>
       </w:r>
@@ -810,7 +810,7 @@
           <w:b w:val="0"/>
           <w:i w:val="0"/>
           <w:color w:val="000000"/>
-          <w:sz w:val="20"/>
+          <w:sz w:val="16"/>
         </w:rPr>
         <w:t>Tvoju rijec vrsiti</w:t>
       </w:r>
@@ -826,7 +826,7 @@
           <w:b/>
           <w:i/>
           <w:color w:val="000000"/>
-          <w:sz w:val="20"/>
+          <w:sz w:val="16"/>
         </w:rPr>
         <w:t>U Kraljevstvo me pozivas</w:t>
       </w:r>
@@ -842,7 +842,7 @@
           <w:b/>
           <w:i/>
           <w:color w:val="000000"/>
-          <w:sz w:val="20"/>
+          <w:sz w:val="16"/>
         </w:rPr>
         <w:t>Da slavu Tvoju gledam ja</w:t>
       </w:r>
@@ -858,7 +858,7 @@
           <w:b/>
           <w:i/>
           <w:color w:val="000000"/>
-          <w:sz w:val="20"/>
+          <w:sz w:val="16"/>
         </w:rPr>
         <w:t>Da te vidim, da te slavim</w:t>
       </w:r>
@@ -874,7 +874,7 @@
           <w:b/>
           <w:i/>
           <w:color w:val="000000"/>
-          <w:sz w:val="20"/>
+          <w:sz w:val="16"/>
         </w:rPr>
         <w:t>Da se klanjam</w:t>
       </w:r>
@@ -889,7 +889,7 @@
           <w:b w:val="0"/>
           <w:i w:val="0"/>
           <w:color w:val="000000"/>
-          <w:sz w:val="20"/>
+          <w:sz w:val="16"/>
         </w:rPr>
         <w:t>____________________________________________________________</w:t>
       </w:r>
@@ -904,7 +904,7 @@
           <w:b w:val="0"/>
           <w:i w:val="0"/>
           <w:color w:val="000000"/>
-          <w:sz w:val="20"/>
+          <w:sz w:val="16"/>
         </w:rPr>
         <w:t>što više tražim više te nađem</w:t>
       </w:r>
@@ -919,7 +919,7 @@
           <w:b w:val="0"/>
           <w:i w:val="0"/>
           <w:color w:val="000000"/>
-          <w:sz w:val="20"/>
+          <w:sz w:val="16"/>
         </w:rPr>
         <w:t>što više nađem više te volim</w:t>
       </w:r>
@@ -935,7 +935,7 @@
           <w:b/>
           <w:i/>
           <w:color w:val="000000"/>
-          <w:sz w:val="20"/>
+          <w:sz w:val="16"/>
         </w:rPr>
         <w:t>želim sad sjediti tu i samo slušati te</w:t>
       </w:r>
@@ -951,7 +951,7 @@
           <w:b/>
           <w:i/>
           <w:color w:val="000000"/>
-          <w:sz w:val="20"/>
+          <w:sz w:val="16"/>
         </w:rPr>
         <w:t>bit u tvom zagrljaju i uživati</w:t>
       </w:r>
@@ -967,7 +967,7 @@
           <w:b/>
           <w:i/>
           <w:color w:val="000000"/>
-          <w:sz w:val="20"/>
+          <w:sz w:val="16"/>
         </w:rPr>
         <w:t>jer ljubav je ta tako neodoljiva</w:t>
       </w:r>
@@ -983,7 +983,7 @@
           <w:b/>
           <w:i/>
           <w:color w:val="000000"/>
-          <w:sz w:val="20"/>
+          <w:sz w:val="16"/>
         </w:rPr>
         <w:t>ja rastapam se u tvom miru.</w:t>
       </w:r>
@@ -998,7 +998,7 @@
           <w:b w:val="0"/>
           <w:i w:val="0"/>
           <w:color w:val="000000"/>
-          <w:sz w:val="20"/>
+          <w:sz w:val="16"/>
         </w:rPr>
         <w:t>____________________________________________________________</w:t>
       </w:r>
@@ -1013,7 +1013,7 @@
           <w:b w:val="0"/>
           <w:i w:val="0"/>
           <w:color w:val="000000"/>
-          <w:sz w:val="20"/>
+          <w:sz w:val="16"/>
         </w:rPr>
         <w:t>Znam da zoveš al se bojim hoću li potonuti</w:t>
       </w:r>
@@ -1028,7 +1028,7 @@
           <w:b w:val="0"/>
           <w:i w:val="0"/>
           <w:color w:val="000000"/>
-          <w:sz w:val="20"/>
+          <w:sz w:val="16"/>
         </w:rPr>
         <w:t>Ti si tajna kojoj idem u vjeri ja ću hodati</w:t>
       </w:r>
@@ -1044,7 +1044,7 @@
           <w:b/>
           <w:i/>
           <w:color w:val="000000"/>
-          <w:sz w:val="20"/>
+          <w:sz w:val="16"/>
         </w:rPr>
         <w:t>ime tvoje zazvat ću i gledat gore iznad svih valova</w:t>
       </w:r>
@@ -1060,7 +1060,7 @@
           <w:b/>
           <w:i/>
           <w:color w:val="000000"/>
-          <w:sz w:val="20"/>
+          <w:sz w:val="16"/>
         </w:rPr>
         <w:t>U Tebi mirna ostat ću Tvoja sam i Ti si moj</w:t>
       </w:r>
@@ -1075,7 +1075,7 @@
           <w:b w:val="0"/>
           <w:i w:val="0"/>
           <w:color w:val="000000"/>
-          <w:sz w:val="20"/>
+          <w:sz w:val="16"/>
         </w:rPr>
         <w:t>Dubine čuva Tvoja milost i moćna ti desnica</w:t>
       </w:r>
@@ -1090,7 +1090,7 @@
           <w:b w:val="0"/>
           <w:i w:val="0"/>
           <w:color w:val="000000"/>
-          <w:sz w:val="20"/>
+          <w:sz w:val="16"/>
         </w:rPr>
         <w:t>kad krene strah i dođe slabost Ti ostat ćeš moja pobjeda</w:t>
       </w:r>
@@ -1106,7 +1106,7 @@
           <w:b/>
           <w:i/>
           <w:color w:val="000000"/>
-          <w:sz w:val="20"/>
+          <w:sz w:val="16"/>
         </w:rPr>
         <w:t>Duše sveti napoj srce povjerenjem gdje god zoveš daj</w:t>
       </w:r>
@@ -1122,7 +1122,7 @@
           <w:b/>
           <w:i/>
           <w:color w:val="000000"/>
-          <w:sz w:val="20"/>
+          <w:sz w:val="16"/>
         </w:rPr>
         <w:t>Ti me vodi gdje su najveće dubine Diži vjeru u visine Znam</w:t>
       </w:r>
@@ -1137,7 +1137,7 @@
           <w:b w:val="0"/>
           <w:i w:val="0"/>
           <w:color w:val="000000"/>
-          <w:sz w:val="20"/>
+          <w:sz w:val="16"/>
         </w:rPr>
         <w:t>____________________________________________________________</w:t>
       </w:r>
@@ -1152,7 +1152,7 @@
           <w:b w:val="0"/>
           <w:i w:val="0"/>
           <w:color w:val="000000"/>
-          <w:sz w:val="20"/>
+          <w:sz w:val="16"/>
         </w:rPr>
         <w:t>fis</w:t>
       </w:r>
@@ -1167,7 +1167,7 @@
           <w:b w:val="0"/>
           <w:i w:val="0"/>
           <w:color w:val="000000"/>
-          <w:sz w:val="20"/>
+          <w:sz w:val="16"/>
         </w:rPr>
         <w:t>Ja dolazim pred Tvoje lice</w:t>
       </w:r>
@@ -1182,7 +1182,7 @@
           <w:b w:val="0"/>
           <w:i w:val="0"/>
           <w:color w:val="000000"/>
-          <w:sz w:val="20"/>
+          <w:sz w:val="16"/>
         </w:rPr>
         <w:t>Jer žrtva čista predana je</w:t>
       </w:r>
@@ -1197,7 +1197,7 @@
           <w:b w:val="0"/>
           <w:i w:val="0"/>
           <w:color w:val="000000"/>
-          <w:sz w:val="20"/>
+          <w:sz w:val="16"/>
         </w:rPr>
         <w:t>Ja ulazim da uvijek slavim</w:t>
       </w:r>
@@ -1212,7 +1212,7 @@
           <w:b w:val="0"/>
           <w:i w:val="0"/>
           <w:color w:val="000000"/>
-          <w:sz w:val="20"/>
+          <w:sz w:val="16"/>
         </w:rPr>
         <w:t>To Presveto Ime Jahve</w:t>
       </w:r>
@@ -1227,7 +1227,7 @@
           <w:b w:val="0"/>
           <w:i w:val="0"/>
           <w:color w:val="000000"/>
-          <w:sz w:val="20"/>
+          <w:sz w:val="16"/>
         </w:rPr>
         <w:t>Bože slavim Te</w:t>
       </w:r>
@@ -1242,7 +1242,7 @@
           <w:b w:val="0"/>
           <w:i w:val="0"/>
           <w:color w:val="000000"/>
-          <w:sz w:val="20"/>
+          <w:sz w:val="16"/>
         </w:rPr>
         <w:t>Obožavam Te</w:t>
       </w:r>
@@ -1258,7 +1258,7 @@
           <w:b/>
           <w:i/>
           <w:color w:val="000000"/>
-          <w:sz w:val="20"/>
+          <w:sz w:val="16"/>
         </w:rPr>
         <w:t>Ime ti je Sveti</w:t>
       </w:r>
@@ -1274,7 +1274,7 @@
           <w:b/>
           <w:i/>
           <w:color w:val="000000"/>
-          <w:sz w:val="20"/>
+          <w:sz w:val="16"/>
         </w:rPr>
         <w:t>Sveti Bog</w:t>
       </w:r>
@@ -1289,7 +1289,7 @@
           <w:b w:val="0"/>
           <w:i w:val="0"/>
           <w:color w:val="000000"/>
-          <w:sz w:val="20"/>
+          <w:sz w:val="16"/>
         </w:rPr>
         <w:t>____________________________________________________________</w:t>
       </w:r>
@@ -1304,7 +1304,7 @@
           <w:b w:val="0"/>
           <w:i w:val="0"/>
           <w:color w:val="000000"/>
-          <w:sz w:val="20"/>
+          <w:sz w:val="16"/>
         </w:rPr>
         <w:t>Iznad svih sila i kraljeva Iznad sve prirode i svega stvorenog</w:t>
       </w:r>
@@ -1319,7 +1319,7 @@
           <w:b w:val="0"/>
           <w:i w:val="0"/>
           <w:color w:val="000000"/>
-          <w:sz w:val="20"/>
+          <w:sz w:val="16"/>
         </w:rPr>
         <w:t>Iznad sve mudrosti i ljudskih putova</w:t>
       </w:r>
@@ -1334,7 +1334,7 @@
           <w:b w:val="0"/>
           <w:i w:val="0"/>
           <w:color w:val="000000"/>
-          <w:sz w:val="20"/>
+          <w:sz w:val="16"/>
         </w:rPr>
         <w:t>Ti si bio prije stvaranja</w:t>
       </w:r>
@@ -1349,7 +1349,7 @@
           <w:b w:val="0"/>
           <w:i w:val="0"/>
           <w:color w:val="000000"/>
-          <w:sz w:val="20"/>
+          <w:sz w:val="16"/>
         </w:rPr>
         <w:t>Iznad svih kraljevstva i prijestolja</w:t>
       </w:r>
@@ -1364,7 +1364,7 @@
           <w:b w:val="0"/>
           <w:i w:val="0"/>
           <w:color w:val="000000"/>
-          <w:sz w:val="20"/>
+          <w:sz w:val="16"/>
         </w:rPr>
         <w:t>Iznad svih čuda što svijet ih poznaje</w:t>
       </w:r>
@@ -1379,7 +1379,7 @@
           <w:b w:val="0"/>
           <w:i w:val="0"/>
           <w:color w:val="000000"/>
-          <w:sz w:val="20"/>
+          <w:sz w:val="16"/>
         </w:rPr>
         <w:t>Iznad sveg obilja bogatstva zemaljskog</w:t>
       </w:r>
@@ -1394,7 +1394,7 @@
           <w:b w:val="0"/>
           <w:i w:val="0"/>
           <w:color w:val="000000"/>
-          <w:sz w:val="20"/>
+          <w:sz w:val="16"/>
         </w:rPr>
         <w:t>Vrijednost tvoja neizmjerna je</w:t>
       </w:r>
@@ -1410,7 +1410,7 @@
           <w:b/>
           <w:i/>
           <w:color w:val="000000"/>
-          <w:sz w:val="20"/>
+          <w:sz w:val="16"/>
         </w:rPr>
         <w:t>Razapet u grob položen</w:t>
       </w:r>
@@ -1426,7 +1426,7 @@
           <w:b/>
           <w:i/>
           <w:color w:val="000000"/>
-          <w:sz w:val="20"/>
+          <w:sz w:val="16"/>
         </w:rPr>
         <w:t>Živio da budeš odbačen Kao ruža zgažena na tlu</w:t>
       </w:r>
@@ -1442,7 +1442,7 @@
           <w:b/>
           <w:i/>
           <w:color w:val="000000"/>
-          <w:sz w:val="20"/>
+          <w:sz w:val="16"/>
         </w:rPr>
         <w:t>Grijeh uzeo misleći na mene</w:t>
       </w:r>
@@ -1458,7 +1458,7 @@
           <w:b/>
           <w:i/>
           <w:color w:val="000000"/>
-          <w:sz w:val="20"/>
+          <w:sz w:val="16"/>
         </w:rPr>
         <w:t>solo</w:t>
       </w:r>
@@ -1473,7 +1473,7 @@
           <w:b w:val="0"/>
           <w:i w:val="0"/>
           <w:color w:val="000000"/>
-          <w:sz w:val="20"/>
+          <w:sz w:val="16"/>
         </w:rPr>
         <w:t>____________________________________________________________</w:t>
       </w:r>
@@ -1488,7 +1488,7 @@
           <w:b w:val="0"/>
           <w:i w:val="0"/>
           <w:color w:val="000000"/>
-          <w:sz w:val="20"/>
+          <w:sz w:val="16"/>
         </w:rPr>
         <w:t>ljepota kralja mog veličanstvenog</w:t>
       </w:r>
@@ -1503,7 +1503,7 @@
           <w:b w:val="0"/>
           <w:i w:val="0"/>
           <w:color w:val="000000"/>
-          <w:sz w:val="20"/>
+          <w:sz w:val="16"/>
         </w:rPr>
         <w:t>zemlju raduje zemlju raduje</w:t>
       </w:r>
@@ -1518,7 +1518,7 @@
           <w:b w:val="0"/>
           <w:i w:val="0"/>
           <w:color w:val="000000"/>
-          <w:sz w:val="20"/>
+          <w:sz w:val="16"/>
         </w:rPr>
         <w:t>u sjaj zaodjeven tama uzmiče</w:t>
       </w:r>
@@ -1533,7 +1533,7 @@
           <w:b w:val="0"/>
           <w:i w:val="0"/>
           <w:color w:val="000000"/>
-          <w:sz w:val="20"/>
+          <w:sz w:val="16"/>
         </w:rPr>
         <w:t>od glasa njegovog drhti svako zlo</w:t>
       </w:r>
@@ -1549,7 +1549,7 @@
           <w:b/>
           <w:i/>
           <w:color w:val="000000"/>
-          <w:sz w:val="20"/>
+          <w:sz w:val="16"/>
         </w:rPr>
         <w:t>nas Bog je velik pjevaj s nama</w:t>
       </w:r>
@@ -1565,7 +1565,7 @@
           <w:b/>
           <w:i/>
           <w:color w:val="000000"/>
-          <w:sz w:val="20"/>
+          <w:sz w:val="16"/>
         </w:rPr>
         <w:t>Bog je velik i svi će vidjeti</w:t>
       </w:r>
@@ -1581,7 +1581,7 @@
           <w:b/>
           <w:i/>
           <w:color w:val="000000"/>
-          <w:sz w:val="20"/>
+          <w:sz w:val="16"/>
         </w:rPr>
         <w:t>naš Bog je velik</w:t>
       </w:r>
@@ -1596,7 +1596,7 @@
           <w:b w:val="0"/>
           <w:i w:val="0"/>
           <w:color w:val="000000"/>
-          <w:sz w:val="20"/>
+          <w:sz w:val="16"/>
         </w:rPr>
         <w:t>vječno vlada on u ruci drži sve</w:t>
       </w:r>
@@ -1611,7 +1611,7 @@
           <w:b w:val="0"/>
           <w:i w:val="0"/>
           <w:color w:val="000000"/>
-          <w:sz w:val="20"/>
+          <w:sz w:val="16"/>
         </w:rPr>
         <w:t>početak je i kraj početak je i kraj</w:t>
       </w:r>
@@ -1626,7 +1626,7 @@
           <w:b w:val="0"/>
           <w:i w:val="0"/>
           <w:color w:val="000000"/>
-          <w:sz w:val="20"/>
+          <w:sz w:val="16"/>
         </w:rPr>
         <w:t>trojedini Bog Otac Sin i Duh</w:t>
       </w:r>
@@ -1641,7 +1641,7 @@
           <w:b w:val="0"/>
           <w:i w:val="0"/>
           <w:color w:val="000000"/>
-          <w:sz w:val="20"/>
+          <w:sz w:val="16"/>
         </w:rPr>
         <w:t>Janje je i kralj naš otkupitelj</w:t>
       </w:r>
@@ -1657,7 +1657,7 @@
           <w:b/>
           <w:i/>
           <w:color w:val="000000"/>
-          <w:sz w:val="20"/>
+          <w:sz w:val="16"/>
         </w:rPr>
         <w:t>ime najveće vrijedno slavljenja</w:t>
       </w:r>
@@ -1673,7 +1673,7 @@
           <w:b/>
           <w:i/>
           <w:color w:val="000000"/>
-          <w:sz w:val="20"/>
+          <w:sz w:val="16"/>
         </w:rPr>
         <w:t>srcem pjevam Bog je velik</w:t>
       </w:r>
@@ -1688,7 +1688,7 @@
           <w:b w:val="0"/>
           <w:i w:val="0"/>
           <w:color w:val="000000"/>
-          <w:sz w:val="20"/>
+          <w:sz w:val="16"/>
         </w:rPr>
         <w:t>____________________________________________________________</w:t>
       </w:r>
@@ -1703,7 +1703,7 @@
           <w:b w:val="0"/>
           <w:i w:val="0"/>
           <w:color w:val="000000"/>
-          <w:sz w:val="20"/>
+          <w:sz w:val="16"/>
         </w:rPr>
         <w:t>Blagoslovljen Bog i presveto mu ime</w:t>
       </w:r>
@@ -1718,7 +1718,7 @@
           <w:b w:val="0"/>
           <w:i w:val="0"/>
           <w:color w:val="000000"/>
-          <w:sz w:val="20"/>
+          <w:sz w:val="16"/>
         </w:rPr>
         <w:t>Blagoslovljen Bog on život daruje</w:t>
       </w:r>
@@ -1733,7 +1733,7 @@
           <w:b w:val="0"/>
           <w:i w:val="0"/>
           <w:color w:val="000000"/>
-          <w:sz w:val="20"/>
+          <w:sz w:val="16"/>
         </w:rPr>
         <w:t>____________________________________________________________</w:t>
       </w:r>
@@ -1748,7 +1748,7 @@
           <w:b w:val="0"/>
           <w:i w:val="0"/>
           <w:color w:val="000000"/>
-          <w:sz w:val="20"/>
+          <w:sz w:val="16"/>
         </w:rPr>
         <w:t>Ohrabri se, brigu ti svu</w:t>
       </w:r>
@@ -1763,7 +1763,7 @@
           <w:b w:val="0"/>
           <w:i w:val="0"/>
           <w:color w:val="000000"/>
-          <w:sz w:val="20"/>
+          <w:sz w:val="16"/>
         </w:rPr>
         <w:t>On može ponijeti</w:t>
       </w:r>
@@ -1778,7 +1778,7 @@
           <w:b w:val="0"/>
           <w:i w:val="0"/>
           <w:color w:val="000000"/>
-          <w:sz w:val="20"/>
+          <w:sz w:val="16"/>
         </w:rPr>
         <w:t>goru će svaku sa puta</w:t>
       </w:r>
@@ -1793,7 +1793,7 @@
           <w:b w:val="0"/>
           <w:i w:val="0"/>
           <w:color w:val="000000"/>
-          <w:sz w:val="20"/>
+          <w:sz w:val="16"/>
         </w:rPr>
         <w:t>tvoga premjestiti.</w:t>
       </w:r>
@@ -1808,7 +1808,7 @@
           <w:b w:val="0"/>
           <w:i w:val="0"/>
           <w:color w:val="000000"/>
-          <w:sz w:val="20"/>
+          <w:sz w:val="16"/>
         </w:rPr>
         <w:t>Ne boj se valova tih</w:t>
       </w:r>
@@ -1823,7 +1823,7 @@
           <w:b w:val="0"/>
           <w:i w:val="0"/>
           <w:color w:val="000000"/>
-          <w:sz w:val="20"/>
+          <w:sz w:val="16"/>
         </w:rPr>
         <w:t>neće te prekriti</w:t>
       </w:r>
@@ -1838,7 +1838,7 @@
           <w:b w:val="0"/>
           <w:i w:val="0"/>
           <w:color w:val="000000"/>
-          <w:sz w:val="20"/>
+          <w:sz w:val="16"/>
         </w:rPr>
         <w:t>suzu će svaku tvoj Bog</w:t>
       </w:r>
@@ -1853,7 +1853,7 @@
           <w:b w:val="0"/>
           <w:i w:val="0"/>
           <w:color w:val="000000"/>
-          <w:sz w:val="20"/>
+          <w:sz w:val="16"/>
         </w:rPr>
         <w:t>s lica obrisati.</w:t>
       </w:r>
@@ -1869,7 +1869,7 @@
           <w:b/>
           <w:i/>
           <w:color w:val="000000"/>
-          <w:sz w:val="20"/>
+          <w:sz w:val="16"/>
         </w:rPr>
         <w:t>Ako nosi On cijeli taj svijet</w:t>
       </w:r>
@@ -1885,7 +1885,7 @@
           <w:b/>
           <w:i/>
           <w:color w:val="000000"/>
-          <w:sz w:val="20"/>
+          <w:sz w:val="16"/>
         </w:rPr>
         <w:t>na svome dlanu</w:t>
       </w:r>
@@ -1901,7 +1901,7 @@
           <w:b/>
           <w:i/>
           <w:color w:val="000000"/>
-          <w:sz w:val="20"/>
+          <w:sz w:val="16"/>
         </w:rPr>
         <w:t>daj Mu svoj život</w:t>
       </w:r>
@@ -1917,7 +1917,7 @@
           <w:b/>
           <w:i/>
           <w:color w:val="000000"/>
-          <w:sz w:val="20"/>
+          <w:sz w:val="16"/>
         </w:rPr>
         <w:t>i tebe nosit će On</w:t>
       </w:r>
@@ -2301,7 +2301,7 @@
     </w:pPr>
     <w:rPr>
       <w:rFonts w:ascii="Times New Roman" w:hAnsi="Times New Roman"/>
-      <w:sz w:val="20"/>
+      <w:sz w:val="16"/>
     </w:rPr>
   </w:style>
   <w:style w:type="paragraph" w:styleId="Header">

</xml_diff>

<commit_message>
Vrati font na 10pt
https://claude.ai/code/session_017JvMZHvCbCck4PdkCA67A3
</commit_message>
<xml_diff>
--- a/output_test.docx
+++ b/output_test.docx
@@ -13,7 +13,7 @@
           <w:b/>
           <w:i/>
           <w:color w:val="000000"/>
-          <w:sz w:val="16"/>
+          <w:sz w:val="20"/>
         </w:rPr>
         <w:t>OČE, MI TI SE KLANJAMO</w:t>
       </w:r>
@@ -29,7 +29,7 @@
           <w:b/>
           <w:i/>
           <w:color w:val="000000"/>
-          <w:sz w:val="16"/>
+          <w:sz w:val="20"/>
         </w:rPr>
         <w:t>SVOJ TI ŽIVOT DAJEMO.</w:t>
       </w:r>
@@ -45,7 +45,7 @@
           <w:b/>
           <w:i/>
           <w:color w:val="000000"/>
-          <w:sz w:val="16"/>
+          <w:sz w:val="20"/>
         </w:rPr>
         <w:t>MI TE LJUBIMO!</w:t>
       </w:r>
@@ -61,7 +61,7 @@
           <w:b/>
           <w:i/>
           <w:color w:val="000000"/>
-          <w:sz w:val="16"/>
+          <w:sz w:val="20"/>
         </w:rPr>
         <w:t>SINE, MI TI SE KLANJAMO...</w:t>
       </w:r>
@@ -77,7 +77,7 @@
           <w:b/>
           <w:i/>
           <w:color w:val="000000"/>
-          <w:sz w:val="16"/>
+          <w:sz w:val="20"/>
         </w:rPr>
         <w:t>DUŠE, MI TI SE KLANJAMO...</w:t>
       </w:r>
@@ -93,7 +93,7 @@
           <w:b/>
           <w:i/>
           <w:color w:val="000000"/>
-          <w:sz w:val="16"/>
+          <w:sz w:val="20"/>
         </w:rPr>
         <w:t>TROJSTVO, MI TI SE KLANJAMO</w:t>
       </w:r>
@@ -108,7 +108,7 @@
           <w:b w:val="0"/>
           <w:i w:val="0"/>
           <w:color w:val="000000"/>
-          <w:sz w:val="16"/>
+          <w:sz w:val="20"/>
         </w:rPr>
         <w:t>____________________________________________________________</w:t>
       </w:r>
@@ -124,7 +124,7 @@
           <w:b/>
           <w:i/>
           <w:color w:val="000000"/>
-          <w:sz w:val="16"/>
+          <w:sz w:val="20"/>
         </w:rPr>
         <w:t>Iiiisus, Iiisuuus</w:t>
       </w:r>
@@ -140,7 +140,7 @@
           <w:b/>
           <w:i/>
           <w:color w:val="000000"/>
-          <w:sz w:val="16"/>
+          <w:sz w:val="20"/>
         </w:rPr>
         <w:t>Isus, Isus,Isus</w:t>
       </w:r>
@@ -155,7 +155,7 @@
           <w:b w:val="0"/>
           <w:i w:val="0"/>
           <w:color w:val="000000"/>
-          <w:sz w:val="16"/>
+          <w:sz w:val="20"/>
         </w:rPr>
         <w:t>za me umre</w:t>
       </w:r>
@@ -170,7 +170,7 @@
           <w:b w:val="0"/>
           <w:i w:val="0"/>
           <w:color w:val="000000"/>
-          <w:sz w:val="16"/>
+          <w:sz w:val="20"/>
         </w:rPr>
         <w:t>on traži me</w:t>
       </w:r>
@@ -185,7 +185,7 @@
           <w:b w:val="0"/>
           <w:i w:val="0"/>
           <w:color w:val="000000"/>
-          <w:sz w:val="16"/>
+          <w:sz w:val="20"/>
         </w:rPr>
         <w:t>on ljubi me</w:t>
       </w:r>
@@ -200,7 +200,7 @@
           <w:b w:val="0"/>
           <w:i w:val="0"/>
           <w:color w:val="000000"/>
-          <w:sz w:val="16"/>
+          <w:sz w:val="20"/>
         </w:rPr>
         <w:t>on voli me</w:t>
       </w:r>
@@ -215,7 +215,7 @@
           <w:b w:val="0"/>
           <w:i w:val="0"/>
           <w:color w:val="000000"/>
-          <w:sz w:val="16"/>
+          <w:sz w:val="20"/>
         </w:rPr>
         <w:t>prašta mi</w:t>
       </w:r>
@@ -230,7 +230,7 @@
           <w:b w:val="0"/>
           <w:i w:val="0"/>
           <w:color w:val="000000"/>
-          <w:sz w:val="16"/>
+          <w:sz w:val="20"/>
         </w:rPr>
         <w:t>Emanuel, Emanuel</w:t>
       </w:r>
@@ -245,7 +245,7 @@
           <w:b w:val="0"/>
           <w:i w:val="0"/>
           <w:color w:val="000000"/>
-          <w:sz w:val="16"/>
+          <w:sz w:val="20"/>
         </w:rPr>
         <w:t>I s u s, I s u s</w:t>
       </w:r>
@@ -260,7 +260,7 @@
           <w:b w:val="0"/>
           <w:i w:val="0"/>
           <w:color w:val="000000"/>
-          <w:sz w:val="16"/>
+          <w:sz w:val="20"/>
         </w:rPr>
         <w:t>Emanuel</w:t>
       </w:r>
@@ -275,7 +275,7 @@
           <w:b w:val="0"/>
           <w:i w:val="0"/>
           <w:color w:val="000000"/>
-          <w:sz w:val="16"/>
+          <w:sz w:val="20"/>
         </w:rPr>
         <w:t>On je živ...</w:t>
       </w:r>
@@ -290,7 +290,7 @@
           <w:b w:val="0"/>
           <w:i w:val="0"/>
           <w:color w:val="000000"/>
-          <w:sz w:val="16"/>
+          <w:sz w:val="20"/>
         </w:rPr>
         <w:t>On je tu...</w:t>
       </w:r>
@@ -305,7 +305,7 @@
           <w:b w:val="0"/>
           <w:i w:val="0"/>
           <w:color w:val="000000"/>
-          <w:sz w:val="16"/>
+          <w:sz w:val="20"/>
         </w:rPr>
         <w:t>Aleluja ...</w:t>
       </w:r>
@@ -320,7 +320,7 @@
           <w:b w:val="0"/>
           <w:i w:val="0"/>
           <w:color w:val="000000"/>
-          <w:sz w:val="16"/>
+          <w:sz w:val="20"/>
         </w:rPr>
         <w:t>____________________________________________________________</w:t>
       </w:r>
@@ -335,7 +335,7 @@
           <w:b w:val="0"/>
           <w:i w:val="0"/>
           <w:color w:val="000000"/>
-          <w:sz w:val="16"/>
+          <w:sz w:val="20"/>
         </w:rPr>
         <w:t>ŠUTIM POPUT GRLICE</w:t>
       </w:r>
@@ -350,7 +350,7 @@
           <w:b w:val="0"/>
           <w:i w:val="0"/>
           <w:color w:val="000000"/>
-          <w:sz w:val="16"/>
+          <w:sz w:val="20"/>
         </w:rPr>
         <w:t>ZAKLONJEN U LJUBAV</w:t>
       </w:r>
@@ -365,7 +365,7 @@
           <w:b w:val="0"/>
           <w:i w:val="0"/>
           <w:color w:val="000000"/>
-          <w:sz w:val="16"/>
+          <w:sz w:val="20"/>
         </w:rPr>
         <w:t>ISPRED</w:t>
       </w:r>
@@ -380,7 +380,7 @@
           <w:b w:val="0"/>
           <w:i w:val="0"/>
           <w:color w:val="000000"/>
-          <w:sz w:val="16"/>
+          <w:sz w:val="20"/>
         </w:rPr>
         <w:t>BIJELE HOSTIJE</w:t>
       </w:r>
@@ -395,7 +395,7 @@
           <w:b w:val="0"/>
           <w:i w:val="0"/>
           <w:color w:val="000000"/>
-          <w:sz w:val="16"/>
+          <w:sz w:val="20"/>
         </w:rPr>
         <w:t>I SLUŠAM KAKO MI GOVORIŠ</w:t>
       </w:r>
@@ -411,7 +411,7 @@
           <w:b/>
           <w:i/>
           <w:color w:val="000000"/>
-          <w:sz w:val="16"/>
+          <w:sz w:val="20"/>
         </w:rPr>
         <w:t>KAD BI ZNAO KOLIKO TE LJUBIM</w:t>
       </w:r>
@@ -427,7 +427,7 @@
           <w:b/>
           <w:i/>
           <w:color w:val="000000"/>
-          <w:sz w:val="16"/>
+          <w:sz w:val="20"/>
         </w:rPr>
         <w:t>NE BI GLEDAO SVOJE RANE I BOLI</w:t>
       </w:r>
@@ -443,7 +443,7 @@
           <w:b/>
           <w:i/>
           <w:color w:val="000000"/>
-          <w:sz w:val="16"/>
+          <w:sz w:val="20"/>
         </w:rPr>
         <w:t>GLEDAO BI SAMO MOJU LJUBAV</w:t>
       </w:r>
@@ -459,7 +459,7 @@
           <w:b/>
           <w:i/>
           <w:color w:val="000000"/>
-          <w:sz w:val="16"/>
+          <w:sz w:val="20"/>
         </w:rPr>
         <w:t>KOJA BI TE LIJEČILA</w:t>
       </w:r>
@@ -474,7 +474,7 @@
           <w:b w:val="0"/>
           <w:i w:val="0"/>
           <w:color w:val="000000"/>
-          <w:sz w:val="16"/>
+          <w:sz w:val="20"/>
         </w:rPr>
         <w:t>____________________________________________________________</w:t>
       </w:r>
@@ -489,7 +489,7 @@
           <w:b w:val="0"/>
           <w:i w:val="0"/>
           <w:color w:val="000000"/>
-          <w:sz w:val="16"/>
+          <w:sz w:val="20"/>
         </w:rPr>
         <w:t>Isus je sa nama</w:t>
       </w:r>
@@ -504,7 +504,7 @@
           <w:b w:val="0"/>
           <w:i w:val="0"/>
           <w:color w:val="000000"/>
-          <w:sz w:val="16"/>
+          <w:sz w:val="20"/>
         </w:rPr>
         <w:t>Ovdje sad, ovdje sad</w:t>
       </w:r>
@@ -519,7 +519,7 @@
           <w:b w:val="0"/>
           <w:i w:val="0"/>
           <w:color w:val="000000"/>
-          <w:sz w:val="16"/>
+          <w:sz w:val="20"/>
         </w:rPr>
         <w:t>Tlo gdje sad stojim ja</w:t>
       </w:r>
@@ -534,7 +534,7 @@
           <w:b w:val="0"/>
           <w:i w:val="0"/>
           <w:color w:val="000000"/>
-          <w:sz w:val="16"/>
+          <w:sz w:val="20"/>
         </w:rPr>
         <w:t>Sveto je zbog Njega</w:t>
       </w:r>
@@ -549,7 +549,7 @@
           <w:b w:val="0"/>
           <w:i w:val="0"/>
           <w:color w:val="000000"/>
-          <w:sz w:val="16"/>
+          <w:sz w:val="20"/>
         </w:rPr>
         <w:t>Bozji Duh prebiva</w:t>
       </w:r>
@@ -564,7 +564,7 @@
           <w:b w:val="0"/>
           <w:i w:val="0"/>
           <w:color w:val="000000"/>
-          <w:sz w:val="16"/>
+          <w:sz w:val="20"/>
         </w:rPr>
         <w:t>Ovdje sad, medj’ nama</w:t>
       </w:r>
@@ -579,7 +579,7 @@
           <w:b w:val="0"/>
           <w:i w:val="0"/>
           <w:color w:val="000000"/>
-          <w:sz w:val="16"/>
+          <w:sz w:val="20"/>
         </w:rPr>
         <w:t>Svaki te otkucaj</w:t>
       </w:r>
@@ -594,7 +594,7 @@
           <w:b w:val="0"/>
           <w:i w:val="0"/>
           <w:color w:val="000000"/>
-          <w:sz w:val="16"/>
+          <w:sz w:val="20"/>
         </w:rPr>
         <w:t>Srca mog doziva</w:t>
       </w:r>
@@ -609,7 +609,7 @@
           <w:b w:val="0"/>
           <w:i w:val="0"/>
           <w:color w:val="000000"/>
-          <w:sz w:val="16"/>
+          <w:sz w:val="20"/>
         </w:rPr>
         <w:t>Tebe cu dovijeka slaviti ja</w:t>
       </w:r>
@@ -624,7 +624,7 @@
           <w:b w:val="0"/>
           <w:i w:val="0"/>
           <w:color w:val="000000"/>
-          <w:sz w:val="16"/>
+          <w:sz w:val="20"/>
         </w:rPr>
         <w:t>Sa svim andjelima i svim svecima</w:t>
       </w:r>
@@ -639,7 +639,7 @@
           <w:b w:val="0"/>
           <w:i w:val="0"/>
           <w:color w:val="000000"/>
-          <w:sz w:val="16"/>
+          <w:sz w:val="20"/>
         </w:rPr>
         <w:t>Cija slava i hvala Tvog imena</w:t>
       </w:r>
@@ -654,7 +654,7 @@
           <w:b w:val="0"/>
           <w:i w:val="0"/>
           <w:color w:val="000000"/>
-          <w:sz w:val="16"/>
+          <w:sz w:val="20"/>
         </w:rPr>
         <w:t>Odjekuje nebesima</w:t>
       </w:r>
@@ -670,7 +670,7 @@
           <w:b/>
           <w:i/>
           <w:color w:val="000000"/>
-          <w:sz w:val="16"/>
+          <w:sz w:val="20"/>
         </w:rPr>
         <w:t>Svet si, svet si, svet si Bog</w:t>
       </w:r>
@@ -686,7 +686,7 @@
           <w:b/>
           <w:i/>
           <w:color w:val="000000"/>
-          <w:sz w:val="16"/>
+          <w:sz w:val="20"/>
         </w:rPr>
         <w:t>Vjecni kralj si srca mog.</w:t>
       </w:r>
@@ -702,7 +702,7 @@
           <w:b/>
           <w:i/>
           <w:color w:val="000000"/>
-          <w:sz w:val="16"/>
+          <w:sz w:val="20"/>
         </w:rPr>
         <w:t>Jer si bio, I jesi</w:t>
       </w:r>
@@ -718,7 +718,7 @@
           <w:b/>
           <w:i/>
           <w:color w:val="000000"/>
-          <w:sz w:val="16"/>
+          <w:sz w:val="20"/>
         </w:rPr>
         <w:t>I uvijek ces biti</w:t>
       </w:r>
@@ -734,7 +734,7 @@
           <w:b/>
           <w:i/>
           <w:color w:val="000000"/>
-          <w:sz w:val="16"/>
+          <w:sz w:val="20"/>
         </w:rPr>
         <w:t>Moj Bog sve moje, sto imam je Tvoje</w:t>
       </w:r>
@@ -750,7 +750,7 @@
           <w:b/>
           <w:i/>
           <w:color w:val="000000"/>
-          <w:sz w:val="16"/>
+          <w:sz w:val="20"/>
         </w:rPr>
         <w:t>Svet si, svet si Bog</w:t>
       </w:r>
@@ -765,7 +765,7 @@
           <w:b w:val="0"/>
           <w:i w:val="0"/>
           <w:color w:val="000000"/>
-          <w:sz w:val="16"/>
+          <w:sz w:val="20"/>
         </w:rPr>
         <w:t>Njezno me pozivas</w:t>
       </w:r>
@@ -780,7 +780,7 @@
           <w:b w:val="0"/>
           <w:i w:val="0"/>
           <w:color w:val="000000"/>
-          <w:sz w:val="16"/>
+          <w:sz w:val="20"/>
         </w:rPr>
         <w:t>Imenom dozivas</w:t>
       </w:r>
@@ -795,7 +795,7 @@
           <w:b w:val="0"/>
           <w:i w:val="0"/>
           <w:color w:val="000000"/>
-          <w:sz w:val="16"/>
+          <w:sz w:val="20"/>
         </w:rPr>
         <w:t>Zelim te slijediti</w:t>
       </w:r>
@@ -810,7 +810,7 @@
           <w:b w:val="0"/>
           <w:i w:val="0"/>
           <w:color w:val="000000"/>
-          <w:sz w:val="16"/>
+          <w:sz w:val="20"/>
         </w:rPr>
         <w:t>Tvoju rijec vrsiti</w:t>
       </w:r>
@@ -826,7 +826,7 @@
           <w:b/>
           <w:i/>
           <w:color w:val="000000"/>
-          <w:sz w:val="16"/>
+          <w:sz w:val="20"/>
         </w:rPr>
         <w:t>U Kraljevstvo me pozivas</w:t>
       </w:r>
@@ -842,7 +842,7 @@
           <w:b/>
           <w:i/>
           <w:color w:val="000000"/>
-          <w:sz w:val="16"/>
+          <w:sz w:val="20"/>
         </w:rPr>
         <w:t>Da slavu Tvoju gledam ja</w:t>
       </w:r>
@@ -858,7 +858,7 @@
           <w:b/>
           <w:i/>
           <w:color w:val="000000"/>
-          <w:sz w:val="16"/>
+          <w:sz w:val="20"/>
         </w:rPr>
         <w:t>Da te vidim, da te slavim</w:t>
       </w:r>
@@ -874,7 +874,7 @@
           <w:b/>
           <w:i/>
           <w:color w:val="000000"/>
-          <w:sz w:val="16"/>
+          <w:sz w:val="20"/>
         </w:rPr>
         <w:t>Da se klanjam</w:t>
       </w:r>
@@ -889,7 +889,7 @@
           <w:b w:val="0"/>
           <w:i w:val="0"/>
           <w:color w:val="000000"/>
-          <w:sz w:val="16"/>
+          <w:sz w:val="20"/>
         </w:rPr>
         <w:t>____________________________________________________________</w:t>
       </w:r>
@@ -904,7 +904,7 @@
           <w:b w:val="0"/>
           <w:i w:val="0"/>
           <w:color w:val="000000"/>
-          <w:sz w:val="16"/>
+          <w:sz w:val="20"/>
         </w:rPr>
         <w:t>što više tražim više te nađem</w:t>
       </w:r>
@@ -919,7 +919,7 @@
           <w:b w:val="0"/>
           <w:i w:val="0"/>
           <w:color w:val="000000"/>
-          <w:sz w:val="16"/>
+          <w:sz w:val="20"/>
         </w:rPr>
         <w:t>što više nađem više te volim</w:t>
       </w:r>
@@ -935,7 +935,7 @@
           <w:b/>
           <w:i/>
           <w:color w:val="000000"/>
-          <w:sz w:val="16"/>
+          <w:sz w:val="20"/>
         </w:rPr>
         <w:t>želim sad sjediti tu i samo slušati te</w:t>
       </w:r>
@@ -951,7 +951,7 @@
           <w:b/>
           <w:i/>
           <w:color w:val="000000"/>
-          <w:sz w:val="16"/>
+          <w:sz w:val="20"/>
         </w:rPr>
         <w:t>bit u tvom zagrljaju i uživati</w:t>
       </w:r>
@@ -967,7 +967,7 @@
           <w:b/>
           <w:i/>
           <w:color w:val="000000"/>
-          <w:sz w:val="16"/>
+          <w:sz w:val="20"/>
         </w:rPr>
         <w:t>jer ljubav je ta tako neodoljiva</w:t>
       </w:r>
@@ -983,7 +983,7 @@
           <w:b/>
           <w:i/>
           <w:color w:val="000000"/>
-          <w:sz w:val="16"/>
+          <w:sz w:val="20"/>
         </w:rPr>
         <w:t>ja rastapam se u tvom miru.</w:t>
       </w:r>
@@ -998,7 +998,7 @@
           <w:b w:val="0"/>
           <w:i w:val="0"/>
           <w:color w:val="000000"/>
-          <w:sz w:val="16"/>
+          <w:sz w:val="20"/>
         </w:rPr>
         <w:t>____________________________________________________________</w:t>
       </w:r>
@@ -1013,7 +1013,7 @@
           <w:b w:val="0"/>
           <w:i w:val="0"/>
           <w:color w:val="000000"/>
-          <w:sz w:val="16"/>
+          <w:sz w:val="20"/>
         </w:rPr>
         <w:t>Znam da zoveš al se bojim hoću li potonuti</w:t>
       </w:r>
@@ -1028,7 +1028,7 @@
           <w:b w:val="0"/>
           <w:i w:val="0"/>
           <w:color w:val="000000"/>
-          <w:sz w:val="16"/>
+          <w:sz w:val="20"/>
         </w:rPr>
         <w:t>Ti si tajna kojoj idem u vjeri ja ću hodati</w:t>
       </w:r>
@@ -1044,7 +1044,7 @@
           <w:b/>
           <w:i/>
           <w:color w:val="000000"/>
-          <w:sz w:val="16"/>
+          <w:sz w:val="20"/>
         </w:rPr>
         <w:t>ime tvoje zazvat ću i gledat gore iznad svih valova</w:t>
       </w:r>
@@ -1060,7 +1060,7 @@
           <w:b/>
           <w:i/>
           <w:color w:val="000000"/>
-          <w:sz w:val="16"/>
+          <w:sz w:val="20"/>
         </w:rPr>
         <w:t>U Tebi mirna ostat ću Tvoja sam i Ti si moj</w:t>
       </w:r>
@@ -1075,7 +1075,7 @@
           <w:b w:val="0"/>
           <w:i w:val="0"/>
           <w:color w:val="000000"/>
-          <w:sz w:val="16"/>
+          <w:sz w:val="20"/>
         </w:rPr>
         <w:t>Dubine čuva Tvoja milost i moćna ti desnica</w:t>
       </w:r>
@@ -1090,7 +1090,7 @@
           <w:b w:val="0"/>
           <w:i w:val="0"/>
           <w:color w:val="000000"/>
-          <w:sz w:val="16"/>
+          <w:sz w:val="20"/>
         </w:rPr>
         <w:t>kad krene strah i dođe slabost Ti ostat ćeš moja pobjeda</w:t>
       </w:r>
@@ -1106,7 +1106,7 @@
           <w:b/>
           <w:i/>
           <w:color w:val="000000"/>
-          <w:sz w:val="16"/>
+          <w:sz w:val="20"/>
         </w:rPr>
         <w:t>Duše sveti napoj srce povjerenjem gdje god zoveš daj</w:t>
       </w:r>
@@ -1122,7 +1122,7 @@
           <w:b/>
           <w:i/>
           <w:color w:val="000000"/>
-          <w:sz w:val="16"/>
+          <w:sz w:val="20"/>
         </w:rPr>
         <w:t>Ti me vodi gdje su najveće dubine Diži vjeru u visine Znam</w:t>
       </w:r>
@@ -1137,7 +1137,7 @@
           <w:b w:val="0"/>
           <w:i w:val="0"/>
           <w:color w:val="000000"/>
-          <w:sz w:val="16"/>
+          <w:sz w:val="20"/>
         </w:rPr>
         <w:t>____________________________________________________________</w:t>
       </w:r>
@@ -1152,7 +1152,7 @@
           <w:b w:val="0"/>
           <w:i w:val="0"/>
           <w:color w:val="000000"/>
-          <w:sz w:val="16"/>
+          <w:sz w:val="20"/>
         </w:rPr>
         <w:t>fis</w:t>
       </w:r>
@@ -1167,7 +1167,7 @@
           <w:b w:val="0"/>
           <w:i w:val="0"/>
           <w:color w:val="000000"/>
-          <w:sz w:val="16"/>
+          <w:sz w:val="20"/>
         </w:rPr>
         <w:t>Ja dolazim pred Tvoje lice</w:t>
       </w:r>
@@ -1182,7 +1182,7 @@
           <w:b w:val="0"/>
           <w:i w:val="0"/>
           <w:color w:val="000000"/>
-          <w:sz w:val="16"/>
+          <w:sz w:val="20"/>
         </w:rPr>
         <w:t>Jer žrtva čista predana je</w:t>
       </w:r>
@@ -1197,7 +1197,7 @@
           <w:b w:val="0"/>
           <w:i w:val="0"/>
           <w:color w:val="000000"/>
-          <w:sz w:val="16"/>
+          <w:sz w:val="20"/>
         </w:rPr>
         <w:t>Ja ulazim da uvijek slavim</w:t>
       </w:r>
@@ -1212,7 +1212,7 @@
           <w:b w:val="0"/>
           <w:i w:val="0"/>
           <w:color w:val="000000"/>
-          <w:sz w:val="16"/>
+          <w:sz w:val="20"/>
         </w:rPr>
         <w:t>To Presveto Ime Jahve</w:t>
       </w:r>
@@ -1227,7 +1227,7 @@
           <w:b w:val="0"/>
           <w:i w:val="0"/>
           <w:color w:val="000000"/>
-          <w:sz w:val="16"/>
+          <w:sz w:val="20"/>
         </w:rPr>
         <w:t>Bože slavim Te</w:t>
       </w:r>
@@ -1242,7 +1242,7 @@
           <w:b w:val="0"/>
           <w:i w:val="0"/>
           <w:color w:val="000000"/>
-          <w:sz w:val="16"/>
+          <w:sz w:val="20"/>
         </w:rPr>
         <w:t>Obožavam Te</w:t>
       </w:r>
@@ -1258,7 +1258,7 @@
           <w:b/>
           <w:i/>
           <w:color w:val="000000"/>
-          <w:sz w:val="16"/>
+          <w:sz w:val="20"/>
         </w:rPr>
         <w:t>Ime ti je Sveti</w:t>
       </w:r>
@@ -1274,7 +1274,7 @@
           <w:b/>
           <w:i/>
           <w:color w:val="000000"/>
-          <w:sz w:val="16"/>
+          <w:sz w:val="20"/>
         </w:rPr>
         <w:t>Sveti Bog</w:t>
       </w:r>
@@ -1289,7 +1289,7 @@
           <w:b w:val="0"/>
           <w:i w:val="0"/>
           <w:color w:val="000000"/>
-          <w:sz w:val="16"/>
+          <w:sz w:val="20"/>
         </w:rPr>
         <w:t>____________________________________________________________</w:t>
       </w:r>
@@ -1304,7 +1304,7 @@
           <w:b w:val="0"/>
           <w:i w:val="0"/>
           <w:color w:val="000000"/>
-          <w:sz w:val="16"/>
+          <w:sz w:val="20"/>
         </w:rPr>
         <w:t>Iznad svih sila i kraljeva Iznad sve prirode i svega stvorenog</w:t>
       </w:r>
@@ -1319,7 +1319,7 @@
           <w:b w:val="0"/>
           <w:i w:val="0"/>
           <w:color w:val="000000"/>
-          <w:sz w:val="16"/>
+          <w:sz w:val="20"/>
         </w:rPr>
         <w:t>Iznad sve mudrosti i ljudskih putova</w:t>
       </w:r>
@@ -1334,7 +1334,7 @@
           <w:b w:val="0"/>
           <w:i w:val="0"/>
           <w:color w:val="000000"/>
-          <w:sz w:val="16"/>
+          <w:sz w:val="20"/>
         </w:rPr>
         <w:t>Ti si bio prije stvaranja</w:t>
       </w:r>
@@ -1349,7 +1349,7 @@
           <w:b w:val="0"/>
           <w:i w:val="0"/>
           <w:color w:val="000000"/>
-          <w:sz w:val="16"/>
+          <w:sz w:val="20"/>
         </w:rPr>
         <w:t>Iznad svih kraljevstva i prijestolja</w:t>
       </w:r>
@@ -1364,7 +1364,7 @@
           <w:b w:val="0"/>
           <w:i w:val="0"/>
           <w:color w:val="000000"/>
-          <w:sz w:val="16"/>
+          <w:sz w:val="20"/>
         </w:rPr>
         <w:t>Iznad svih čuda što svijet ih poznaje</w:t>
       </w:r>
@@ -1379,7 +1379,7 @@
           <w:b w:val="0"/>
           <w:i w:val="0"/>
           <w:color w:val="000000"/>
-          <w:sz w:val="16"/>
+          <w:sz w:val="20"/>
         </w:rPr>
         <w:t>Iznad sveg obilja bogatstva zemaljskog</w:t>
       </w:r>
@@ -1394,7 +1394,7 @@
           <w:b w:val="0"/>
           <w:i w:val="0"/>
           <w:color w:val="000000"/>
-          <w:sz w:val="16"/>
+          <w:sz w:val="20"/>
         </w:rPr>
         <w:t>Vrijednost tvoja neizmjerna je</w:t>
       </w:r>
@@ -1410,7 +1410,7 @@
           <w:b/>
           <w:i/>
           <w:color w:val="000000"/>
-          <w:sz w:val="16"/>
+          <w:sz w:val="20"/>
         </w:rPr>
         <w:t>Razapet u grob položen</w:t>
       </w:r>
@@ -1426,7 +1426,7 @@
           <w:b/>
           <w:i/>
           <w:color w:val="000000"/>
-          <w:sz w:val="16"/>
+          <w:sz w:val="20"/>
         </w:rPr>
         <w:t>Živio da budeš odbačen Kao ruža zgažena na tlu</w:t>
       </w:r>
@@ -1442,7 +1442,7 @@
           <w:b/>
           <w:i/>
           <w:color w:val="000000"/>
-          <w:sz w:val="16"/>
+          <w:sz w:val="20"/>
         </w:rPr>
         <w:t>Grijeh uzeo misleći na mene</w:t>
       </w:r>
@@ -1458,7 +1458,7 @@
           <w:b/>
           <w:i/>
           <w:color w:val="000000"/>
-          <w:sz w:val="16"/>
+          <w:sz w:val="20"/>
         </w:rPr>
         <w:t>solo</w:t>
       </w:r>
@@ -1473,7 +1473,7 @@
           <w:b w:val="0"/>
           <w:i w:val="0"/>
           <w:color w:val="000000"/>
-          <w:sz w:val="16"/>
+          <w:sz w:val="20"/>
         </w:rPr>
         <w:t>____________________________________________________________</w:t>
       </w:r>
@@ -1488,7 +1488,7 @@
           <w:b w:val="0"/>
           <w:i w:val="0"/>
           <w:color w:val="000000"/>
-          <w:sz w:val="16"/>
+          <w:sz w:val="20"/>
         </w:rPr>
         <w:t>ljepota kralja mog veličanstvenog</w:t>
       </w:r>
@@ -1503,7 +1503,7 @@
           <w:b w:val="0"/>
           <w:i w:val="0"/>
           <w:color w:val="000000"/>
-          <w:sz w:val="16"/>
+          <w:sz w:val="20"/>
         </w:rPr>
         <w:t>zemlju raduje zemlju raduje</w:t>
       </w:r>
@@ -1518,7 +1518,7 @@
           <w:b w:val="0"/>
           <w:i w:val="0"/>
           <w:color w:val="000000"/>
-          <w:sz w:val="16"/>
+          <w:sz w:val="20"/>
         </w:rPr>
         <w:t>u sjaj zaodjeven tama uzmiče</w:t>
       </w:r>
@@ -1533,7 +1533,7 @@
           <w:b w:val="0"/>
           <w:i w:val="0"/>
           <w:color w:val="000000"/>
-          <w:sz w:val="16"/>
+          <w:sz w:val="20"/>
         </w:rPr>
         <w:t>od glasa njegovog drhti svako zlo</w:t>
       </w:r>
@@ -1549,7 +1549,7 @@
           <w:b/>
           <w:i/>
           <w:color w:val="000000"/>
-          <w:sz w:val="16"/>
+          <w:sz w:val="20"/>
         </w:rPr>
         <w:t>nas Bog je velik pjevaj s nama</w:t>
       </w:r>
@@ -1565,7 +1565,7 @@
           <w:b/>
           <w:i/>
           <w:color w:val="000000"/>
-          <w:sz w:val="16"/>
+          <w:sz w:val="20"/>
         </w:rPr>
         <w:t>Bog je velik i svi će vidjeti</w:t>
       </w:r>
@@ -1581,7 +1581,7 @@
           <w:b/>
           <w:i/>
           <w:color w:val="000000"/>
-          <w:sz w:val="16"/>
+          <w:sz w:val="20"/>
         </w:rPr>
         <w:t>naš Bog je velik</w:t>
       </w:r>
@@ -1596,7 +1596,7 @@
           <w:b w:val="0"/>
           <w:i w:val="0"/>
           <w:color w:val="000000"/>
-          <w:sz w:val="16"/>
+          <w:sz w:val="20"/>
         </w:rPr>
         <w:t>vječno vlada on u ruci drži sve</w:t>
       </w:r>
@@ -1611,7 +1611,7 @@
           <w:b w:val="0"/>
           <w:i w:val="0"/>
           <w:color w:val="000000"/>
-          <w:sz w:val="16"/>
+          <w:sz w:val="20"/>
         </w:rPr>
         <w:t>početak je i kraj početak je i kraj</w:t>
       </w:r>
@@ -1626,7 +1626,7 @@
           <w:b w:val="0"/>
           <w:i w:val="0"/>
           <w:color w:val="000000"/>
-          <w:sz w:val="16"/>
+          <w:sz w:val="20"/>
         </w:rPr>
         <w:t>trojedini Bog Otac Sin i Duh</w:t>
       </w:r>
@@ -1641,7 +1641,7 @@
           <w:b w:val="0"/>
           <w:i w:val="0"/>
           <w:color w:val="000000"/>
-          <w:sz w:val="16"/>
+          <w:sz w:val="20"/>
         </w:rPr>
         <w:t>Janje je i kralj naš otkupitelj</w:t>
       </w:r>
@@ -1657,7 +1657,7 @@
           <w:b/>
           <w:i/>
           <w:color w:val="000000"/>
-          <w:sz w:val="16"/>
+          <w:sz w:val="20"/>
         </w:rPr>
         <w:t>ime najveće vrijedno slavljenja</w:t>
       </w:r>
@@ -1673,7 +1673,7 @@
           <w:b/>
           <w:i/>
           <w:color w:val="000000"/>
-          <w:sz w:val="16"/>
+          <w:sz w:val="20"/>
         </w:rPr>
         <w:t>srcem pjevam Bog je velik</w:t>
       </w:r>
@@ -1688,7 +1688,7 @@
           <w:b w:val="0"/>
           <w:i w:val="0"/>
           <w:color w:val="000000"/>
-          <w:sz w:val="16"/>
+          <w:sz w:val="20"/>
         </w:rPr>
         <w:t>____________________________________________________________</w:t>
       </w:r>
@@ -1703,7 +1703,7 @@
           <w:b w:val="0"/>
           <w:i w:val="0"/>
           <w:color w:val="000000"/>
-          <w:sz w:val="16"/>
+          <w:sz w:val="20"/>
         </w:rPr>
         <w:t>Blagoslovljen Bog i presveto mu ime</w:t>
       </w:r>
@@ -1718,7 +1718,7 @@
           <w:b w:val="0"/>
           <w:i w:val="0"/>
           <w:color w:val="000000"/>
-          <w:sz w:val="16"/>
+          <w:sz w:val="20"/>
         </w:rPr>
         <w:t>Blagoslovljen Bog on život daruje</w:t>
       </w:r>
@@ -1733,7 +1733,7 @@
           <w:b w:val="0"/>
           <w:i w:val="0"/>
           <w:color w:val="000000"/>
-          <w:sz w:val="16"/>
+          <w:sz w:val="20"/>
         </w:rPr>
         <w:t>____________________________________________________________</w:t>
       </w:r>
@@ -1748,7 +1748,7 @@
           <w:b w:val="0"/>
           <w:i w:val="0"/>
           <w:color w:val="000000"/>
-          <w:sz w:val="16"/>
+          <w:sz w:val="20"/>
         </w:rPr>
         <w:t>Ohrabri se, brigu ti svu</w:t>
       </w:r>
@@ -1763,7 +1763,7 @@
           <w:b w:val="0"/>
           <w:i w:val="0"/>
           <w:color w:val="000000"/>
-          <w:sz w:val="16"/>
+          <w:sz w:val="20"/>
         </w:rPr>
         <w:t>On može ponijeti</w:t>
       </w:r>
@@ -1778,7 +1778,7 @@
           <w:b w:val="0"/>
           <w:i w:val="0"/>
           <w:color w:val="000000"/>
-          <w:sz w:val="16"/>
+          <w:sz w:val="20"/>
         </w:rPr>
         <w:t>goru će svaku sa puta</w:t>
       </w:r>
@@ -1793,7 +1793,7 @@
           <w:b w:val="0"/>
           <w:i w:val="0"/>
           <w:color w:val="000000"/>
-          <w:sz w:val="16"/>
+          <w:sz w:val="20"/>
         </w:rPr>
         <w:t>tvoga premjestiti.</w:t>
       </w:r>
@@ -1808,7 +1808,7 @@
           <w:b w:val="0"/>
           <w:i w:val="0"/>
           <w:color w:val="000000"/>
-          <w:sz w:val="16"/>
+          <w:sz w:val="20"/>
         </w:rPr>
         <w:t>Ne boj se valova tih</w:t>
       </w:r>
@@ -1823,7 +1823,7 @@
           <w:b w:val="0"/>
           <w:i w:val="0"/>
           <w:color w:val="000000"/>
-          <w:sz w:val="16"/>
+          <w:sz w:val="20"/>
         </w:rPr>
         <w:t>neće te prekriti</w:t>
       </w:r>
@@ -1838,7 +1838,7 @@
           <w:b w:val="0"/>
           <w:i w:val="0"/>
           <w:color w:val="000000"/>
-          <w:sz w:val="16"/>
+          <w:sz w:val="20"/>
         </w:rPr>
         <w:t>suzu će svaku tvoj Bog</w:t>
       </w:r>
@@ -1853,7 +1853,7 @@
           <w:b w:val="0"/>
           <w:i w:val="0"/>
           <w:color w:val="000000"/>
-          <w:sz w:val="16"/>
+          <w:sz w:val="20"/>
         </w:rPr>
         <w:t>s lica obrisati.</w:t>
       </w:r>
@@ -1869,7 +1869,7 @@
           <w:b/>
           <w:i/>
           <w:color w:val="000000"/>
-          <w:sz w:val="16"/>
+          <w:sz w:val="20"/>
         </w:rPr>
         <w:t>Ako nosi On cijeli taj svijet</w:t>
       </w:r>
@@ -1885,7 +1885,7 @@
           <w:b/>
           <w:i/>
           <w:color w:val="000000"/>
-          <w:sz w:val="16"/>
+          <w:sz w:val="20"/>
         </w:rPr>
         <w:t>na svome dlanu</w:t>
       </w:r>
@@ -1901,7 +1901,7 @@
           <w:b/>
           <w:i/>
           <w:color w:val="000000"/>
-          <w:sz w:val="16"/>
+          <w:sz w:val="20"/>
         </w:rPr>
         <w:t>daj Mu svoj život</w:t>
       </w:r>
@@ -1917,7 +1917,7 @@
           <w:b/>
           <w:i/>
           <w:color w:val="000000"/>
-          <w:sz w:val="16"/>
+          <w:sz w:val="20"/>
         </w:rPr>
         <w:t>i tebe nosit će On</w:t>
       </w:r>
@@ -2301,7 +2301,7 @@
     </w:pPr>
     <w:rPr>
       <w:rFonts w:ascii="Times New Roman" w:hAnsi="Times New Roman"/>
-      <w:sz w:val="16"/>
+      <w:sz w:val="20"/>
     </w:rPr>
   </w:style>
   <w:style w:type="paragraph" w:styleId="Header">

</xml_diff>